<commit_message>
docs: completar documentos FD01 a FD06
</commit_message>
<xml_diff>
--- a/FD01-EPIS-Informe de Factibilidad.docx
+++ b/FD01-EPIS-Informe de Factibilidad.docx
@@ -7,9 +7,2524 @@
         <w:jc w:val="center"/>
       </w:pPr>
       <w:r>
+        <w:rPr>
+          <w:rFonts w:ascii="Arial" w:hAnsi="Arial"/>
+          <w:b/>
+          <w:sz w:val="28"/>
+        </w:rPr>
+        <w:t>UNIVERSIDAD PRIVADA DE TACNA</w:t>
+      </w:r>
+    </w:p>
+    <w:p>
+      <w:pPr>
+        <w:jc w:val="center"/>
+      </w:pPr>
+      <w:r>
+        <w:rPr>
+          <w:rFonts w:ascii="Arial" w:hAnsi="Arial"/>
+          <w:b/>
+          <w:sz w:val="28"/>
+        </w:rPr>
+        <w:t>FACULTAD DE INGENIERIA</w:t>
+      </w:r>
+    </w:p>
+    <w:p>
+      <w:pPr>
+        <w:jc w:val="center"/>
+      </w:pPr>
+      <w:r>
+        <w:rPr>
+          <w:rFonts w:ascii="Arial" w:hAnsi="Arial"/>
+          <w:b w:val="0"/>
+          <w:sz w:val="28"/>
+        </w:rPr>
+        <w:t>Escuela Profesional de Ingenieria de Sistemas</w:t>
+      </w:r>
+    </w:p>
+    <w:p>
+      <w:pPr>
+        <w:jc w:val="center"/>
+      </w:pPr>
+      <w:r>
+        <w:rPr>
+          <w:rFonts w:ascii="Arial" w:hAnsi="Arial"/>
+          <w:b/>
+          <w:sz w:val="28"/>
+        </w:rPr>
+        <w:t>Drop Nexus - Replicador de Datos entre Bases de Datos</w:t>
+      </w:r>
+    </w:p>
+    <w:p>
+      <w:pPr>
+        <w:jc w:val="center"/>
+      </w:pPr>
+      <w:r>
+        <w:rPr>
+          <w:rFonts w:ascii="Arial" w:hAnsi="Arial"/>
+          <w:b/>
+          <w:sz w:val="28"/>
+        </w:rPr>
+        <w:t>FD01 - Informe de Factibilidad</w:t>
+      </w:r>
+    </w:p>
+    <w:p>
+      <w:pPr>
+        <w:jc w:val="center"/>
+      </w:pPr>
+      <w:r>
+        <w:rPr>
+          <w:rFonts w:ascii="Arial" w:hAnsi="Arial"/>
+          <w:b w:val="0"/>
+          <w:sz w:val="22"/>
+        </w:rPr>
+        <w:t>Curso: SI783 - Proyecto de Sistemas</w:t>
+      </w:r>
+    </w:p>
+    <w:p>
+      <w:pPr>
+        <w:jc w:val="center"/>
+      </w:pPr>
+      <w:r>
+        <w:rPr>
+          <w:rFonts w:ascii="Arial" w:hAnsi="Arial"/>
+          <w:b w:val="0"/>
+          <w:sz w:val="22"/>
+        </w:rPr>
+        <w:t>Docente: Docente del curso</w:t>
+      </w:r>
+    </w:p>
+    <w:p>
+      <w:pPr>
+        <w:jc w:val="center"/>
+      </w:pPr>
+      <w:r>
+        <w:rPr>
+          <w:rFonts w:ascii="Arial" w:hAnsi="Arial"/>
+          <w:b w:val="0"/>
+          <w:sz w:val="22"/>
+        </w:rPr>
+        <w:t>Integrantes: Equipo del proyecto</w:t>
+      </w:r>
+    </w:p>
+    <w:p>
+      <w:pPr>
+        <w:jc w:val="center"/>
+      </w:pPr>
+      <w:r>
+        <w:rPr>
+          <w:rFonts w:ascii="Arial" w:hAnsi="Arial"/>
+          <w:b w:val="0"/>
+          <w:sz w:val="22"/>
+        </w:rPr>
+        <w:t>Version: 2.0</w:t>
+      </w:r>
+    </w:p>
+    <w:p>
+      <w:pPr>
+        <w:jc w:val="center"/>
+      </w:pPr>
+      <w:r>
+        <w:rPr>
+          <w:rFonts w:ascii="Arial" w:hAnsi="Arial"/>
+          <w:b w:val="0"/>
+          <w:sz w:val="22"/>
+        </w:rPr>
+        <w:t>Fecha: 04/07/2026</w:t>
+      </w:r>
+    </w:p>
+    <w:p>
+      <w:pPr>
+        <w:jc w:val="center"/>
+      </w:pPr>
+      <w:r>
+        <w:rPr>
+          <w:rFonts w:ascii="Arial" w:hAnsi="Arial"/>
+          <w:b w:val="0"/>
+          <w:sz w:val="22"/>
+        </w:rPr>
+        <w:t>Ubicacion del aplicativo: web/ del repositorio local</w:t>
+      </w:r>
+    </w:p>
+    <w:p>
+      <w:pPr>
+        <w:jc w:val="center"/>
+      </w:pPr>
+      <w:r>
+        <w:rPr>
+          <w:rFonts w:ascii="Arial" w:hAnsi="Arial"/>
+          <w:b w:val="0"/>
+          <w:sz w:val="22"/>
+        </w:rPr>
+        <w:t>Tacna - Peru 2026</w:t>
+      </w:r>
+    </w:p>
+    <w:p>
+      <w:r>
+        <w:rPr>
+          <w:rFonts w:ascii="Arial" w:hAnsi="Arial"/>
+          <w:sz w:val="20"/>
+        </w:rPr>
+        <w:br w:type="page"/>
+      </w:r>
+    </w:p>
+    <w:p>
+      <w:pPr>
+        <w:pStyle w:val="Heading1"/>
+      </w:pPr>
+      <w:r>
+        <w:rPr>
+          <w:rFonts w:ascii="Arial" w:hAnsi="Arial"/>
+          <w:sz w:val="20"/>
+        </w:rPr>
+        <w:t>Control de versiones</w:t>
+      </w:r>
+    </w:p>
+    <w:tbl>
+      <w:tblPr>
+        <w:tblStyle w:val="TableGrid"/>
+        <w:tblW w:type="auto" w:w="0"/>
+        <w:jc w:val="center"/>
+        <w:tblLook w:firstColumn="1" w:firstRow="1" w:lastColumn="0" w:lastRow="0" w:noHBand="0" w:noVBand="1" w:val="04A0"/>
+      </w:tblPr>
+      <w:tblGrid>
+        <w:gridCol w:w="1680"/>
+        <w:gridCol w:w="1680"/>
+        <w:gridCol w:w="1680"/>
+        <w:gridCol w:w="1680"/>
+        <w:gridCol w:w="1680"/>
+        <w:gridCol w:w="1680"/>
+      </w:tblGrid>
+      <w:tr>
+        <w:tc>
+          <w:tcPr>
+            <w:tcW w:type="dxa" w:w="1680"/>
+            <w:vAlign w:val="center"/>
+            <w:shd w:fill="1F4E79"/>
+          </w:tcPr>
+          <w:p>
+            <w:r/>
+            <w:r>
+              <w:rPr>
+                <w:b/>
+                <w:color w:val="FFFFFF"/>
+                <w:sz w:val="17"/>
+              </w:rPr>
+              <w:t>Version</w:t>
+            </w:r>
+          </w:p>
+        </w:tc>
+        <w:tc>
+          <w:tcPr>
+            <w:tcW w:type="dxa" w:w="1680"/>
+            <w:vAlign w:val="center"/>
+            <w:shd w:fill="1F4E79"/>
+          </w:tcPr>
+          <w:p>
+            <w:r/>
+            <w:r>
+              <w:rPr>
+                <w:b/>
+                <w:color w:val="FFFFFF"/>
+                <w:sz w:val="17"/>
+              </w:rPr>
+              <w:t>Hecha por</w:t>
+            </w:r>
+          </w:p>
+        </w:tc>
+        <w:tc>
+          <w:tcPr>
+            <w:tcW w:type="dxa" w:w="1680"/>
+            <w:vAlign w:val="center"/>
+            <w:shd w:fill="1F4E79"/>
+          </w:tcPr>
+          <w:p>
+            <w:r/>
+            <w:r>
+              <w:rPr>
+                <w:b/>
+                <w:color w:val="FFFFFF"/>
+                <w:sz w:val="17"/>
+              </w:rPr>
+              <w:t>Revisada por</w:t>
+            </w:r>
+          </w:p>
+        </w:tc>
+        <w:tc>
+          <w:tcPr>
+            <w:tcW w:type="dxa" w:w="1680"/>
+            <w:vAlign w:val="center"/>
+            <w:shd w:fill="1F4E79"/>
+          </w:tcPr>
+          <w:p>
+            <w:r/>
+            <w:r>
+              <w:rPr>
+                <w:b/>
+                <w:color w:val="FFFFFF"/>
+                <w:sz w:val="17"/>
+              </w:rPr>
+              <w:t>Aprobada por</w:t>
+            </w:r>
+          </w:p>
+        </w:tc>
+        <w:tc>
+          <w:tcPr>
+            <w:tcW w:type="dxa" w:w="1680"/>
+            <w:vAlign w:val="center"/>
+            <w:shd w:fill="1F4E79"/>
+          </w:tcPr>
+          <w:p>
+            <w:r/>
+            <w:r>
+              <w:rPr>
+                <w:b/>
+                <w:color w:val="FFFFFF"/>
+                <w:sz w:val="17"/>
+              </w:rPr>
+              <w:t>Fecha</w:t>
+            </w:r>
+          </w:p>
+        </w:tc>
+        <w:tc>
+          <w:tcPr>
+            <w:tcW w:type="dxa" w:w="1680"/>
+            <w:vAlign w:val="center"/>
+            <w:shd w:fill="1F4E79"/>
+          </w:tcPr>
+          <w:p>
+            <w:r/>
+            <w:r>
+              <w:rPr>
+                <w:b/>
+                <w:color w:val="FFFFFF"/>
+                <w:sz w:val="17"/>
+              </w:rPr>
+              <w:t>Motivo</w:t>
+            </w:r>
+          </w:p>
+        </w:tc>
+      </w:tr>
+      <w:tr>
+        <w:tc>
+          <w:tcPr>
+            <w:tcW w:type="dxa" w:w="1680"/>
+            <w:vAlign w:val="center"/>
+          </w:tcPr>
+          <w:p>
+            <w:r/>
+            <w:r>
+              <w:rPr>
+                <w:b w:val="0"/>
+                <w:sz w:val="17"/>
+              </w:rPr>
+              <w:t>1.0</w:t>
+            </w:r>
+          </w:p>
+        </w:tc>
+        <w:tc>
+          <w:tcPr>
+            <w:tcW w:type="dxa" w:w="1680"/>
+            <w:vAlign w:val="center"/>
+          </w:tcPr>
+          <w:p>
+            <w:r/>
+            <w:r>
+              <w:rPr>
+                <w:b w:val="0"/>
+                <w:sz w:val="17"/>
+              </w:rPr>
+              <w:t>Equipo del proyecto</w:t>
+            </w:r>
+          </w:p>
+        </w:tc>
+        <w:tc>
+          <w:tcPr>
+            <w:tcW w:type="dxa" w:w="1680"/>
+            <w:vAlign w:val="center"/>
+          </w:tcPr>
+          <w:p>
+            <w:r/>
+            <w:r>
+              <w:rPr>
+                <w:b w:val="0"/>
+                <w:sz w:val="17"/>
+              </w:rPr>
+              <w:t>Pendiente</w:t>
+            </w:r>
+          </w:p>
+        </w:tc>
+        <w:tc>
+          <w:tcPr>
+            <w:tcW w:type="dxa" w:w="1680"/>
+            <w:vAlign w:val="center"/>
+          </w:tcPr>
+          <w:p>
+            <w:r/>
+            <w:r>
+              <w:rPr>
+                <w:b w:val="0"/>
+                <w:sz w:val="17"/>
+              </w:rPr>
+              <w:t>Pendiente</w:t>
+            </w:r>
+          </w:p>
+        </w:tc>
+        <w:tc>
+          <w:tcPr>
+            <w:tcW w:type="dxa" w:w="1680"/>
+            <w:vAlign w:val="center"/>
+          </w:tcPr>
+          <w:p>
+            <w:r/>
+            <w:r>
+              <w:rPr>
+                <w:b w:val="0"/>
+                <w:sz w:val="17"/>
+              </w:rPr>
+              <w:t>04/07/2026</w:t>
+            </w:r>
+          </w:p>
+        </w:tc>
+        <w:tc>
+          <w:tcPr>
+            <w:tcW w:type="dxa" w:w="1680"/>
+            <w:vAlign w:val="center"/>
+          </w:tcPr>
+          <w:p>
+            <w:r/>
+            <w:r>
+              <w:rPr>
+                <w:b w:val="0"/>
+                <w:sz w:val="17"/>
+              </w:rPr>
+              <w:t>Adaptacion inicial al sistema implementado</w:t>
+            </w:r>
+          </w:p>
+        </w:tc>
+      </w:tr>
+      <w:tr>
+        <w:tc>
+          <w:tcPr>
+            <w:tcW w:type="dxa" w:w="1680"/>
+            <w:vAlign w:val="center"/>
+          </w:tcPr>
+          <w:p>
+            <w:r/>
+            <w:r>
+              <w:rPr>
+                <w:b w:val="0"/>
+                <w:sz w:val="17"/>
+              </w:rPr>
+              <w:t>2.0</w:t>
+            </w:r>
+          </w:p>
+        </w:tc>
+        <w:tc>
+          <w:tcPr>
+            <w:tcW w:type="dxa" w:w="1680"/>
+            <w:vAlign w:val="center"/>
+          </w:tcPr>
+          <w:p>
+            <w:r/>
+            <w:r>
+              <w:rPr>
+                <w:b w:val="0"/>
+                <w:sz w:val="17"/>
+              </w:rPr>
+              <w:t>Equipo del proyecto</w:t>
+            </w:r>
+          </w:p>
+        </w:tc>
+        <w:tc>
+          <w:tcPr>
+            <w:tcW w:type="dxa" w:w="1680"/>
+            <w:vAlign w:val="center"/>
+          </w:tcPr>
+          <w:p>
+            <w:r/>
+            <w:r>
+              <w:rPr>
+                <w:b w:val="0"/>
+                <w:sz w:val="17"/>
+              </w:rPr>
+              <w:t>Pendiente</w:t>
+            </w:r>
+          </w:p>
+        </w:tc>
+        <w:tc>
+          <w:tcPr>
+            <w:tcW w:type="dxa" w:w="1680"/>
+            <w:vAlign w:val="center"/>
+          </w:tcPr>
+          <w:p>
+            <w:r/>
+            <w:r>
+              <w:rPr>
+                <w:b w:val="0"/>
+                <w:sz w:val="17"/>
+              </w:rPr>
+              <w:t>Pendiente</w:t>
+            </w:r>
+          </w:p>
+        </w:tc>
+        <w:tc>
+          <w:tcPr>
+            <w:tcW w:type="dxa" w:w="1680"/>
+            <w:vAlign w:val="center"/>
+          </w:tcPr>
+          <w:p>
+            <w:r/>
+            <w:r>
+              <w:rPr>
+                <w:b w:val="0"/>
+                <w:sz w:val="17"/>
+              </w:rPr>
+              <w:t>04/07/2026</w:t>
+            </w:r>
+          </w:p>
+        </w:tc>
+        <w:tc>
+          <w:tcPr>
+            <w:tcW w:type="dxa" w:w="1680"/>
+            <w:vAlign w:val="center"/>
+          </w:tcPr>
+          <w:p>
+            <w:r/>
+            <w:r>
+              <w:rPr>
+                <w:b w:val="0"/>
+                <w:sz w:val="17"/>
+              </w:rPr>
+              <w:t>Ampliacion con funcionalidades, tablas y diagramas de la carpeta web</w:t>
+            </w:r>
+          </w:p>
+        </w:tc>
+      </w:tr>
+    </w:tbl>
+    <w:p/>
+    <w:p>
+      <w:pPr>
+        <w:pStyle w:val="Heading1"/>
+      </w:pPr>
+      <w:r>
+        <w:rPr>
+          <w:rFonts w:ascii="Arial" w:hAnsi="Arial"/>
+          <w:sz w:val="20"/>
+        </w:rPr>
+        <w:t>1. Descripcion del proyecto</w:t>
+      </w:r>
+    </w:p>
+    <w:p>
+      <w:r>
+        <w:rPr>
+          <w:rFonts w:ascii="Arial" w:hAnsi="Arial"/>
+          <w:sz w:val="20"/>
+        </w:rPr>
+        <w:t>Drop Nexus es una aplicacion web multiusuario para importar bases de datos o archivos, normalizar su estructura, replicar tablas entre origen y destino, aplicar mapeos de columnas, registrar progreso y descargar los resultados modificados en formatos reutilizables.</w:t>
+      </w:r>
+    </w:p>
+    <w:tbl>
+      <w:tblPr>
+        <w:tblStyle w:val="TableGrid"/>
+        <w:tblW w:type="auto" w:w="0"/>
+        <w:jc w:val="center"/>
+        <w:tblLook w:firstColumn="1" w:firstRow="1" w:lastColumn="0" w:lastRow="0" w:noHBand="0" w:noVBand="1" w:val="04A0"/>
+      </w:tblPr>
+      <w:tblGrid>
+        <w:gridCol w:w="5040"/>
+        <w:gridCol w:w="5040"/>
+      </w:tblGrid>
+      <w:tr>
+        <w:tc>
+          <w:tcPr>
+            <w:tcW w:type="dxa" w:w="5040"/>
+            <w:vAlign w:val="center"/>
+            <w:shd w:fill="1F4E79"/>
+          </w:tcPr>
+          <w:p>
+            <w:r/>
+            <w:r>
+              <w:rPr>
+                <w:b/>
+                <w:color w:val="FFFFFF"/>
+                <w:sz w:val="17"/>
+              </w:rPr>
+              <w:t>Elemento</w:t>
+            </w:r>
+          </w:p>
+        </w:tc>
+        <w:tc>
+          <w:tcPr>
+            <w:tcW w:type="dxa" w:w="5040"/>
+            <w:vAlign w:val="center"/>
+            <w:shd w:fill="1F4E79"/>
+          </w:tcPr>
+          <w:p>
+            <w:r/>
+            <w:r>
+              <w:rPr>
+                <w:b/>
+                <w:color w:val="FFFFFF"/>
+                <w:sz w:val="17"/>
+              </w:rPr>
+              <w:t>Descripcion</w:t>
+            </w:r>
+          </w:p>
+        </w:tc>
+      </w:tr>
+      <w:tr>
+        <w:tc>
+          <w:tcPr>
+            <w:tcW w:type="dxa" w:w="5040"/>
+            <w:vAlign w:val="center"/>
+          </w:tcPr>
+          <w:p>
+            <w:r/>
+            <w:r>
+              <w:rPr>
+                <w:b w:val="0"/>
+                <w:sz w:val="17"/>
+              </w:rPr>
+              <w:t>Nombre del proyecto</w:t>
+            </w:r>
+          </w:p>
+        </w:tc>
+        <w:tc>
+          <w:tcPr>
+            <w:tcW w:type="dxa" w:w="5040"/>
+            <w:vAlign w:val="center"/>
+          </w:tcPr>
+          <w:p>
+            <w:r/>
+            <w:r>
+              <w:rPr>
+                <w:b w:val="0"/>
+                <w:sz w:val="17"/>
+              </w:rPr>
+              <w:t>Drop Nexus - Replicador de Datos entre Bases de Datos</w:t>
+            </w:r>
+          </w:p>
+        </w:tc>
+      </w:tr>
+      <w:tr>
+        <w:tc>
+          <w:tcPr>
+            <w:tcW w:type="dxa" w:w="5040"/>
+            <w:vAlign w:val="center"/>
+          </w:tcPr>
+          <w:p>
+            <w:r/>
+            <w:r>
+              <w:rPr>
+                <w:b w:val="0"/>
+                <w:sz w:val="17"/>
+              </w:rPr>
+              <w:t>Alcance tecnico</w:t>
+            </w:r>
+          </w:p>
+        </w:tc>
+        <w:tc>
+          <w:tcPr>
+            <w:tcW w:type="dxa" w:w="5040"/>
+            <w:vAlign w:val="center"/>
+          </w:tcPr>
+          <w:p>
+            <w:r/>
+            <w:r>
+              <w:rPr>
+                <w:b w:val="0"/>
+                <w:sz w:val="17"/>
+              </w:rPr>
+              <w:t>Frontend React/Vite/Tailwind, backend Fastify/TypeScript, metadatos en PostgreSQL/Supabase y despliegue compatible con Render.</w:t>
+            </w:r>
+          </w:p>
+        </w:tc>
+      </w:tr>
+      <w:tr>
+        <w:tc>
+          <w:tcPr>
+            <w:tcW w:type="dxa" w:w="5040"/>
+            <w:vAlign w:val="center"/>
+          </w:tcPr>
+          <w:p>
+            <w:r/>
+            <w:r>
+              <w:rPr>
+                <w:b w:val="0"/>
+                <w:sz w:val="17"/>
+              </w:rPr>
+              <w:t>Motores y formatos</w:t>
+            </w:r>
+          </w:p>
+        </w:tc>
+        <w:tc>
+          <w:tcPr>
+            <w:tcW w:type="dxa" w:w="5040"/>
+            <w:vAlign w:val="center"/>
+          </w:tcPr>
+          <w:p>
+            <w:r/>
+            <w:r>
+              <w:rPr>
+                <w:b w:val="0"/>
+                <w:sz w:val="17"/>
+              </w:rPr>
+              <w:t>PostgreSQL, MySQL, MariaDB, SQL Server, Oracle por script, SQLite, MongoDB JSON/NDJSON, Excel/CSV y SQL Server .bak con restauracion configurada.</w:t>
+            </w:r>
+          </w:p>
+        </w:tc>
+      </w:tr>
+      <w:tr>
+        <w:tc>
+          <w:tcPr>
+            <w:tcW w:type="dxa" w:w="5040"/>
+            <w:vAlign w:val="center"/>
+          </w:tcPr>
+          <w:p>
+            <w:r/>
+            <w:r>
+              <w:rPr>
+                <w:b w:val="0"/>
+                <w:sz w:val="17"/>
+              </w:rPr>
+              <w:t>Resultado principal</w:t>
+            </w:r>
+          </w:p>
+        </w:tc>
+        <w:tc>
+          <w:tcPr>
+            <w:tcW w:type="dxa" w:w="5040"/>
+            <w:vAlign w:val="center"/>
+          </w:tcPr>
+          <w:p>
+            <w:r/>
+            <w:r>
+              <w:rPr>
+                <w:b w:val="0"/>
+                <w:sz w:val="17"/>
+              </w:rPr>
+              <w:t>Replica trazable con historial, reintentos, diagnostico de errores y descarga en JSON, XLSX o SQLite para catalogos importados.</w:t>
+            </w:r>
+          </w:p>
+        </w:tc>
+      </w:tr>
+    </w:tbl>
+    <w:p/>
+    <w:p>
+      <w:pPr>
+        <w:pStyle w:val="Heading1"/>
+      </w:pPr>
+      <w:r>
+        <w:rPr>
+          <w:rFonts w:ascii="Arial" w:hAnsi="Arial"/>
+          <w:sz w:val="20"/>
+        </w:rPr>
+        <w:t>2. Objetivos</w:t>
+      </w:r>
+    </w:p>
+    <w:tbl>
+      <w:tblPr>
+        <w:tblStyle w:val="TableGrid"/>
+        <w:tblW w:type="auto" w:w="0"/>
+        <w:jc w:val="center"/>
+        <w:tblLook w:firstColumn="1" w:firstRow="1" w:lastColumn="0" w:lastRow="0" w:noHBand="0" w:noVBand="1" w:val="04A0"/>
+      </w:tblPr>
+      <w:tblGrid>
+        <w:gridCol w:w="3360"/>
+        <w:gridCol w:w="3360"/>
+        <w:gridCol w:w="3360"/>
+      </w:tblGrid>
+      <w:tr>
+        <w:tc>
+          <w:tcPr>
+            <w:tcW w:type="dxa" w:w="3360"/>
+            <w:vAlign w:val="center"/>
+            <w:shd w:fill="1F4E79"/>
+          </w:tcPr>
+          <w:p>
+            <w:r/>
+            <w:r>
+              <w:rPr>
+                <w:b/>
+                <w:color w:val="FFFFFF"/>
+                <w:sz w:val="17"/>
+              </w:rPr>
+              <w:t>Tipo</w:t>
+            </w:r>
+          </w:p>
+        </w:tc>
+        <w:tc>
+          <w:tcPr>
+            <w:tcW w:type="dxa" w:w="3360"/>
+            <w:vAlign w:val="center"/>
+            <w:shd w:fill="1F4E79"/>
+          </w:tcPr>
+          <w:p>
+            <w:r/>
+            <w:r>
+              <w:rPr>
+                <w:b/>
+                <w:color w:val="FFFFFF"/>
+                <w:sz w:val="17"/>
+              </w:rPr>
+              <w:t>Objetivo</w:t>
+            </w:r>
+          </w:p>
+        </w:tc>
+        <w:tc>
+          <w:tcPr>
+            <w:tcW w:type="dxa" w:w="3360"/>
+            <w:vAlign w:val="center"/>
+            <w:shd w:fill="1F4E79"/>
+          </w:tcPr>
+          <w:p>
+            <w:r/>
+            <w:r>
+              <w:rPr>
+                <w:b/>
+                <w:color w:val="FFFFFF"/>
+                <w:sz w:val="17"/>
+              </w:rPr>
+              <w:t>Indicador</w:t>
+            </w:r>
+          </w:p>
+        </w:tc>
+      </w:tr>
+      <w:tr>
+        <w:tc>
+          <w:tcPr>
+            <w:tcW w:type="dxa" w:w="3360"/>
+            <w:vAlign w:val="center"/>
+          </w:tcPr>
+          <w:p>
+            <w:r/>
+            <w:r>
+              <w:rPr>
+                <w:b w:val="0"/>
+                <w:sz w:val="17"/>
+              </w:rPr>
+              <w:t>General</w:t>
+            </w:r>
+          </w:p>
+        </w:tc>
+        <w:tc>
+          <w:tcPr>
+            <w:tcW w:type="dxa" w:w="3360"/>
+            <w:vAlign w:val="center"/>
+          </w:tcPr>
+          <w:p>
+            <w:r/>
+            <w:r>
+              <w:rPr>
+                <w:b w:val="0"/>
+                <w:sz w:val="17"/>
+              </w:rPr>
+              <w:t>Evaluar la viabilidad de Drop Nexus como herramienta academica y tecnica para replicar datos entre motores heterogeneos.</w:t>
+            </w:r>
+          </w:p>
+        </w:tc>
+        <w:tc>
+          <w:tcPr>
+            <w:tcW w:type="dxa" w:w="3360"/>
+            <w:vAlign w:val="center"/>
+          </w:tcPr>
+          <w:p>
+            <w:r/>
+            <w:r>
+              <w:rPr>
+                <w:b w:val="0"/>
+                <w:sz w:val="17"/>
+              </w:rPr>
+              <w:t>Sistema web ejecutable en carpeta web/.</w:t>
+            </w:r>
+          </w:p>
+        </w:tc>
+      </w:tr>
+      <w:tr>
+        <w:tc>
+          <w:tcPr>
+            <w:tcW w:type="dxa" w:w="3360"/>
+            <w:vAlign w:val="center"/>
+          </w:tcPr>
+          <w:p>
+            <w:r/>
+            <w:r>
+              <w:rPr>
+                <w:b w:val="0"/>
+                <w:sz w:val="17"/>
+              </w:rPr>
+              <w:t>Especifico</w:t>
+            </w:r>
+          </w:p>
+        </w:tc>
+        <w:tc>
+          <w:tcPr>
+            <w:tcW w:type="dxa" w:w="3360"/>
+            <w:vAlign w:val="center"/>
+          </w:tcPr>
+          <w:p>
+            <w:r/>
+            <w:r>
+              <w:rPr>
+                <w:b w:val="0"/>
+                <w:sz w:val="17"/>
+              </w:rPr>
+              <w:t>Validar la factibilidad tecnica de adaptadores, catalogos, seguridad y despliegue.</w:t>
+            </w:r>
+          </w:p>
+        </w:tc>
+        <w:tc>
+          <w:tcPr>
+            <w:tcW w:type="dxa" w:w="3360"/>
+            <w:vAlign w:val="center"/>
+          </w:tcPr>
+          <w:p>
+            <w:r/>
+            <w:r>
+              <w:rPr>
+                <w:b w:val="0"/>
+                <w:sz w:val="17"/>
+              </w:rPr>
+              <w:t>Servicios y rutas implementados en backend/src.</w:t>
+            </w:r>
+          </w:p>
+        </w:tc>
+      </w:tr>
+      <w:tr>
+        <w:tc>
+          <w:tcPr>
+            <w:tcW w:type="dxa" w:w="3360"/>
+            <w:vAlign w:val="center"/>
+          </w:tcPr>
+          <w:p>
+            <w:r/>
+            <w:r>
+              <w:rPr>
+                <w:b w:val="0"/>
+                <w:sz w:val="17"/>
+              </w:rPr>
+              <w:t>Especifico</w:t>
+            </w:r>
+          </w:p>
+        </w:tc>
+        <w:tc>
+          <w:tcPr>
+            <w:tcW w:type="dxa" w:w="3360"/>
+            <w:vAlign w:val="center"/>
+          </w:tcPr>
+          <w:p>
+            <w:r/>
+            <w:r>
+              <w:rPr>
+                <w:b w:val="0"/>
+                <w:sz w:val="17"/>
+              </w:rPr>
+              <w:t>Validar la factibilidad operativa para usuarios no expertos en scripts.</w:t>
+            </w:r>
+          </w:p>
+        </w:tc>
+        <w:tc>
+          <w:tcPr>
+            <w:tcW w:type="dxa" w:w="3360"/>
+            <w:vAlign w:val="center"/>
+          </w:tcPr>
+          <w:p>
+            <w:r/>
+            <w:r>
+              <w:rPr>
+                <w:b w:val="0"/>
+                <w:sz w:val="17"/>
+              </w:rPr>
+              <w:t>Flujo guiado de conexiones, tablas, mapeo y validacion.</w:t>
+            </w:r>
+          </w:p>
+        </w:tc>
+      </w:tr>
+      <w:tr>
+        <w:tc>
+          <w:tcPr>
+            <w:tcW w:type="dxa" w:w="3360"/>
+            <w:vAlign w:val="center"/>
+          </w:tcPr>
+          <w:p>
+            <w:r/>
+            <w:r>
+              <w:rPr>
+                <w:b w:val="0"/>
+                <w:sz w:val="17"/>
+              </w:rPr>
+              <w:t>Especifico</w:t>
+            </w:r>
+          </w:p>
+        </w:tc>
+        <w:tc>
+          <w:tcPr>
+            <w:tcW w:type="dxa" w:w="3360"/>
+            <w:vAlign w:val="center"/>
+          </w:tcPr>
+          <w:p>
+            <w:r/>
+            <w:r>
+              <w:rPr>
+                <w:b w:val="0"/>
+                <w:sz w:val="17"/>
+              </w:rPr>
+              <w:t>Estimar riesgos economicos, legales y ambientales.</w:t>
+            </w:r>
+          </w:p>
+        </w:tc>
+        <w:tc>
+          <w:tcPr>
+            <w:tcW w:type="dxa" w:w="3360"/>
+            <w:vAlign w:val="center"/>
+          </w:tcPr>
+          <w:p>
+            <w:r/>
+            <w:r>
+              <w:rPr>
+                <w:b w:val="0"/>
+                <w:sz w:val="17"/>
+              </w:rPr>
+              <w:t>Tabla de riesgos y mitigaciones documentada.</w:t>
+            </w:r>
+          </w:p>
+        </w:tc>
+      </w:tr>
+    </w:tbl>
+    <w:p/>
+    <w:p>
+      <w:pPr>
+        <w:pStyle w:val="Heading1"/>
+      </w:pPr>
+      <w:r>
+        <w:rPr>
+          <w:rFonts w:ascii="Arial" w:hAnsi="Arial"/>
+          <w:sz w:val="20"/>
+        </w:rPr>
+        <w:t>3. Situacion actual y problema</w:t>
+      </w:r>
+    </w:p>
+    <w:p>
+      <w:r>
+        <w:rPr>
+          <w:rFonts w:ascii="Arial" w:hAnsi="Arial"/>
+          <w:sz w:val="20"/>
+        </w:rPr>
+        <w:t>La migracion entre motores suele depender de scripts manuales, herramientas distintas por cada tecnologia y validaciones poco visibles. En cursos y pruebas de integracion esto genera perdida de tiempo, poca trazabilidad, errores dificiles de explicar y resultados que no siempre pueden descargarse en un formato verificable.</w:t>
+      </w:r>
+    </w:p>
+    <w:p>
+      <w:r>
+        <w:rPr>
+          <w:rFonts w:ascii="Arial" w:hAnsi="Arial"/>
+          <w:b/>
+          <w:sz w:val="20"/>
+        </w:rPr>
+        <w:t>Diagrama de contexto</w:t>
+      </w:r>
+    </w:p>
+    <w:p>
+      <w:pPr>
+        <w:pStyle w:val="NoSpacing"/>
+      </w:pPr>
+      <w:r>
+        <w:rPr>
+          <w:rFonts w:ascii="Consolas" w:hAnsi="Consolas" w:eastAsia="Consolas"/>
+          <w:sz w:val="16"/>
+        </w:rPr>
+        <w:t>```mermaid</w:t>
+        <w:br/>
+        <w:t>graph TD</w:t>
+        <w:br/>
+        <w:t xml:space="preserve">  U[Usuario autenticado] --&gt; F[Frontend React + Vite]</w:t>
+        <w:br/>
+        <w:t xml:space="preserve">  F --&gt; API[API Fastify /api]</w:t>
+        <w:br/>
+        <w:t xml:space="preserve">  API --&gt; AUTH[Auth JWT y roles]</w:t>
+        <w:br/>
+        <w:t xml:space="preserve">  API --&gt; CFG[Configuraciones y archivos]</w:t>
+        <w:br/>
+        <w:t xml:space="preserve">  API --&gt; REP[Servicio de replicacion]</w:t>
+        <w:br/>
+        <w:t xml:space="preserve">  CFG --&gt; CAT[Catalogos normalizados]</w:t>
+        <w:br/>
+        <w:t xml:space="preserve">  REP --&gt; ADP[Adaptadores por motor]</w:t>
+        <w:br/>
+        <w:t xml:space="preserve">  ADP --&gt; SRC[Bases origen]</w:t>
+        <w:br/>
+        <w:t xml:space="preserve">  ADP --&gt; DST[Bases destino]</w:t>
+        <w:br/>
+        <w:t xml:space="preserve">  API --&gt; META[(Supabase/PostgreSQL metadatos)]</w:t>
+        <w:br/>
+        <w:t xml:space="preserve">  CAT --&gt; META</w:t>
+        <w:br/>
+        <w:t xml:space="preserve">  REP --&gt; META</w:t>
+        <w:br/>
+        <w:t>```</w:t>
+      </w:r>
+    </w:p>
+    <w:p/>
+    <w:p>
+      <w:pPr>
+        <w:pStyle w:val="Heading1"/>
+      </w:pPr>
+      <w:r>
+        <w:rPr>
+          <w:rFonts w:ascii="Arial" w:hAnsi="Arial"/>
+          <w:sz w:val="20"/>
+        </w:rPr>
+        <w:t>4. Factibilidad tecnica</w:t>
+      </w:r>
+    </w:p>
+    <w:tbl>
+      <w:tblPr>
+        <w:tblStyle w:val="TableGrid"/>
+        <w:tblW w:type="auto" w:w="0"/>
+        <w:jc w:val="center"/>
+        <w:tblLook w:firstColumn="1" w:firstRow="1" w:lastColumn="0" w:lastRow="0" w:noHBand="0" w:noVBand="1" w:val="04A0"/>
+      </w:tblPr>
+      <w:tblGrid>
+        <w:gridCol w:w="3360"/>
+        <w:gridCol w:w="3360"/>
+        <w:gridCol w:w="3360"/>
+      </w:tblGrid>
+      <w:tr>
+        <w:tc>
+          <w:tcPr>
+            <w:tcW w:type="dxa" w:w="3360"/>
+            <w:vAlign w:val="center"/>
+            <w:shd w:fill="1F4E79"/>
+          </w:tcPr>
+          <w:p>
+            <w:r/>
+            <w:r>
+              <w:rPr>
+                <w:b/>
+                <w:color w:val="FFFFFF"/>
+                <w:sz w:val="17"/>
+              </w:rPr>
+              <w:t>Criterio</w:t>
+            </w:r>
+          </w:p>
+        </w:tc>
+        <w:tc>
+          <w:tcPr>
+            <w:tcW w:type="dxa" w:w="3360"/>
+            <w:vAlign w:val="center"/>
+            <w:shd w:fill="1F4E79"/>
+          </w:tcPr>
+          <w:p>
+            <w:r/>
+            <w:r>
+              <w:rPr>
+                <w:b/>
+                <w:color w:val="FFFFFF"/>
+                <w:sz w:val="17"/>
+              </w:rPr>
+              <w:t>Evidencia en el sistema</w:t>
+            </w:r>
+          </w:p>
+        </w:tc>
+        <w:tc>
+          <w:tcPr>
+            <w:tcW w:type="dxa" w:w="3360"/>
+            <w:vAlign w:val="center"/>
+            <w:shd w:fill="1F4E79"/>
+          </w:tcPr>
+          <w:p>
+            <w:r/>
+            <w:r>
+              <w:rPr>
+                <w:b/>
+                <w:color w:val="FFFFFF"/>
+                <w:sz w:val="17"/>
+              </w:rPr>
+              <w:t>Resultado</w:t>
+            </w:r>
+          </w:p>
+        </w:tc>
+      </w:tr>
+      <w:tr>
+        <w:tc>
+          <w:tcPr>
+            <w:tcW w:type="dxa" w:w="3360"/>
+            <w:vAlign w:val="center"/>
+          </w:tcPr>
+          <w:p>
+            <w:r/>
+            <w:r>
+              <w:rPr>
+                <w:b w:val="0"/>
+                <w:sz w:val="17"/>
+              </w:rPr>
+              <w:t>Arquitectura web</w:t>
+            </w:r>
+          </w:p>
+        </w:tc>
+        <w:tc>
+          <w:tcPr>
+            <w:tcW w:type="dxa" w:w="3360"/>
+            <w:vAlign w:val="center"/>
+          </w:tcPr>
+          <w:p>
+            <w:r/>
+            <w:r>
+              <w:rPr>
+                <w:b w:val="0"/>
+                <w:sz w:val="17"/>
+              </w:rPr>
+              <w:t>React consume API Fastify bajo /api; backend sirve frontend/dist en produccion.</w:t>
+            </w:r>
+          </w:p>
+        </w:tc>
+        <w:tc>
+          <w:tcPr>
+            <w:tcW w:type="dxa" w:w="3360"/>
+            <w:vAlign w:val="center"/>
+          </w:tcPr>
+          <w:p>
+            <w:r/>
+            <w:r>
+              <w:rPr>
+                <w:b w:val="0"/>
+                <w:sz w:val="17"/>
+              </w:rPr>
+              <w:t>Factible</w:t>
+            </w:r>
+          </w:p>
+        </w:tc>
+      </w:tr>
+      <w:tr>
+        <w:tc>
+          <w:tcPr>
+            <w:tcW w:type="dxa" w:w="3360"/>
+            <w:vAlign w:val="center"/>
+          </w:tcPr>
+          <w:p>
+            <w:r/>
+            <w:r>
+              <w:rPr>
+                <w:b w:val="0"/>
+                <w:sz w:val="17"/>
+              </w:rPr>
+              <w:t>Persistencia</w:t>
+            </w:r>
+          </w:p>
+        </w:tc>
+        <w:tc>
+          <w:tcPr>
+            <w:tcW w:type="dxa" w:w="3360"/>
+            <w:vAlign w:val="center"/>
+          </w:tcPr>
+          <w:p>
+            <w:r/>
+            <w:r>
+              <w:rPr>
+                <w:b w:val="0"/>
+                <w:sz w:val="17"/>
+              </w:rPr>
+              <w:t>Tablas users, db_configurations, replications, health_checks y database_catalogs en PostgreSQL.</w:t>
+            </w:r>
+          </w:p>
+        </w:tc>
+        <w:tc>
+          <w:tcPr>
+            <w:tcW w:type="dxa" w:w="3360"/>
+            <w:vAlign w:val="center"/>
+          </w:tcPr>
+          <w:p>
+            <w:r/>
+            <w:r>
+              <w:rPr>
+                <w:b w:val="0"/>
+                <w:sz w:val="17"/>
+              </w:rPr>
+              <w:t>Factible</w:t>
+            </w:r>
+          </w:p>
+        </w:tc>
+      </w:tr>
+      <w:tr>
+        <w:tc>
+          <w:tcPr>
+            <w:tcW w:type="dxa" w:w="3360"/>
+            <w:vAlign w:val="center"/>
+          </w:tcPr>
+          <w:p>
+            <w:r/>
+            <w:r>
+              <w:rPr>
+                <w:b w:val="0"/>
+                <w:sz w:val="17"/>
+              </w:rPr>
+              <w:t>Procesamiento</w:t>
+            </w:r>
+          </w:p>
+        </w:tc>
+        <w:tc>
+          <w:tcPr>
+            <w:tcW w:type="dxa" w:w="3360"/>
+            <w:vAlign w:val="center"/>
+          </w:tcPr>
+          <w:p>
+            <w:r/>
+            <w:r>
+              <w:rPr>
+                <w:b w:val="0"/>
+                <w:sz w:val="17"/>
+              </w:rPr>
+              <w:t>replicationService ejecuta lotes, offset, reintentos, programacion y reanudacion.</w:t>
+            </w:r>
+          </w:p>
+        </w:tc>
+        <w:tc>
+          <w:tcPr>
+            <w:tcW w:type="dxa" w:w="3360"/>
+            <w:vAlign w:val="center"/>
+          </w:tcPr>
+          <w:p>
+            <w:r/>
+            <w:r>
+              <w:rPr>
+                <w:b w:val="0"/>
+                <w:sz w:val="17"/>
+              </w:rPr>
+              <w:t>Factible</w:t>
+            </w:r>
+          </w:p>
+        </w:tc>
+      </w:tr>
+      <w:tr>
+        <w:tc>
+          <w:tcPr>
+            <w:tcW w:type="dxa" w:w="3360"/>
+            <w:vAlign w:val="center"/>
+          </w:tcPr>
+          <w:p>
+            <w:r/>
+            <w:r>
+              <w:rPr>
+                <w:b w:val="0"/>
+                <w:sz w:val="17"/>
+              </w:rPr>
+              <w:t>Interoperabilidad</w:t>
+            </w:r>
+          </w:p>
+        </w:tc>
+        <w:tc>
+          <w:tcPr>
+            <w:tcW w:type="dxa" w:w="3360"/>
+            <w:vAlign w:val="center"/>
+          </w:tcPr>
+          <w:p>
+            <w:r/>
+            <w:r>
+              <w:rPr>
+                <w:b w:val="0"/>
+                <w:sz w:val="17"/>
+              </w:rPr>
+              <w:t>DatabaseAdapter unifica motores y fileCatalog normaliza archivos.</w:t>
+            </w:r>
+          </w:p>
+        </w:tc>
+        <w:tc>
+          <w:tcPr>
+            <w:tcW w:type="dxa" w:w="3360"/>
+            <w:vAlign w:val="center"/>
+          </w:tcPr>
+          <w:p>
+            <w:r/>
+            <w:r>
+              <w:rPr>
+                <w:b w:val="0"/>
+                <w:sz w:val="17"/>
+              </w:rPr>
+              <w:t>Factible con limites por motor</w:t>
+            </w:r>
+          </w:p>
+        </w:tc>
+      </w:tr>
+      <w:tr>
+        <w:tc>
+          <w:tcPr>
+            <w:tcW w:type="dxa" w:w="3360"/>
+            <w:vAlign w:val="center"/>
+          </w:tcPr>
+          <w:p>
+            <w:r/>
+            <w:r>
+              <w:rPr>
+                <w:b w:val="0"/>
+                <w:sz w:val="17"/>
+              </w:rPr>
+              <w:t>Seguridad</w:t>
+            </w:r>
+          </w:p>
+        </w:tc>
+        <w:tc>
+          <w:tcPr>
+            <w:tcW w:type="dxa" w:w="3360"/>
+            <w:vAlign w:val="center"/>
+          </w:tcPr>
+          <w:p>
+            <w:r/>
+            <w:r>
+              <w:rPr>
+                <w:b w:val="0"/>
+                <w:sz w:val="17"/>
+              </w:rPr>
+              <w:t>JWT, Helmet, CORS, rate limit, cifrado AES-256-GCM y aislamiento por user_id.</w:t>
+            </w:r>
+          </w:p>
+        </w:tc>
+        <w:tc>
+          <w:tcPr>
+            <w:tcW w:type="dxa" w:w="3360"/>
+            <w:vAlign w:val="center"/>
+          </w:tcPr>
+          <w:p>
+            <w:r/>
+            <w:r>
+              <w:rPr>
+                <w:b w:val="0"/>
+                <w:sz w:val="17"/>
+              </w:rPr>
+              <w:t>Factible</w:t>
+            </w:r>
+          </w:p>
+        </w:tc>
+      </w:tr>
+      <w:tr>
+        <w:tc>
+          <w:tcPr>
+            <w:tcW w:type="dxa" w:w="3360"/>
+            <w:vAlign w:val="center"/>
+          </w:tcPr>
+          <w:p>
+            <w:r/>
+            <w:r>
+              <w:rPr>
+                <w:b w:val="0"/>
+                <w:sz w:val="17"/>
+              </w:rPr>
+              <w:t>Despliegue</w:t>
+            </w:r>
+          </w:p>
+        </w:tc>
+        <w:tc>
+          <w:tcPr>
+            <w:tcW w:type="dxa" w:w="3360"/>
+            <w:vAlign w:val="center"/>
+          </w:tcPr>
+          <w:p>
+            <w:r/>
+            <w:r>
+              <w:rPr>
+                <w:b w:val="0"/>
+                <w:sz w:val="17"/>
+              </w:rPr>
+              <w:t>render.yaml y variables de entorno documentadas.</w:t>
+            </w:r>
+          </w:p>
+        </w:tc>
+        <w:tc>
+          <w:tcPr>
+            <w:tcW w:type="dxa" w:w="3360"/>
+            <w:vAlign w:val="center"/>
+          </w:tcPr>
+          <w:p>
+            <w:r/>
+            <w:r>
+              <w:rPr>
+                <w:b w:val="0"/>
+                <w:sz w:val="17"/>
+              </w:rPr>
+              <w:t>Factible</w:t>
+            </w:r>
+          </w:p>
+        </w:tc>
+      </w:tr>
+    </w:tbl>
+    <w:p/>
+    <w:p>
+      <w:pPr>
+        <w:pStyle w:val="Heading1"/>
+      </w:pPr>
+      <w:r>
+        <w:rPr>
+          <w:rFonts w:ascii="Arial" w:hAnsi="Arial"/>
+          <w:sz w:val="20"/>
+        </w:rPr>
+        <w:t>5. Factibilidad economica</w:t>
+      </w:r>
+    </w:p>
+    <w:tbl>
+      <w:tblPr>
+        <w:tblStyle w:val="TableGrid"/>
+        <w:tblW w:type="auto" w:w="0"/>
+        <w:jc w:val="center"/>
+        <w:tblLook w:firstColumn="1" w:firstRow="1" w:lastColumn="0" w:lastRow="0" w:noHBand="0" w:noVBand="1" w:val="04A0"/>
+      </w:tblPr>
+      <w:tblGrid>
+        <w:gridCol w:w="3360"/>
+        <w:gridCol w:w="3360"/>
+        <w:gridCol w:w="3360"/>
+      </w:tblGrid>
+      <w:tr>
+        <w:tc>
+          <w:tcPr>
+            <w:tcW w:type="dxa" w:w="3360"/>
+            <w:vAlign w:val="center"/>
+            <w:shd w:fill="1F4E79"/>
+          </w:tcPr>
+          <w:p>
+            <w:r/>
+            <w:r>
+              <w:rPr>
+                <w:b/>
+                <w:color w:val="FFFFFF"/>
+                <w:sz w:val="17"/>
+              </w:rPr>
+              <w:t>Recurso</w:t>
+            </w:r>
+          </w:p>
+        </w:tc>
+        <w:tc>
+          <w:tcPr>
+            <w:tcW w:type="dxa" w:w="3360"/>
+            <w:vAlign w:val="center"/>
+            <w:shd w:fill="1F4E79"/>
+          </w:tcPr>
+          <w:p>
+            <w:r/>
+            <w:r>
+              <w:rPr>
+                <w:b/>
+                <w:color w:val="FFFFFF"/>
+                <w:sz w:val="17"/>
+              </w:rPr>
+              <w:t>Costo estimado</w:t>
+            </w:r>
+          </w:p>
+        </w:tc>
+        <w:tc>
+          <w:tcPr>
+            <w:tcW w:type="dxa" w:w="3360"/>
+            <w:vAlign w:val="center"/>
+            <w:shd w:fill="1F4E79"/>
+          </w:tcPr>
+          <w:p>
+            <w:r/>
+            <w:r>
+              <w:rPr>
+                <w:b/>
+                <w:color w:val="FFFFFF"/>
+                <w:sz w:val="17"/>
+              </w:rPr>
+              <w:t>Justificacion</w:t>
+            </w:r>
+          </w:p>
+        </w:tc>
+      </w:tr>
+      <w:tr>
+        <w:tc>
+          <w:tcPr>
+            <w:tcW w:type="dxa" w:w="3360"/>
+            <w:vAlign w:val="center"/>
+          </w:tcPr>
+          <w:p>
+            <w:r/>
+            <w:r>
+              <w:rPr>
+                <w:b w:val="0"/>
+                <w:sz w:val="17"/>
+              </w:rPr>
+              <w:t>Codigo fuente y herramientas</w:t>
+            </w:r>
+          </w:p>
+        </w:tc>
+        <w:tc>
+          <w:tcPr>
+            <w:tcW w:type="dxa" w:w="3360"/>
+            <w:vAlign w:val="center"/>
+          </w:tcPr>
+          <w:p>
+            <w:r/>
+            <w:r>
+              <w:rPr>
+                <w:b w:val="0"/>
+                <w:sz w:val="17"/>
+              </w:rPr>
+              <w:t>Bajo</w:t>
+            </w:r>
+          </w:p>
+        </w:tc>
+        <w:tc>
+          <w:tcPr>
+            <w:tcW w:type="dxa" w:w="3360"/>
+            <w:vAlign w:val="center"/>
+          </w:tcPr>
+          <w:p>
+            <w:r/>
+            <w:r>
+              <w:rPr>
+                <w:b w:val="0"/>
+                <w:sz w:val="17"/>
+              </w:rPr>
+              <w:t>Uso de Node.js, React, TypeScript y librerias open source.</w:t>
+            </w:r>
+          </w:p>
+        </w:tc>
+      </w:tr>
+      <w:tr>
+        <w:tc>
+          <w:tcPr>
+            <w:tcW w:type="dxa" w:w="3360"/>
+            <w:vAlign w:val="center"/>
+          </w:tcPr>
+          <w:p>
+            <w:r/>
+            <w:r>
+              <w:rPr>
+                <w:b w:val="0"/>
+                <w:sz w:val="17"/>
+              </w:rPr>
+              <w:t>Base de metadatos</w:t>
+            </w:r>
+          </w:p>
+        </w:tc>
+        <w:tc>
+          <w:tcPr>
+            <w:tcW w:type="dxa" w:w="3360"/>
+            <w:vAlign w:val="center"/>
+          </w:tcPr>
+          <w:p>
+            <w:r/>
+            <w:r>
+              <w:rPr>
+                <w:b w:val="0"/>
+                <w:sz w:val="17"/>
+              </w:rPr>
+              <w:t>Bajo/variable</w:t>
+            </w:r>
+          </w:p>
+        </w:tc>
+        <w:tc>
+          <w:tcPr>
+            <w:tcW w:type="dxa" w:w="3360"/>
+            <w:vAlign w:val="center"/>
+          </w:tcPr>
+          <w:p>
+            <w:r/>
+            <w:r>
+              <w:rPr>
+                <w:b w:val="0"/>
+                <w:sz w:val="17"/>
+              </w:rPr>
+              <w:t>Supabase/PostgreSQL puede operar en plan gratuito o academico.</w:t>
+            </w:r>
+          </w:p>
+        </w:tc>
+      </w:tr>
+      <w:tr>
+        <w:tc>
+          <w:tcPr>
+            <w:tcW w:type="dxa" w:w="3360"/>
+            <w:vAlign w:val="center"/>
+          </w:tcPr>
+          <w:p>
+            <w:r/>
+            <w:r>
+              <w:rPr>
+                <w:b w:val="0"/>
+                <w:sz w:val="17"/>
+              </w:rPr>
+              <w:t>Despliegue</w:t>
+            </w:r>
+          </w:p>
+        </w:tc>
+        <w:tc>
+          <w:tcPr>
+            <w:tcW w:type="dxa" w:w="3360"/>
+            <w:vAlign w:val="center"/>
+          </w:tcPr>
+          <w:p>
+            <w:r/>
+            <w:r>
+              <w:rPr>
+                <w:b w:val="0"/>
+                <w:sz w:val="17"/>
+              </w:rPr>
+              <w:t>Bajo/variable</w:t>
+            </w:r>
+          </w:p>
+        </w:tc>
+        <w:tc>
+          <w:tcPr>
+            <w:tcW w:type="dxa" w:w="3360"/>
+            <w:vAlign w:val="center"/>
+          </w:tcPr>
+          <w:p>
+            <w:r/>
+            <w:r>
+              <w:rPr>
+                <w:b w:val="0"/>
+                <w:sz w:val="17"/>
+              </w:rPr>
+              <w:t>Render permite despliegue de prueba; produccion depende de capacidad requerida.</w:t>
+            </w:r>
+          </w:p>
+        </w:tc>
+      </w:tr>
+      <w:tr>
+        <w:tc>
+          <w:tcPr>
+            <w:tcW w:type="dxa" w:w="3360"/>
+            <w:vAlign w:val="center"/>
+          </w:tcPr>
+          <w:p>
+            <w:r/>
+            <w:r>
+              <w:rPr>
+                <w:b w:val="0"/>
+                <w:sz w:val="17"/>
+              </w:rPr>
+              <w:t>SQL Server para .bak</w:t>
+            </w:r>
+          </w:p>
+        </w:tc>
+        <w:tc>
+          <w:tcPr>
+            <w:tcW w:type="dxa" w:w="3360"/>
+            <w:vAlign w:val="center"/>
+          </w:tcPr>
+          <w:p>
+            <w:r/>
+            <w:r>
+              <w:rPr>
+                <w:b w:val="0"/>
+                <w:sz w:val="17"/>
+              </w:rPr>
+              <w:t>Medio</w:t>
+            </w:r>
+          </w:p>
+        </w:tc>
+        <w:tc>
+          <w:tcPr>
+            <w:tcW w:type="dxa" w:w="3360"/>
+            <w:vAlign w:val="center"/>
+          </w:tcPr>
+          <w:p>
+            <w:r/>
+            <w:r>
+              <w:rPr>
+                <w:b w:val="0"/>
+                <w:sz w:val="17"/>
+              </w:rPr>
+              <w:t>Solo necesario si se importan respaldos .bak; alternativa: script .sql.</w:t>
+            </w:r>
+          </w:p>
+        </w:tc>
+      </w:tr>
+      <w:tr>
+        <w:tc>
+          <w:tcPr>
+            <w:tcW w:type="dxa" w:w="3360"/>
+            <w:vAlign w:val="center"/>
+          </w:tcPr>
+          <w:p>
+            <w:r/>
+            <w:r>
+              <w:rPr>
+                <w:b w:val="0"/>
+                <w:sz w:val="17"/>
+              </w:rPr>
+              <w:t>Mantenimiento</w:t>
+            </w:r>
+          </w:p>
+        </w:tc>
+        <w:tc>
+          <w:tcPr>
+            <w:tcW w:type="dxa" w:w="3360"/>
+            <w:vAlign w:val="center"/>
+          </w:tcPr>
+          <w:p>
+            <w:r/>
+            <w:r>
+              <w:rPr>
+                <w:b w:val="0"/>
+                <w:sz w:val="17"/>
+              </w:rPr>
+              <w:t>Medio</w:t>
+            </w:r>
+          </w:p>
+        </w:tc>
+        <w:tc>
+          <w:tcPr>
+            <w:tcW w:type="dxa" w:w="3360"/>
+            <w:vAlign w:val="center"/>
+          </w:tcPr>
+          <w:p>
+            <w:r/>
+            <w:r>
+              <w:rPr>
+                <w:b w:val="0"/>
+                <w:sz w:val="17"/>
+              </w:rPr>
+              <w:t>Requiere actualizacion de dependencias y pruebas por motor.</w:t>
+            </w:r>
+          </w:p>
+        </w:tc>
+      </w:tr>
+    </w:tbl>
+    <w:p/>
+    <w:p>
+      <w:pPr>
+        <w:pStyle w:val="Heading1"/>
+      </w:pPr>
+      <w:r>
+        <w:rPr>
+          <w:rFonts w:ascii="Arial" w:hAnsi="Arial"/>
+          <w:sz w:val="20"/>
+        </w:rPr>
+        <w:t>6. Factibilidad operativa</w:t>
+      </w:r>
+    </w:p>
+    <w:tbl>
+      <w:tblPr>
+        <w:tblStyle w:val="TableGrid"/>
+        <w:tblW w:type="auto" w:w="0"/>
+        <w:jc w:val="center"/>
+        <w:tblLook w:firstColumn="1" w:firstRow="1" w:lastColumn="0" w:lastRow="0" w:noHBand="0" w:noVBand="1" w:val="04A0"/>
+      </w:tblPr>
+      <w:tblGrid>
+        <w:gridCol w:w="3360"/>
+        <w:gridCol w:w="3360"/>
+        <w:gridCol w:w="3360"/>
+      </w:tblGrid>
+      <w:tr>
+        <w:tc>
+          <w:tcPr>
+            <w:tcW w:type="dxa" w:w="3360"/>
+            <w:vAlign w:val="center"/>
+            <w:shd w:fill="1F4E79"/>
+          </w:tcPr>
+          <w:p>
+            <w:r/>
+            <w:r>
+              <w:rPr>
+                <w:b/>
+                <w:color w:val="FFFFFF"/>
+                <w:sz w:val="17"/>
+              </w:rPr>
+              <w:t>Usuario</w:t>
+            </w:r>
+          </w:p>
+        </w:tc>
+        <w:tc>
+          <w:tcPr>
+            <w:tcW w:type="dxa" w:w="3360"/>
+            <w:vAlign w:val="center"/>
+            <w:shd w:fill="1F4E79"/>
+          </w:tcPr>
+          <w:p>
+            <w:r/>
+            <w:r>
+              <w:rPr>
+                <w:b/>
+                <w:color w:val="FFFFFF"/>
+                <w:sz w:val="17"/>
+              </w:rPr>
+              <w:t>Operacion</w:t>
+            </w:r>
+          </w:p>
+        </w:tc>
+        <w:tc>
+          <w:tcPr>
+            <w:tcW w:type="dxa" w:w="3360"/>
+            <w:vAlign w:val="center"/>
+            <w:shd w:fill="1F4E79"/>
+          </w:tcPr>
+          <w:p>
+            <w:r/>
+            <w:r>
+              <w:rPr>
+                <w:b/>
+                <w:color w:val="FFFFFF"/>
+                <w:sz w:val="17"/>
+              </w:rPr>
+              <w:t>Apoyo del sistema</w:t>
+            </w:r>
+          </w:p>
+        </w:tc>
+      </w:tr>
+      <w:tr>
+        <w:tc>
+          <w:tcPr>
+            <w:tcW w:type="dxa" w:w="3360"/>
+            <w:vAlign w:val="center"/>
+          </w:tcPr>
+          <w:p>
+            <w:r/>
+            <w:r>
+              <w:rPr>
+                <w:b w:val="0"/>
+                <w:sz w:val="17"/>
+              </w:rPr>
+              <w:t>Usuario autenticado</w:t>
+            </w:r>
+          </w:p>
+        </w:tc>
+        <w:tc>
+          <w:tcPr>
+            <w:tcW w:type="dxa" w:w="3360"/>
+            <w:vAlign w:val="center"/>
+          </w:tcPr>
+          <w:p>
+            <w:r/>
+            <w:r>
+              <w:rPr>
+                <w:b w:val="0"/>
+                <w:sz w:val="17"/>
+              </w:rPr>
+              <w:t>Importar base desde PC</w:t>
+            </w:r>
+          </w:p>
+        </w:tc>
+        <w:tc>
+          <w:tcPr>
+            <w:tcW w:type="dxa" w:w="3360"/>
+            <w:vAlign w:val="center"/>
+          </w:tcPr>
+          <w:p>
+            <w:r/>
+            <w:r>
+              <w:rPr>
+                <w:b w:val="0"/>
+                <w:sz w:val="17"/>
+              </w:rPr>
+              <w:t>Deteccion de motor, validacion de extension y tamano.</w:t>
+            </w:r>
+          </w:p>
+        </w:tc>
+      </w:tr>
+      <w:tr>
+        <w:tc>
+          <w:tcPr>
+            <w:tcW w:type="dxa" w:w="3360"/>
+            <w:vAlign w:val="center"/>
+          </w:tcPr>
+          <w:p>
+            <w:r/>
+            <w:r>
+              <w:rPr>
+                <w:b w:val="0"/>
+                <w:sz w:val="17"/>
+              </w:rPr>
+              <w:t>Usuario autenticado</w:t>
+            </w:r>
+          </w:p>
+        </w:tc>
+        <w:tc>
+          <w:tcPr>
+            <w:tcW w:type="dxa" w:w="3360"/>
+            <w:vAlign w:val="center"/>
+          </w:tcPr>
+          <w:p>
+            <w:r/>
+            <w:r>
+              <w:rPr>
+                <w:b w:val="0"/>
+                <w:sz w:val="17"/>
+              </w:rPr>
+              <w:t>Replicar tablas</w:t>
+            </w:r>
+          </w:p>
+        </w:tc>
+        <w:tc>
+          <w:tcPr>
+            <w:tcW w:type="dxa" w:w="3360"/>
+            <w:vAlign w:val="center"/>
+          </w:tcPr>
+          <w:p>
+            <w:r/>
+            <w:r>
+              <w:rPr>
+                <w:b w:val="0"/>
+                <w:sz w:val="17"/>
+              </w:rPr>
+              <w:t>Wizard de cuatro pasos: conexiones, tablas, mapeo y validacion.</w:t>
+            </w:r>
+          </w:p>
+        </w:tc>
+      </w:tr>
+      <w:tr>
+        <w:tc>
+          <w:tcPr>
+            <w:tcW w:type="dxa" w:w="3360"/>
+            <w:vAlign w:val="center"/>
+          </w:tcPr>
+          <w:p>
+            <w:r/>
+            <w:r>
+              <w:rPr>
+                <w:b w:val="0"/>
+                <w:sz w:val="17"/>
+              </w:rPr>
+              <w:t>Administrador</w:t>
+            </w:r>
+          </w:p>
+        </w:tc>
+        <w:tc>
+          <w:tcPr>
+            <w:tcW w:type="dxa" w:w="3360"/>
+            <w:vAlign w:val="center"/>
+          </w:tcPr>
+          <w:p>
+            <w:r/>
+            <w:r>
+              <w:rPr>
+                <w:b w:val="0"/>
+                <w:sz w:val="17"/>
+              </w:rPr>
+              <w:t>Gestionar usuarios</w:t>
+            </w:r>
+          </w:p>
+        </w:tc>
+        <w:tc>
+          <w:tcPr>
+            <w:tcW w:type="dxa" w:w="3360"/>
+            <w:vAlign w:val="center"/>
+          </w:tcPr>
+          <w:p>
+            <w:r/>
+            <w:r>
+              <w:rPr>
+                <w:b w:val="0"/>
+                <w:sz w:val="17"/>
+              </w:rPr>
+              <w:t>Pantalla /admin/users y rutas protegidas por rol.</w:t>
+            </w:r>
+          </w:p>
+        </w:tc>
+      </w:tr>
+      <w:tr>
+        <w:tc>
+          <w:tcPr>
+            <w:tcW w:type="dxa" w:w="3360"/>
+            <w:vAlign w:val="center"/>
+          </w:tcPr>
+          <w:p>
+            <w:r/>
+            <w:r>
+              <w:rPr>
+                <w:b w:val="0"/>
+                <w:sz w:val="17"/>
+              </w:rPr>
+              <w:t>Evaluador</w:t>
+            </w:r>
+          </w:p>
+        </w:tc>
+        <w:tc>
+          <w:tcPr>
+            <w:tcW w:type="dxa" w:w="3360"/>
+            <w:vAlign w:val="center"/>
+          </w:tcPr>
+          <w:p>
+            <w:r/>
+            <w:r>
+              <w:rPr>
+                <w:b w:val="0"/>
+                <w:sz w:val="17"/>
+              </w:rPr>
+              <w:t>Revisar funcionamiento</w:t>
+            </w:r>
+          </w:p>
+        </w:tc>
+        <w:tc>
+          <w:tcPr>
+            <w:tcW w:type="dxa" w:w="3360"/>
+            <w:vAlign w:val="center"/>
+          </w:tcPr>
+          <w:p>
+            <w:r/>
+            <w:r>
+              <w:rPr>
+                <w:b w:val="0"/>
+                <w:sz w:val="17"/>
+              </w:rPr>
+              <w:t>README, documentos FD, extension VS Code y chatbox.</w:t>
+            </w:r>
+          </w:p>
+        </w:tc>
+      </w:tr>
+    </w:tbl>
+    <w:p/>
+    <w:p>
+      <w:pPr>
+        <w:pStyle w:val="Heading1"/>
+      </w:pPr>
+      <w:r>
+        <w:rPr>
+          <w:rFonts w:ascii="Arial" w:hAnsi="Arial"/>
+          <w:sz w:val="20"/>
+        </w:rPr>
+        <w:t>7. Riesgos y mitigaciones</w:t>
+      </w:r>
+    </w:p>
+    <w:tbl>
+      <w:tblPr>
+        <w:tblStyle w:val="TableGrid"/>
+        <w:tblW w:type="auto" w:w="0"/>
+        <w:jc w:val="center"/>
+        <w:tblLook w:firstColumn="1" w:firstRow="1" w:lastColumn="0" w:lastRow="0" w:noHBand="0" w:noVBand="1" w:val="04A0"/>
+      </w:tblPr>
+      <w:tblGrid>
+        <w:gridCol w:w="2520"/>
+        <w:gridCol w:w="2520"/>
+        <w:gridCol w:w="2520"/>
+        <w:gridCol w:w="2520"/>
+      </w:tblGrid>
+      <w:tr>
+        <w:tc>
+          <w:tcPr>
+            <w:tcW w:type="dxa" w:w="2520"/>
+            <w:vAlign w:val="center"/>
+            <w:shd w:fill="1F4E79"/>
+          </w:tcPr>
+          <w:p>
+            <w:r/>
+            <w:r>
+              <w:rPr>
+                <w:b/>
+                <w:color w:val="FFFFFF"/>
+                <w:sz w:val="17"/>
+              </w:rPr>
+              <w:t>Riesgo</w:t>
+            </w:r>
+          </w:p>
+        </w:tc>
+        <w:tc>
+          <w:tcPr>
+            <w:tcW w:type="dxa" w:w="2520"/>
+            <w:vAlign w:val="center"/>
+            <w:shd w:fill="1F4E79"/>
+          </w:tcPr>
+          <w:p>
+            <w:r/>
+            <w:r>
+              <w:rPr>
+                <w:b/>
+                <w:color w:val="FFFFFF"/>
+                <w:sz w:val="17"/>
+              </w:rPr>
+              <w:t>Impacto</w:t>
+            </w:r>
+          </w:p>
+        </w:tc>
+        <w:tc>
+          <w:tcPr>
+            <w:tcW w:type="dxa" w:w="2520"/>
+            <w:vAlign w:val="center"/>
+            <w:shd w:fill="1F4E79"/>
+          </w:tcPr>
+          <w:p>
+            <w:r/>
+            <w:r>
+              <w:rPr>
+                <w:b/>
+                <w:color w:val="FFFFFF"/>
+                <w:sz w:val="17"/>
+              </w:rPr>
+              <w:t>Probabilidad</w:t>
+            </w:r>
+          </w:p>
+        </w:tc>
+        <w:tc>
+          <w:tcPr>
+            <w:tcW w:type="dxa" w:w="2520"/>
+            <w:vAlign w:val="center"/>
+            <w:shd w:fill="1F4E79"/>
+          </w:tcPr>
+          <w:p>
+            <w:r/>
+            <w:r>
+              <w:rPr>
+                <w:b/>
+                <w:color w:val="FFFFFF"/>
+                <w:sz w:val="17"/>
+              </w:rPr>
+              <w:t>Mitigacion</w:t>
+            </w:r>
+          </w:p>
+        </w:tc>
+      </w:tr>
+      <w:tr>
+        <w:tc>
+          <w:tcPr>
+            <w:tcW w:type="dxa" w:w="2520"/>
+            <w:vAlign w:val="center"/>
+          </w:tcPr>
+          <w:p>
+            <w:r/>
+            <w:r>
+              <w:rPr>
+                <w:b w:val="0"/>
+                <w:sz w:val="17"/>
+              </w:rPr>
+              <w:t>Tipos incompatibles entre motores</w:t>
+            </w:r>
+          </w:p>
+        </w:tc>
+        <w:tc>
+          <w:tcPr>
+            <w:tcW w:type="dxa" w:w="2520"/>
+            <w:vAlign w:val="center"/>
+          </w:tcPr>
+          <w:p>
+            <w:r/>
+            <w:r>
+              <w:rPr>
+                <w:b w:val="0"/>
+                <w:sz w:val="17"/>
+              </w:rPr>
+              <w:t>Errores de insercion o truncamiento</w:t>
+            </w:r>
+          </w:p>
+        </w:tc>
+        <w:tc>
+          <w:tcPr>
+            <w:tcW w:type="dxa" w:w="2520"/>
+            <w:vAlign w:val="center"/>
+          </w:tcPr>
+          <w:p>
+            <w:r/>
+            <w:r>
+              <w:rPr>
+                <w:b w:val="0"/>
+                <w:sz w:val="17"/>
+              </w:rPr>
+              <w:t>Media</w:t>
+            </w:r>
+          </w:p>
+        </w:tc>
+        <w:tc>
+          <w:tcPr>
+            <w:tcW w:type="dxa" w:w="2520"/>
+            <w:vAlign w:val="center"/>
+          </w:tcPr>
+          <w:p>
+            <w:r/>
+            <w:r>
+              <w:rPr>
+                <w:b w:val="0"/>
+                <w:sz w:val="17"/>
+              </w:rPr>
+              <w:t>Mapeo de columnas, transformaciones y vista previa.</w:t>
+            </w:r>
+          </w:p>
+        </w:tc>
+      </w:tr>
+      <w:tr>
+        <w:tc>
+          <w:tcPr>
+            <w:tcW w:type="dxa" w:w="2520"/>
+            <w:vAlign w:val="center"/>
+          </w:tcPr>
+          <w:p>
+            <w:r/>
+            <w:r>
+              <w:rPr>
+                <w:b w:val="0"/>
+                <w:sz w:val="17"/>
+              </w:rPr>
+              <w:t>Archivo invalido o corrupto</w:t>
+            </w:r>
+          </w:p>
+        </w:tc>
+        <w:tc>
+          <w:tcPr>
+            <w:tcW w:type="dxa" w:w="2520"/>
+            <w:vAlign w:val="center"/>
+          </w:tcPr>
+          <w:p>
+            <w:r/>
+            <w:r>
+              <w:rPr>
+                <w:b w:val="0"/>
+                <w:sz w:val="17"/>
+              </w:rPr>
+              <w:t>Fallo de importacion</w:t>
+            </w:r>
+          </w:p>
+        </w:tc>
+        <w:tc>
+          <w:tcPr>
+            <w:tcW w:type="dxa" w:w="2520"/>
+            <w:vAlign w:val="center"/>
+          </w:tcPr>
+          <w:p>
+            <w:r/>
+            <w:r>
+              <w:rPr>
+                <w:b w:val="0"/>
+                <w:sz w:val="17"/>
+              </w:rPr>
+              <w:t>Media</w:t>
+            </w:r>
+          </w:p>
+        </w:tc>
+        <w:tc>
+          <w:tcPr>
+            <w:tcW w:type="dxa" w:w="2520"/>
+            <w:vAlign w:val="center"/>
+          </w:tcPr>
+          <w:p>
+            <w:r/>
+            <w:r>
+              <w:rPr>
+                <w:b w:val="0"/>
+                <w:sz w:val="17"/>
+              </w:rPr>
+              <w:t>Validacion de cabecera SQLite, extension, binario y contenido vacio.</w:t>
+            </w:r>
+          </w:p>
+        </w:tc>
+      </w:tr>
+      <w:tr>
+        <w:tc>
+          <w:tcPr>
+            <w:tcW w:type="dxa" w:w="2520"/>
+            <w:vAlign w:val="center"/>
+          </w:tcPr>
+          <w:p>
+            <w:r/>
+            <w:r>
+              <w:rPr>
+                <w:b w:val="0"/>
+                <w:sz w:val="17"/>
+              </w:rPr>
+              <w:t>.bak sin infraestructura SQL Server</w:t>
+            </w:r>
+          </w:p>
+        </w:tc>
+        <w:tc>
+          <w:tcPr>
+            <w:tcW w:type="dxa" w:w="2520"/>
+            <w:vAlign w:val="center"/>
+          </w:tcPr>
+          <w:p>
+            <w:r/>
+            <w:r>
+              <w:rPr>
+                <w:b w:val="0"/>
+                <w:sz w:val="17"/>
+              </w:rPr>
+              <w:t>No se restaura el respaldo</w:t>
+            </w:r>
+          </w:p>
+        </w:tc>
+        <w:tc>
+          <w:tcPr>
+            <w:tcW w:type="dxa" w:w="2520"/>
+            <w:vAlign w:val="center"/>
+          </w:tcPr>
+          <w:p>
+            <w:r/>
+            <w:r>
+              <w:rPr>
+                <w:b w:val="0"/>
+                <w:sz w:val="17"/>
+              </w:rPr>
+              <w:t>Alta</w:t>
+            </w:r>
+          </w:p>
+        </w:tc>
+        <w:tc>
+          <w:tcPr>
+            <w:tcW w:type="dxa" w:w="2520"/>
+            <w:vAlign w:val="center"/>
+          </w:tcPr>
+          <w:p>
+            <w:r/>
+            <w:r>
+              <w:rPr>
+                <w:b w:val="0"/>
+                <w:sz w:val="17"/>
+              </w:rPr>
+              <w:t>Variables SQLSERVER_RESTORE_* obligatorias y alternativa .sql.</w:t>
+            </w:r>
+          </w:p>
+        </w:tc>
+      </w:tr>
+      <w:tr>
+        <w:tc>
+          <w:tcPr>
+            <w:tcW w:type="dxa" w:w="2520"/>
+            <w:vAlign w:val="center"/>
+          </w:tcPr>
+          <w:p>
+            <w:r/>
+            <w:r>
+              <w:rPr>
+                <w:b w:val="0"/>
+                <w:sz w:val="17"/>
+              </w:rPr>
+              <w:t>Credenciales expuestas</w:t>
+            </w:r>
+          </w:p>
+        </w:tc>
+        <w:tc>
+          <w:tcPr>
+            <w:tcW w:type="dxa" w:w="2520"/>
+            <w:vAlign w:val="center"/>
+          </w:tcPr>
+          <w:p>
+            <w:r/>
+            <w:r>
+              <w:rPr>
+                <w:b w:val="0"/>
+                <w:sz w:val="17"/>
+              </w:rPr>
+              <w:t>Riesgo de seguridad</w:t>
+            </w:r>
+          </w:p>
+        </w:tc>
+        <w:tc>
+          <w:tcPr>
+            <w:tcW w:type="dxa" w:w="2520"/>
+            <w:vAlign w:val="center"/>
+          </w:tcPr>
+          <w:p>
+            <w:r/>
+            <w:r>
+              <w:rPr>
+                <w:b w:val="0"/>
+                <w:sz w:val="17"/>
+              </w:rPr>
+              <w:t>Baja</w:t>
+            </w:r>
+          </w:p>
+        </w:tc>
+        <w:tc>
+          <w:tcPr>
+            <w:tcW w:type="dxa" w:w="2520"/>
+            <w:vAlign w:val="center"/>
+          </w:tcPr>
+          <w:p>
+            <w:r/>
+            <w:r>
+              <w:rPr>
+                <w:b w:val="0"/>
+                <w:sz w:val="17"/>
+              </w:rPr>
+              <w:t>Cifrado, no retorno de contrasenas y .env ignorado.</w:t>
+            </w:r>
+          </w:p>
+        </w:tc>
+      </w:tr>
+      <w:tr>
+        <w:tc>
+          <w:tcPr>
+            <w:tcW w:type="dxa" w:w="2520"/>
+            <w:vAlign w:val="center"/>
+          </w:tcPr>
+          <w:p>
+            <w:r/>
+            <w:r>
+              <w:rPr>
+                <w:b w:val="0"/>
+                <w:sz w:val="17"/>
+              </w:rPr>
+              <w:t>Disco temporal en Render</w:t>
+            </w:r>
+          </w:p>
+        </w:tc>
+        <w:tc>
+          <w:tcPr>
+            <w:tcW w:type="dxa" w:w="2520"/>
+            <w:vAlign w:val="center"/>
+          </w:tcPr>
+          <w:p>
+            <w:r/>
+            <w:r>
+              <w:rPr>
+                <w:b w:val="0"/>
+                <w:sz w:val="17"/>
+              </w:rPr>
+              <w:t>Perdida de archivos</w:t>
+            </w:r>
+          </w:p>
+        </w:tc>
+        <w:tc>
+          <w:tcPr>
+            <w:tcW w:type="dxa" w:w="2520"/>
+            <w:vAlign w:val="center"/>
+          </w:tcPr>
+          <w:p>
+            <w:r/>
+            <w:r>
+              <w:rPr>
+                <w:b w:val="0"/>
+                <w:sz w:val="17"/>
+              </w:rPr>
+              <w:t>Media</w:t>
+            </w:r>
+          </w:p>
+        </w:tc>
+        <w:tc>
+          <w:tcPr>
+            <w:tcW w:type="dxa" w:w="2520"/>
+            <w:vAlign w:val="center"/>
+          </w:tcPr>
+          <w:p>
+            <w:r/>
+            <w:r>
+              <w:rPr>
+                <w:b w:val="0"/>
+                <w:sz w:val="17"/>
+              </w:rPr>
+              <w:t>Catalogos comprimidos en PostgreSQL/Supabase en produccion.</w:t>
+            </w:r>
+          </w:p>
+        </w:tc>
+      </w:tr>
+    </w:tbl>
+    <w:p/>
+    <w:p>
+      <w:pPr>
+        <w:pStyle w:val="Heading1"/>
+      </w:pPr>
+      <w:r>
+        <w:rPr>
+          <w:rFonts w:ascii="Arial" w:hAnsi="Arial"/>
+          <w:sz w:val="20"/>
+        </w:rPr>
+        <w:t>8. Conclusion</w:t>
+      </w:r>
+    </w:p>
+    <w:p>
+      <w:r>
+        <w:rPr>
+          <w:rFonts w:ascii="Arial" w:hAnsi="Arial"/>
+          <w:sz w:val="20"/>
+        </w:rPr>
+        <w:t>El proyecto es factible tecnica, economica y operativamente para un entorno academico y de demostracion. La mayor restriccion corresponde a respaldos SQL Server .bak, que necesitan infraestructura externa; sin embargo, el sistema ofrece alternativa mediante scripts SQL y formatos de archivo ampliamente usados.</w:t>
+      </w:r>
+    </w:p>
+    <w:p>
+      <w:pPr>
+        <w:pStyle w:val="Heading1"/>
+      </w:pPr>
+      <w:r>
+        <w:t>Anexo de diagramas visuales</w:t>
+      </w:r>
+    </w:p>
+    <w:p>
+      <w:r>
         <w:drawing>
           <wp:inline xmlns:a="http://schemas.openxmlformats.org/drawingml/2006/main" xmlns:pic="http://schemas.openxmlformats.org/drawingml/2006/picture">
-            <wp:extent cx="914400" cy="1167319"/>
+            <wp:extent cx="6126480" cy="3471672"/>
             <wp:docPr id="1" name="Picture 1"/>
             <wp:cNvGraphicFramePr>
               <a:graphicFrameLocks noChangeAspect="1"/>
@@ -18,7 +2533,7 @@
               <a:graphicData uri="http://schemas.openxmlformats.org/drawingml/2006/picture">
                 <pic:pic>
                   <pic:nvPicPr>
-                    <pic:cNvPr id="0" name="logo-upt.png"/>
+                    <pic:cNvPr id="0" name="image.png"/>
                     <pic:cNvPicPr/>
                   </pic:nvPicPr>
                   <pic:blipFill>
@@ -30,7 +2545,7 @@
                   <pic:spPr>
                     <a:xfrm>
                       <a:off x="0" y="0"/>
-                      <a:ext cx="914400" cy="1167319"/>
+                      <a:ext cx="6126480" cy="3471672"/>
                     </a:xfrm>
                     <a:prstGeom prst="rect"/>
                   </pic:spPr>
@@ -41,1327 +2556,14 @@
         </w:drawing>
       </w:r>
     </w:p>
-    <w:p>
-      <w:pPr>
-        <w:jc w:val="center"/>
-      </w:pPr>
-      <w:r>
-        <w:rPr>
-          <w:b/>
-          <w:sz w:val="26"/>
-        </w:rPr>
-        <w:t>UNIVERSIDAD PRIVADA DE TACNA</w:t>
-      </w:r>
-    </w:p>
-    <w:p>
-      <w:pPr>
-        <w:jc w:val="center"/>
-      </w:pPr>
-      <w:r>
-        <w:rPr>
-          <w:b/>
-          <w:sz w:val="24"/>
-        </w:rPr>
-        <w:t>FACULTAD DE INGENIERIA</w:t>
-      </w:r>
-    </w:p>
-    <w:p>
-      <w:pPr>
-        <w:jc w:val="center"/>
-      </w:pPr>
-      <w:r>
-        <w:rPr>
-          <w:b/>
-          <w:sz w:val="22"/>
-        </w:rPr>
-        <w:t>Escuela Profesional de Ingenieria de Sistemas</w:t>
-      </w:r>
-    </w:p>
-    <w:p/>
-    <w:p>
-      <w:pPr>
-        <w:jc w:val="center"/>
-      </w:pPr>
-      <w:r>
-        <w:rPr>
-          <w:b/>
-          <w:color w:val="1F4E79"/>
-          <w:sz w:val="34"/>
-        </w:rPr>
-        <w:t>Proyecto Drop Nexus - Replicador de Datos entre Bases de Datos</w:t>
-      </w:r>
-    </w:p>
-    <w:p>
-      <w:pPr>
-        <w:jc w:val="center"/>
-      </w:pPr>
-      <w:r>
-        <w:rPr>
-          <w:b/>
-          <w:sz w:val="28"/>
-        </w:rPr>
-        <w:t>Informe de Factibilidad</w:t>
-      </w:r>
-    </w:p>
-    <w:p>
-      <w:pPr>
-        <w:jc w:val="center"/>
-      </w:pPr>
-      <w:r>
-        <w:rPr>
-          <w:b/>
-        </w:rPr>
-        <w:t xml:space="preserve">Curso: </w:t>
-      </w:r>
-      <w:r>
-        <w:t>SI783 - Proyecto de Sistemas</w:t>
-      </w:r>
-    </w:p>
-    <w:p>
-      <w:pPr>
-        <w:jc w:val="center"/>
-      </w:pPr>
-      <w:r>
-        <w:rPr>
-          <w:b/>
-        </w:rPr>
-        <w:t xml:space="preserve">Docente: </w:t>
-      </w:r>
-      <w:r>
-        <w:t>Docente del curso</w:t>
-      </w:r>
-    </w:p>
-    <w:p>
-      <w:pPr>
-        <w:jc w:val="center"/>
-      </w:pPr>
-      <w:r>
-        <w:rPr>
-          <w:b/>
-        </w:rPr>
-        <w:t xml:space="preserve">Integrantes: </w:t>
-      </w:r>
-      <w:r>
-        <w:t>Equipo del proyecto</w:t>
-      </w:r>
-    </w:p>
-    <w:p>
-      <w:pPr>
-        <w:jc w:val="center"/>
-      </w:pPr>
-      <w:r>
-        <w:rPr>
-          <w:b/>
-        </w:rPr>
-        <w:t xml:space="preserve">Tacna - Peru </w:t>
-      </w:r>
-      <w:r>
-        <w:t>2026</w:t>
-      </w:r>
-    </w:p>
-    <w:p>
-      <w:r>
-        <w:br w:type="page"/>
-      </w:r>
-    </w:p>
-    <w:p>
-      <w:pPr>
-        <w:jc w:val="center"/>
-      </w:pPr>
-      <w:r>
-        <w:rPr>
-          <w:b/>
-        </w:rPr>
-        <w:t>Sistema Drop Nexus</w:t>
-      </w:r>
-    </w:p>
-    <w:p>
-      <w:pPr>
-        <w:jc w:val="center"/>
-      </w:pPr>
-      <w:r>
-        <w:rPr>
-          <w:b/>
-        </w:rPr>
-        <w:t>Informe de Factibilidad</w:t>
-      </w:r>
-    </w:p>
-    <w:p>
-      <w:pPr>
-        <w:jc w:val="center"/>
-      </w:pPr>
-      <w:r>
-        <w:rPr>
-          <w:b/>
-        </w:rPr>
-        <w:t>Version 1.0</w:t>
-      </w:r>
-    </w:p>
-    <w:p>
-      <w:pPr>
-        <w:pStyle w:val="Heading1"/>
-      </w:pPr>
-      <w:r>
-        <w:t>CONTROL DE VERSIONES</w:t>
-      </w:r>
-    </w:p>
-    <w:tbl>
-      <w:tblPr>
-        <w:tblStyle w:val="TableGrid"/>
-        <w:tblW w:type="auto" w:w="0"/>
-        <w:jc w:val="center"/>
-        <w:tblLayout w:type="fixed"/>
-        <w:tblLook w:firstColumn="1" w:firstRow="1" w:lastColumn="0" w:lastRow="0" w:noHBand="0" w:noVBand="1" w:val="04A0"/>
-      </w:tblPr>
-      <w:tblGrid>
-        <w:gridCol w:w="1632"/>
-        <w:gridCol w:w="1632"/>
-        <w:gridCol w:w="1632"/>
-        <w:gridCol w:w="1632"/>
-        <w:gridCol w:w="1632"/>
-        <w:gridCol w:w="1632"/>
-      </w:tblGrid>
-      <w:tr>
-        <w:tc>
-          <w:tcPr>
-            <w:tcW w:type="dxa" w:w="1080"/>
-            <w:shd w:fill="E8EEF5"/>
-            <w:vAlign w:val="center"/>
-          </w:tcPr>
-          <w:p>
-            <w:pPr>
-              <w:spacing w:after="40"/>
-            </w:pPr>
-            <w:r>
-              <w:rPr>
-                <w:b/>
-              </w:rPr>
-              <w:t>Version</w:t>
-            </w:r>
-          </w:p>
-        </w:tc>
-        <w:tc>
-          <w:tcPr>
-            <w:tcW w:type="dxa" w:w="1800"/>
-            <w:shd w:fill="E8EEF5"/>
-            <w:vAlign w:val="center"/>
-          </w:tcPr>
-          <w:p>
-            <w:pPr>
-              <w:spacing w:after="40"/>
-            </w:pPr>
-            <w:r>
-              <w:rPr>
-                <w:b/>
-              </w:rPr>
-              <w:t>Hecha por</w:t>
-            </w:r>
-          </w:p>
-        </w:tc>
-        <w:tc>
-          <w:tcPr>
-            <w:tcW w:type="dxa" w:w="1800"/>
-            <w:shd w:fill="E8EEF5"/>
-            <w:vAlign w:val="center"/>
-          </w:tcPr>
-          <w:p>
-            <w:pPr>
-              <w:spacing w:after="40"/>
-            </w:pPr>
-            <w:r>
-              <w:rPr>
-                <w:b/>
-              </w:rPr>
-              <w:t>Revisada por</w:t>
-            </w:r>
-          </w:p>
-        </w:tc>
-        <w:tc>
-          <w:tcPr>
-            <w:tcW w:type="dxa" w:w="1800"/>
-            <w:shd w:fill="E8EEF5"/>
-            <w:vAlign w:val="center"/>
-          </w:tcPr>
-          <w:p>
-            <w:pPr>
-              <w:spacing w:after="40"/>
-            </w:pPr>
-            <w:r>
-              <w:rPr>
-                <w:b/>
-              </w:rPr>
-              <w:t>Aprobada por</w:t>
-            </w:r>
-          </w:p>
-        </w:tc>
-        <w:tc>
-          <w:tcPr>
-            <w:tcW w:type="dxa" w:w="1296"/>
-            <w:shd w:fill="E8EEF5"/>
-            <w:vAlign w:val="center"/>
-          </w:tcPr>
-          <w:p>
-            <w:pPr>
-              <w:spacing w:after="40"/>
-            </w:pPr>
-            <w:r>
-              <w:rPr>
-                <w:b/>
-              </w:rPr>
-              <w:t>Fecha</w:t>
-            </w:r>
-          </w:p>
-        </w:tc>
-        <w:tc>
-          <w:tcPr>
-            <w:tcW w:type="dxa" w:w="2951"/>
-            <w:shd w:fill="E8EEF5"/>
-            <w:vAlign w:val="center"/>
-          </w:tcPr>
-          <w:p>
-            <w:pPr>
-              <w:spacing w:after="40"/>
-            </w:pPr>
-            <w:r>
-              <w:rPr>
-                <w:b/>
-              </w:rPr>
-              <w:t>Motivo</w:t>
-            </w:r>
-          </w:p>
-        </w:tc>
-      </w:tr>
-      <w:tr>
-        <w:tc>
-          <w:tcPr>
-            <w:tcW w:type="dxa" w:w="1080"/>
-            <w:vAlign w:val="center"/>
-          </w:tcPr>
-          <w:p>
-            <w:pPr>
-              <w:spacing w:after="40"/>
-            </w:pPr>
-            <w:r>
-              <w:t>1.0</w:t>
-            </w:r>
-          </w:p>
-        </w:tc>
-        <w:tc>
-          <w:tcPr>
-            <w:tcW w:type="dxa" w:w="1800"/>
-            <w:vAlign w:val="center"/>
-          </w:tcPr>
-          <w:p>
-            <w:pPr>
-              <w:spacing w:after="40"/>
-            </w:pPr>
-            <w:r>
-              <w:t>Equipo del proyecto</w:t>
-            </w:r>
-          </w:p>
-        </w:tc>
-        <w:tc>
-          <w:tcPr>
-            <w:tcW w:type="dxa" w:w="1800"/>
-            <w:vAlign w:val="center"/>
-          </w:tcPr>
-          <w:p>
-            <w:pPr>
-              <w:spacing w:after="40"/>
-            </w:pPr>
-            <w:r>
-              <w:t>Pendiente</w:t>
-            </w:r>
-          </w:p>
-        </w:tc>
-        <w:tc>
-          <w:tcPr>
-            <w:tcW w:type="dxa" w:w="1800"/>
-            <w:vAlign w:val="center"/>
-          </w:tcPr>
-          <w:p>
-            <w:pPr>
-              <w:spacing w:after="40"/>
-            </w:pPr>
-            <w:r>
-              <w:t>Pendiente</w:t>
-            </w:r>
-          </w:p>
-        </w:tc>
-        <w:tc>
-          <w:tcPr>
-            <w:tcW w:type="dxa" w:w="1296"/>
-            <w:vAlign w:val="center"/>
-          </w:tcPr>
-          <w:p>
-            <w:pPr>
-              <w:spacing w:after="40"/>
-            </w:pPr>
-            <w:r>
-              <w:t>04/07/2026</w:t>
-            </w:r>
-          </w:p>
-        </w:tc>
-        <w:tc>
-          <w:tcPr>
-            <w:tcW w:type="dxa" w:w="2951"/>
-            <w:vAlign w:val="center"/>
-          </w:tcPr>
-          <w:p>
-            <w:pPr>
-              <w:spacing w:after="40"/>
-            </w:pPr>
-            <w:r>
-              <w:t>Adaptacion al sistema implementado</w:t>
-            </w:r>
-          </w:p>
-        </w:tc>
-      </w:tr>
-    </w:tbl>
-    <w:p>
-      <w:r>
-        <w:br w:type="page"/>
-      </w:r>
-    </w:p>
-    <w:p>
-      <w:pPr>
-        <w:pStyle w:val="Heading1"/>
-      </w:pPr>
-      <w:r>
-        <w:t>INDICE GENERAL</w:t>
-      </w:r>
-    </w:p>
-    <w:p>
-      <w:r>
-        <w:t>1. Descripcion del Proyecto</w:t>
-      </w:r>
-    </w:p>
-    <w:p>
-      <w:r>
-        <w:t>2. Riesgos</w:t>
-      </w:r>
-    </w:p>
-    <w:p>
-      <w:r>
-        <w:t>3. Analisis de la Situacion actual</w:t>
-      </w:r>
-    </w:p>
-    <w:p>
-      <w:r>
-        <w:t>4. Estudio de Factibilidad</w:t>
-      </w:r>
-    </w:p>
-    <w:p>
-      <w:r>
-        <w:t>5. Analisis Financiero</w:t>
-      </w:r>
-    </w:p>
-    <w:p>
-      <w:r>
-        <w:t>6. Conclusiones</w:t>
-      </w:r>
-    </w:p>
-    <w:p>
-      <w:r>
-        <w:br w:type="page"/>
-      </w:r>
-    </w:p>
-    <w:p>
-      <w:pPr>
-        <w:pStyle w:val="Heading1"/>
-      </w:pPr>
-      <w:r>
-        <w:t>Informe de Factibilidad</w:t>
-      </w:r>
-    </w:p>
-    <w:p>
-      <w:pPr>
-        <w:pStyle w:val="Heading1"/>
-      </w:pPr>
-      <w:r>
-        <w:t>1. Descripcion del Proyecto</w:t>
-      </w:r>
-    </w:p>
-    <w:p>
-      <w:pPr>
-        <w:pStyle w:val="Heading2"/>
-      </w:pPr>
-      <w:r>
-        <w:t>1.1 Nombre del proyecto</w:t>
-      </w:r>
-    </w:p>
-    <w:p>
-      <w:r>
-        <w:t>Drop Nexus - Replicador de Datos entre Bases de Datos</w:t>
-      </w:r>
-    </w:p>
-    <w:p>
-      <w:pPr>
-        <w:pStyle w:val="Heading2"/>
-      </w:pPr>
-      <w:r>
-        <w:t>1.2 Duracion del proyecto</w:t>
-      </w:r>
-    </w:p>
-    <w:p>
-      <w:r>
-        <w:t>Ocho semanas academicas para ajuste documental, pruebas, despliegue local y preparacion de exposicion.</w:t>
-      </w:r>
-    </w:p>
-    <w:p>
-      <w:pPr>
-        <w:pStyle w:val="Heading2"/>
-      </w:pPr>
-      <w:r>
-        <w:t>1.3 Descripcion</w:t>
-      </w:r>
-    </w:p>
-    <w:p>
-      <w:r>
-        <w:t>Drop Nexus es una aplicacion web que permite importar, configurar, replicar y descargar datos entre bases de datos heterogeneas. La app soporta motores relacionales, MongoDB y archivos SQLite, SQL, Excel/CSV y respaldos SQL Server .bak con restauracion configurada.</w:t>
-      </w:r>
-    </w:p>
-    <w:p>
-      <w:pPr>
-        <w:pStyle w:val="Heading2"/>
-      </w:pPr>
-      <w:r>
-        <w:t>1.4 Objetivos</w:t>
-      </w:r>
-    </w:p>
-    <w:p>
-      <w:pPr>
-        <w:pStyle w:val="Heading3"/>
-      </w:pPr>
-      <w:r>
-        <w:t>1.4.1 Objetivo general</w:t>
-      </w:r>
-    </w:p>
-    <w:p>
-      <w:r>
-        <w:t>Desarrollar un replicador web que reduzca el trabajo manual de migracion y permita entregar una base modificada descargable.</w:t>
-      </w:r>
-    </w:p>
-    <w:p>
-      <w:pPr>
-        <w:pStyle w:val="Heading3"/>
-      </w:pPr>
-      <w:r>
-        <w:t>1.4.2 Objetivos Especificos</w:t>
-      </w:r>
-    </w:p>
-    <w:p>
-      <w:pPr>
-        <w:pStyle w:val="ListBullet"/>
-      </w:pPr>
-      <w:r>
-        <w:t>Importar archivos SQLite, SQL, MongoDB JSON/NDJSON, Excel/CSV y SQL Server .bak configurado.</w:t>
-      </w:r>
-    </w:p>
-    <w:p>
-      <w:pPr>
-        <w:pStyle w:val="ListBullet"/>
-      </w:pPr>
-      <w:r>
-        <w:t>Configurar origen y destino, seleccionar tablas, mapear columnas y ejecutar replicas.</w:t>
-      </w:r>
-    </w:p>
-    <w:p>
-      <w:pPr>
-        <w:pStyle w:val="ListBullet"/>
-      </w:pPr>
-      <w:r>
-        <w:t>Registrar historial, progreso, errores y reintentos.</w:t>
-      </w:r>
-    </w:p>
-    <w:p>
-      <w:pPr>
-        <w:pStyle w:val="ListBullet"/>
-      </w:pPr>
-      <w:r>
-        <w:t>Descargar la base modificada en JSON, Excel .xlsx o SQLite.</w:t>
-      </w:r>
-    </w:p>
-    <w:p>
-      <w:pPr>
-        <w:pStyle w:val="Heading1"/>
-      </w:pPr>
-      <w:r>
-        <w:t>2. Riesgos</w:t>
-      </w:r>
-    </w:p>
-    <w:tbl>
-      <w:tblPr>
-        <w:tblStyle w:val="TableGrid"/>
-        <w:tblW w:type="auto" w:w="0"/>
-        <w:jc w:val="center"/>
-        <w:tblLayout w:type="fixed"/>
-        <w:tblLook w:firstColumn="1" w:firstRow="1" w:lastColumn="0" w:lastRow="0" w:noHBand="0" w:noVBand="1" w:val="04A0"/>
-      </w:tblPr>
-      <w:tblGrid>
-        <w:gridCol w:w="3264"/>
-        <w:gridCol w:w="3264"/>
-        <w:gridCol w:w="3264"/>
-      </w:tblGrid>
-      <w:tr>
-        <w:tc>
-          <w:tcPr>
-            <w:tcW w:type="dxa" w:w="2880"/>
-            <w:shd w:fill="E8EEF5"/>
-            <w:vAlign w:val="center"/>
-          </w:tcPr>
-          <w:p>
-            <w:pPr>
-              <w:spacing w:after="40"/>
-            </w:pPr>
-            <w:r>
-              <w:rPr>
-                <w:b/>
-              </w:rPr>
-              <w:t>Riesgo</w:t>
-            </w:r>
-          </w:p>
-        </w:tc>
-        <w:tc>
-          <w:tcPr>
-            <w:tcW w:type="dxa" w:w="2880"/>
-            <w:shd w:fill="E8EEF5"/>
-            <w:vAlign w:val="center"/>
-          </w:tcPr>
-          <w:p>
-            <w:pPr>
-              <w:spacing w:after="40"/>
-            </w:pPr>
-            <w:r>
-              <w:rPr>
-                <w:b/>
-              </w:rPr>
-              <w:t>Impacto</w:t>
-            </w:r>
-          </w:p>
-        </w:tc>
-        <w:tc>
-          <w:tcPr>
-            <w:tcW w:type="dxa" w:w="3600"/>
-            <w:shd w:fill="E8EEF5"/>
-            <w:vAlign w:val="center"/>
-          </w:tcPr>
-          <w:p>
-            <w:pPr>
-              <w:spacing w:after="40"/>
-            </w:pPr>
-            <w:r>
-              <w:rPr>
-                <w:b/>
-              </w:rPr>
-              <w:t>Mitigacion</w:t>
-            </w:r>
-          </w:p>
-        </w:tc>
-      </w:tr>
-      <w:tr>
-        <w:tc>
-          <w:tcPr>
-            <w:tcW w:type="dxa" w:w="2880"/>
-            <w:vAlign w:val="center"/>
-          </w:tcPr>
-          <w:p>
-            <w:pPr>
-              <w:spacing w:after="40"/>
-            </w:pPr>
-            <w:r>
-              <w:t>Tipos incompatibles</w:t>
-            </w:r>
-          </w:p>
-        </w:tc>
-        <w:tc>
-          <w:tcPr>
-            <w:tcW w:type="dxa" w:w="2880"/>
-            <w:vAlign w:val="center"/>
-          </w:tcPr>
-          <w:p>
-            <w:pPr>
-              <w:spacing w:after="40"/>
-            </w:pPr>
-            <w:r>
-              <w:t>Errores de insercion o perdida de precision</w:t>
-            </w:r>
-          </w:p>
-        </w:tc>
-        <w:tc>
-          <w:tcPr>
-            <w:tcW w:type="dxa" w:w="3600"/>
-            <w:vAlign w:val="center"/>
-          </w:tcPr>
-          <w:p>
-            <w:pPr>
-              <w:spacing w:after="40"/>
-            </w:pPr>
-            <w:r>
-              <w:t>Mapeo por motor y validacion previa.</w:t>
-            </w:r>
-          </w:p>
-        </w:tc>
-      </w:tr>
-      <w:tr>
-        <w:tc>
-          <w:tcPr>
-            <w:tcW w:type="dxa" w:w="2880"/>
-            <w:vAlign w:val="center"/>
-          </w:tcPr>
-          <w:p>
-            <w:pPr>
-              <w:spacing w:after="40"/>
-            </w:pPr>
-            <w:r>
-              <w:t>Archivo invalido</w:t>
-            </w:r>
-          </w:p>
-        </w:tc>
-        <w:tc>
-          <w:tcPr>
-            <w:tcW w:type="dxa" w:w="2880"/>
-            <w:vAlign w:val="center"/>
-          </w:tcPr>
-          <w:p>
-            <w:pPr>
-              <w:spacing w:after="40"/>
-            </w:pPr>
-            <w:r>
-              <w:t>Fallo de importacion</w:t>
-            </w:r>
-          </w:p>
-        </w:tc>
-        <w:tc>
-          <w:tcPr>
-            <w:tcW w:type="dxa" w:w="3600"/>
-            <w:vAlign w:val="center"/>
-          </w:tcPr>
-          <w:p>
-            <w:pPr>
-              <w:spacing w:after="40"/>
-            </w:pPr>
-            <w:r>
-              <w:t>Validacion de extension, tamano, cabecera SQLite y contenido binario.</w:t>
-            </w:r>
-          </w:p>
-        </w:tc>
-      </w:tr>
-      <w:tr>
-        <w:tc>
-          <w:tcPr>
-            <w:tcW w:type="dxa" w:w="2880"/>
-            <w:vAlign w:val="center"/>
-          </w:tcPr>
-          <w:p>
-            <w:pPr>
-              <w:spacing w:after="40"/>
-            </w:pPr>
-            <w:r>
-              <w:t>.bak sin SQL Server</w:t>
-            </w:r>
-          </w:p>
-        </w:tc>
-        <w:tc>
-          <w:tcPr>
-            <w:tcW w:type="dxa" w:w="2880"/>
-            <w:vAlign w:val="center"/>
-          </w:tcPr>
-          <w:p>
-            <w:pPr>
-              <w:spacing w:after="40"/>
-            </w:pPr>
-            <w:r>
-              <w:t>No se restaura el respaldo</w:t>
-            </w:r>
-          </w:p>
-        </w:tc>
-        <w:tc>
-          <w:tcPr>
-            <w:tcW w:type="dxa" w:w="3600"/>
-            <w:vAlign w:val="center"/>
-          </w:tcPr>
-          <w:p>
-            <w:pPr>
-              <w:spacing w:after="40"/>
-            </w:pPr>
-            <w:r>
-              <w:t>Variables SQLSERVER_RESTORE_* obligatorias y error claro.</w:t>
-            </w:r>
-          </w:p>
-        </w:tc>
-      </w:tr>
-      <w:tr>
-        <w:tc>
-          <w:tcPr>
-            <w:tcW w:type="dxa" w:w="2880"/>
-            <w:vAlign w:val="center"/>
-          </w:tcPr>
-          <w:p>
-            <w:pPr>
-              <w:spacing w:after="40"/>
-            </w:pPr>
-            <w:r>
-              <w:t>Credenciales expuestas</w:t>
-            </w:r>
-          </w:p>
-        </w:tc>
-        <w:tc>
-          <w:tcPr>
-            <w:tcW w:type="dxa" w:w="2880"/>
-            <w:vAlign w:val="center"/>
-          </w:tcPr>
-          <w:p>
-            <w:pPr>
-              <w:spacing w:after="40"/>
-            </w:pPr>
-            <w:r>
-              <w:t>Riesgo de seguridad</w:t>
-            </w:r>
-          </w:p>
-        </w:tc>
-        <w:tc>
-          <w:tcPr>
-            <w:tcW w:type="dxa" w:w="3600"/>
-            <w:vAlign w:val="center"/>
-          </w:tcPr>
-          <w:p>
-            <w:pPr>
-              <w:spacing w:after="40"/>
-            </w:pPr>
-            <w:r>
-              <w:t>Cifrado AES-256-GCM y exclusion de .env.</w:t>
-            </w:r>
-          </w:p>
-        </w:tc>
-      </w:tr>
-    </w:tbl>
-    <w:p>
-      <w:pPr>
-        <w:pStyle w:val="Heading1"/>
-      </w:pPr>
-      <w:r>
-        <w:t>3. Analisis de la Situacion actual</w:t>
-      </w:r>
-    </w:p>
-    <w:p>
-      <w:pPr>
-        <w:pStyle w:val="Heading2"/>
-      </w:pPr>
-      <w:r>
-        <w:t>3.1 Planteamiento del problema</w:t>
-      </w:r>
-    </w:p>
-    <w:p>
-      <w:r>
-        <w:t>La migracion entre motores suele realizarse con scripts aislados y exportaciones manuales. Esto dificulta validar errores, mapear columnas y entregar un resultado verificable.</w:t>
-      </w:r>
-    </w:p>
-    <w:p>
-      <w:pPr>
-        <w:pStyle w:val="Heading2"/>
-      </w:pPr>
-      <w:r>
-        <w:t>3.2 Consideraciones de hardware y software</w:t>
-      </w:r>
-    </w:p>
-    <w:p>
-      <w:pPr>
-        <w:pStyle w:val="ListBullet"/>
-      </w:pPr>
-      <w:r>
-        <w:t>Node.js 20, React, Fastify y TypeScript.</w:t>
-      </w:r>
-    </w:p>
-    <w:p>
-      <w:pPr>
-        <w:pStyle w:val="ListBullet"/>
-      </w:pPr>
-      <w:r>
-        <w:t>Supabase/PostgreSQL para metadatos y catalogos.</w:t>
-      </w:r>
-    </w:p>
-    <w:p>
-      <w:pPr>
-        <w:pStyle w:val="ListBullet"/>
-      </w:pPr>
-      <w:r>
-        <w:t>Render como plataforma de despliegue.</w:t>
-      </w:r>
-    </w:p>
-    <w:p>
-      <w:pPr>
-        <w:pStyle w:val="ListBullet"/>
-      </w:pPr>
-      <w:r>
-        <w:t>SQL Server externo solo para restauracion .bak.</w:t>
-      </w:r>
-    </w:p>
-    <w:p>
-      <w:pPr>
-        <w:pStyle w:val="Heading1"/>
-      </w:pPr>
-      <w:r>
-        <w:t>4. Estudio de Factibilidad</w:t>
-      </w:r>
-    </w:p>
-    <w:p>
-      <w:pPr>
-        <w:pStyle w:val="Heading2"/>
-      </w:pPr>
-      <w:r>
-        <w:t>4.1 Factibilidad Tecnica</w:t>
-      </w:r>
-    </w:p>
-    <w:p>
-      <w:r>
-        <w:t>Es tecnicamente viable porque la app ya cuenta con frontend, backend, adaptadores por motor, catalogos de archivo y render.yaml.</w:t>
-      </w:r>
-    </w:p>
-    <w:p>
-      <w:pPr>
-        <w:pStyle w:val="Heading2"/>
-      </w:pPr>
-      <w:r>
-        <w:t>4.2 Factibilidad economica</w:t>
-      </w:r>
-    </w:p>
-    <w:tbl>
-      <w:tblPr>
-        <w:tblStyle w:val="TableGrid"/>
-        <w:tblW w:type="auto" w:w="0"/>
-        <w:jc w:val="center"/>
-        <w:tblLayout w:type="fixed"/>
-        <w:tblLook w:firstColumn="1" w:firstRow="1" w:lastColumn="0" w:lastRow="0" w:noHBand="0" w:noVBand="1" w:val="04A0"/>
-      </w:tblPr>
-      <w:tblGrid>
-        <w:gridCol w:w="4896"/>
-        <w:gridCol w:w="4896"/>
-      </w:tblGrid>
-      <w:tr>
-        <w:tc>
-          <w:tcPr>
-            <w:tcW w:type="dxa" w:w="4608"/>
-            <w:shd w:fill="E8EEF5"/>
-            <w:vAlign w:val="center"/>
-          </w:tcPr>
-          <w:p>
-            <w:pPr>
-              <w:spacing w:after="40"/>
-            </w:pPr>
-            <w:r>
-              <w:rPr>
-                <w:b/>
-              </w:rPr>
-              <w:t>Concepto</w:t>
-            </w:r>
-          </w:p>
-        </w:tc>
-        <w:tc>
-          <w:tcPr>
-            <w:tcW w:type="dxa" w:w="4752"/>
-            <w:shd w:fill="E8EEF5"/>
-            <w:vAlign w:val="center"/>
-          </w:tcPr>
-          <w:p>
-            <w:pPr>
-              <w:spacing w:after="40"/>
-            </w:pPr>
-            <w:r>
-              <w:rPr>
-                <w:b/>
-              </w:rPr>
-              <w:t>Costo estimado</w:t>
-            </w:r>
-          </w:p>
-        </w:tc>
-      </w:tr>
-      <w:tr>
-        <w:tc>
-          <w:tcPr>
-            <w:tcW w:type="dxa" w:w="4608"/>
-            <w:vAlign w:val="center"/>
-          </w:tcPr>
-          <w:p>
-            <w:pPr>
-              <w:spacing w:after="40"/>
-            </w:pPr>
-            <w:r>
-              <w:t>Desarrollo academico</w:t>
-            </w:r>
-          </w:p>
-        </w:tc>
-        <w:tc>
-          <w:tcPr>
-            <w:tcW w:type="dxa" w:w="4752"/>
-            <w:vAlign w:val="center"/>
-          </w:tcPr>
-          <w:p>
-            <w:pPr>
-              <w:spacing w:after="40"/>
-            </w:pPr>
-            <w:r>
-              <w:t>S/ 0</w:t>
-            </w:r>
-          </w:p>
-        </w:tc>
-      </w:tr>
-      <w:tr>
-        <w:tc>
-          <w:tcPr>
-            <w:tcW w:type="dxa" w:w="4608"/>
-            <w:vAlign w:val="center"/>
-          </w:tcPr>
-          <w:p>
-            <w:pPr>
-              <w:spacing w:after="40"/>
-            </w:pPr>
-            <w:r>
-              <w:t>GitHub y herramientas</w:t>
-            </w:r>
-          </w:p>
-        </w:tc>
-        <w:tc>
-          <w:tcPr>
-            <w:tcW w:type="dxa" w:w="4752"/>
-            <w:vAlign w:val="center"/>
-          </w:tcPr>
-          <w:p>
-            <w:pPr>
-              <w:spacing w:after="40"/>
-            </w:pPr>
-            <w:r>
-              <w:t>S/ 0</w:t>
-            </w:r>
-          </w:p>
-        </w:tc>
-      </w:tr>
-      <w:tr>
-        <w:tc>
-          <w:tcPr>
-            <w:tcW w:type="dxa" w:w="4608"/>
-            <w:vAlign w:val="center"/>
-          </w:tcPr>
-          <w:p>
-            <w:pPr>
-              <w:spacing w:after="40"/>
-            </w:pPr>
-            <w:r>
-              <w:t>Render/Supabase</w:t>
-            </w:r>
-          </w:p>
-        </w:tc>
-        <w:tc>
-          <w:tcPr>
-            <w:tcW w:type="dxa" w:w="4752"/>
-            <w:vAlign w:val="center"/>
-          </w:tcPr>
-          <w:p>
-            <w:pPr>
-              <w:spacing w:after="40"/>
-            </w:pPr>
-            <w:r>
-              <w:t>Plan gratuito o bajo costo</w:t>
-            </w:r>
-          </w:p>
-        </w:tc>
-      </w:tr>
-      <w:tr>
-        <w:tc>
-          <w:tcPr>
-            <w:tcW w:type="dxa" w:w="4608"/>
-            <w:vAlign w:val="center"/>
-          </w:tcPr>
-          <w:p>
-            <w:pPr>
-              <w:spacing w:after="40"/>
-            </w:pPr>
-            <w:r>
-              <w:t>SQL Server temporal para .bak</w:t>
-            </w:r>
-          </w:p>
-        </w:tc>
-        <w:tc>
-          <w:tcPr>
-            <w:tcW w:type="dxa" w:w="4752"/>
-            <w:vAlign w:val="center"/>
-          </w:tcPr>
-          <w:p>
-            <w:pPr>
-              <w:spacing w:after="40"/>
-            </w:pPr>
-            <w:r>
-              <w:t>Variable</w:t>
-            </w:r>
-          </w:p>
-        </w:tc>
-      </w:tr>
-    </w:tbl>
-    <w:p>
-      <w:pPr>
-        <w:pStyle w:val="Heading3"/>
-      </w:pPr>
-      <w:r>
-        <w:t>4.2.1 Costos Generales</w:t>
-      </w:r>
-    </w:p>
-    <w:p>
-      <w:r>
-        <w:t>Uso de equipo personal, internet y herramientas gratuitas.</w:t>
-      </w:r>
-    </w:p>
-    <w:p>
-      <w:pPr>
-        <w:pStyle w:val="Heading3"/>
-      </w:pPr>
-      <w:r>
-        <w:t>4.2.2 Costos operativos durante el desarrollo</w:t>
-      </w:r>
-    </w:p>
-    <w:p>
-      <w:r>
-        <w:t>No se requiere oficina ni infraestructura fisica dedicada.</w:t>
-      </w:r>
-    </w:p>
-    <w:p>
-      <w:pPr>
-        <w:pStyle w:val="Heading3"/>
-      </w:pPr>
-      <w:r>
-        <w:t>4.2.3 Costos del ambiente</w:t>
-      </w:r>
-    </w:p>
-    <w:p>
-      <w:r>
-        <w:t>Ambiente local y despliegue en Render con Supabase.</w:t>
-      </w:r>
-    </w:p>
-    <w:p>
-      <w:pPr>
-        <w:pStyle w:val="Heading3"/>
-      </w:pPr>
-      <w:r>
-        <w:t>4.2.4 Costos de personal</w:t>
-      </w:r>
-    </w:p>
-    <w:p>
-      <w:r>
-        <w:t>Equipo academico del curso.</w:t>
-      </w:r>
-    </w:p>
-    <w:p>
-      <w:pPr>
-        <w:pStyle w:val="Heading3"/>
-      </w:pPr>
-      <w:r>
-        <w:t>4.2.5 Costos totales del desarrollo del sistema</w:t>
-      </w:r>
-    </w:p>
-    <w:p>
-      <w:r>
-        <w:t>El costo principal es tiempo de desarrollo; los servicios pueden mantenerse en capa gratuita.</w:t>
-      </w:r>
-    </w:p>
-    <w:p>
-      <w:pPr>
-        <w:pStyle w:val="Heading2"/>
-      </w:pPr>
-      <w:r>
-        <w:t>4.3 Factibilidad Operativa</w:t>
-      </w:r>
-    </w:p>
-    <w:p>
-      <w:r>
-        <w:t>La aplicacion se opera desde navegador y guia la carga, configuracion, replica y descarga.</w:t>
-      </w:r>
-    </w:p>
-    <w:p>
-      <w:pPr>
-        <w:pStyle w:val="Heading2"/>
-      </w:pPr>
-      <w:r>
-        <w:t>4.4 Factibilidad Legal</w:t>
-      </w:r>
-    </w:p>
-    <w:p>
-      <w:r>
-        <w:t>El sistema debe usarse con datos autorizados; cifra credenciales y aísla catalogos por usuario.</w:t>
-      </w:r>
-    </w:p>
-    <w:p>
-      <w:pPr>
-        <w:pStyle w:val="Heading2"/>
-      </w:pPr>
-      <w:r>
-        <w:t>4.5 Factibilidad Social</w:t>
-      </w:r>
-    </w:p>
-    <w:p>
-      <w:r>
-        <w:t>Facilita el aprendizaje y reduce errores humanos en migraciones.</w:t>
-      </w:r>
-    </w:p>
-    <w:p>
-      <w:pPr>
-        <w:pStyle w:val="Heading2"/>
-      </w:pPr>
-      <w:r>
-        <w:t>4.6 Factibilidad Ambiental</w:t>
-      </w:r>
-    </w:p>
-    <w:p>
-      <w:r>
-        <w:t>No requiere infraestructura fisica adicional para el proyecto.</w:t>
-      </w:r>
-    </w:p>
-    <w:p>
-      <w:pPr>
-        <w:pStyle w:val="Heading1"/>
-      </w:pPr>
-      <w:r>
-        <w:t>5. Analisis Financiero</w:t>
-      </w:r>
-    </w:p>
-    <w:p>
-      <w:pPr>
-        <w:pStyle w:val="Heading2"/>
-      </w:pPr>
-      <w:r>
-        <w:t>5.1 Justificacion de la Inversion</w:t>
-      </w:r>
-    </w:p>
-    <w:p>
-      <w:r>
-        <w:t>El beneficio supera el costo por reutilizar tecnologias libres y reducir trabajo manual.</w:t>
-      </w:r>
-    </w:p>
-    <w:p>
-      <w:pPr>
-        <w:pStyle w:val="Heading3"/>
-      </w:pPr>
-      <w:r>
-        <w:t>5.1.1 Beneficios del Proyecto</w:t>
-      </w:r>
-    </w:p>
-    <w:p>
-      <w:pPr>
-        <w:pStyle w:val="ListBullet"/>
-      </w:pPr>
-      <w:r>
-        <w:t>Menos errores manuales.</w:t>
-      </w:r>
-    </w:p>
-    <w:p>
-      <w:pPr>
-        <w:pStyle w:val="ListBullet"/>
-      </w:pPr>
-      <w:r>
-        <w:t>Trazabilidad de replicas.</w:t>
-      </w:r>
-    </w:p>
-    <w:p>
-      <w:pPr>
-        <w:pStyle w:val="ListBullet"/>
-      </w:pPr>
-      <w:r>
-        <w:t>Descarga de resultados.</w:t>
-      </w:r>
-    </w:p>
-    <w:p>
-      <w:pPr>
-        <w:pStyle w:val="ListBullet"/>
-      </w:pPr>
-      <w:r>
-        <w:t>Demostracion academica clara.</w:t>
-      </w:r>
-    </w:p>
-    <w:p>
-      <w:pPr>
-        <w:pStyle w:val="Heading3"/>
-      </w:pPr>
-      <w:r>
-        <w:t>5.1.2 Criterios de Inversion</w:t>
-      </w:r>
-    </w:p>
-    <w:p>
-      <w:pPr>
-        <w:pStyle w:val="Heading3"/>
-      </w:pPr>
-      <w:r>
-        <w:t>5.1.2.1 Relacion Beneficio/Costo (B/C)</w:t>
-      </w:r>
-    </w:p>
-    <w:p>
-      <w:r>
-        <w:t>B/C favorable por bajo costo y alto valor educativo.</w:t>
-      </w:r>
-    </w:p>
-    <w:p>
-      <w:pPr>
-        <w:pStyle w:val="Heading3"/>
-      </w:pPr>
-      <w:r>
-        <w:t>5.1.2.2 Valor Actual Neto (VAN)</w:t>
-      </w:r>
-    </w:p>
-    <w:p>
-      <w:r>
-        <w:t>VAN academico positivo por uso de servicios gratuitos y reutilizacion futura.</w:t>
-      </w:r>
-    </w:p>
-    <w:p>
-      <w:pPr>
-        <w:pStyle w:val="Heading3"/>
-      </w:pPr>
-      <w:r>
-        <w:t>5.1.2.3 Tasa Interna de Retorno (TIR)</w:t>
-      </w:r>
-    </w:p>
-    <w:p>
-      <w:r>
-        <w:t>No aplica comercialmente; la rentabilidad se expresa en aprendizaje y funcionalidad entregada.</w:t>
-      </w:r>
-    </w:p>
-    <w:p>
-      <w:pPr>
-        <w:pStyle w:val="Heading1"/>
-      </w:pPr>
-      <w:r>
-        <w:t>6. Conclusiones</w:t>
-      </w:r>
-    </w:p>
-    <w:p>
-      <w:r>
-        <w:t>El proyecto es viable y cumple con la finalidad de replicar datos entre bases y descargar la base modificada.</w:t>
-      </w:r>
-    </w:p>
     <w:sectPr>
-      <w:footerReference w:type="default" r:id="rId10"/>
       <w:pgSz w:w="12240" w:h="15840"/>
-      <w:pgMar w:top="1152" w:right="1224" w:bottom="1152" w:left="1224" w:header="648" w:footer="648" w:gutter="0"/>
+      <w:pgMar w:top="1008" w:right="1080" w:bottom="1008" w:left="1080" w:header="720" w:footer="720" w:gutter="0"/>
       <w:cols w:space="720"/>
       <w:docGrid w:linePitch="360"/>
     </w:sectPr>
   </w:body>
 </w:document>
-</file>
-
-<file path=word/footer1.xml><?xml version="1.0" encoding="utf-8"?>
-<w:ftr xmlns:m="http://schemas.openxmlformats.org/officeDocument/2006/math" xmlns:mc="http://schemas.openxmlformats.org/markup-compatibility/2006" xmlns:mo="http://schemas.microsoft.com/office/mac/office/2008/main" xmlns:mv="urn:schemas-microsoft-com:mac:vml" xmlns:o="urn:schemas-microsoft-com:office:office" xmlns:r="http://schemas.openxmlformats.org/officeDocument/2006/relationships" xmlns:v="urn:schemas-microsoft-com:vml" xmlns:w10="urn:schemas-microsoft-com:office:word" xmlns:w14="http://schemas.microsoft.com/office/word/2010/wordml" xmlns:w="http://schemas.openxmlformats.org/wordprocessingml/2006/main" xmlns:wne="http://schemas.microsoft.com/office/word/2006/wordml" xmlns:wp14="http://schemas.microsoft.com/office/word/2010/wordprocessingDrawing" xmlns:wp="http://schemas.openxmlformats.org/drawingml/2006/wordprocessingDrawing" xmlns:wpc="http://schemas.microsoft.com/office/word/2010/wordprocessingCanvas" xmlns:wpg="http://schemas.microsoft.com/office/word/2010/wordprocessingGroup" xmlns:wpi="http://schemas.microsoft.com/office/word/2010/wordprocessingInk" xmlns:wps="http://schemas.microsoft.com/office/word/2010/wordprocessingShape" mc:Ignorable="w14 wp14">
-  <w:p>
-    <w:pPr>
-      <w:pStyle w:val="Footer"/>
-      <w:jc w:val="center"/>
-    </w:pPr>
-    <w:r>
-      <w:rPr>
-        <w:color w:val="595959"/>
-        <w:sz w:val="16"/>
-      </w:rPr>
-      <w:t>Drop Nexus | Informe de Factibilidad</w:t>
-    </w:r>
-  </w:p>
-</w:ftr>
 </file>
 
 <file path=word/numbering.xml><?xml version="1.0" encoding="utf-8"?>
@@ -1727,13 +2929,6 @@
     <w:name w:val="Normal"/>
     <w:qFormat/>
     <w:rsid w:val="00FC693F"/>
-    <w:pPr>
-      <w:spacing w:after="120" w:line="264" w:lineRule="auto"/>
-    </w:pPr>
-    <w:rPr>
-      <w:rFonts w:ascii="Calibri" w:hAnsi="Calibri"/>
-      <w:sz w:val="21"/>
-    </w:rPr>
   </w:style>
   <w:style w:type="paragraph" w:styleId="Header">
     <w:name w:val="header"/>
@@ -1790,15 +2985,15 @@
     <w:pPr>
       <w:keepNext/>
       <w:keepLines/>
-      <w:spacing w:before="280" w:after="160"/>
+      <w:spacing w:before="480" w:after="0"/>
       <w:outlineLvl w:val="0"/>
     </w:pPr>
     <w:rPr>
-      <w:rFonts w:asciiTheme="majorHAnsi" w:eastAsiaTheme="majorEastAsia" w:hAnsiTheme="majorHAnsi" w:cstheme="majorBidi" w:ascii="Calibri" w:hAnsi="Calibri"/>
+      <w:rFonts w:asciiTheme="majorHAnsi" w:eastAsiaTheme="majorEastAsia" w:hAnsiTheme="majorHAnsi" w:cstheme="majorBidi"/>
       <w:b/>
       <w:bCs/>
-      <w:color w:val="1F4E79"/>
-      <w:sz w:val="31"/>
+      <w:color w:val="365F91" w:themeColor="accent1" w:themeShade="BF"/>
+      <w:sz w:val="28"/>
       <w:szCs w:val="28"/>
     </w:rPr>
   </w:style>
@@ -1814,15 +3009,15 @@
     <w:pPr>
       <w:keepNext/>
       <w:keepLines/>
-      <w:spacing w:before="200" w:after="100"/>
+      <w:spacing w:before="200" w:after="0"/>
       <w:outlineLvl w:val="1"/>
     </w:pPr>
     <w:rPr>
-      <w:rFonts w:asciiTheme="majorHAnsi" w:eastAsiaTheme="majorEastAsia" w:hAnsiTheme="majorHAnsi" w:cstheme="majorBidi" w:ascii="Calibri" w:hAnsi="Calibri"/>
+      <w:rFonts w:asciiTheme="majorHAnsi" w:eastAsiaTheme="majorEastAsia" w:hAnsiTheme="majorHAnsi" w:cstheme="majorBidi"/>
       <w:b/>
       <w:bCs/>
-      <w:color w:val="2E74B5"/>
-      <w:sz w:val="25"/>
+      <w:color w:val="4F81BD" w:themeColor="accent1"/>
+      <w:sz w:val="26"/>
       <w:szCs w:val="26"/>
     </w:rPr>
   </w:style>
@@ -1838,15 +3033,14 @@
     <w:pPr>
       <w:keepNext/>
       <w:keepLines/>
-      <w:spacing w:before="160" w:after="80"/>
+      <w:spacing w:before="200" w:after="0"/>
       <w:outlineLvl w:val="2"/>
     </w:pPr>
     <w:rPr>
-      <w:rFonts w:asciiTheme="majorHAnsi" w:eastAsiaTheme="majorEastAsia" w:hAnsiTheme="majorHAnsi" w:cstheme="majorBidi" w:ascii="Calibri" w:hAnsi="Calibri"/>
+      <w:rFonts w:asciiTheme="majorHAnsi" w:eastAsiaTheme="majorEastAsia" w:hAnsiTheme="majorHAnsi" w:cstheme="majorBidi"/>
       <w:b/>
       <w:bCs/>
-      <w:color w:val="1F4D78"/>
-      <w:sz w:val="23"/>
+      <w:color w:val="4F81BD" w:themeColor="accent1"/>
     </w:rPr>
   </w:style>
   <w:style w:type="paragraph" w:styleId="Heading4">

</xml_diff>

<commit_message>
Expand FD documents for Drop Nexus
</commit_message>
<xml_diff>
--- a/FD01-EPIS-Informe de Factibilidad.docx
+++ b/FD01-EPIS-Informe de Factibilidad.docx
@@ -7,12 +7,38 @@
         <w:jc w:val="center"/>
       </w:pPr>
       <w:r>
-        <w:rPr>
-          <w:rFonts w:ascii="Arial" w:hAnsi="Arial"/>
-          <w:b/>
-          <w:sz w:val="28"/>
-        </w:rPr>
-        <w:t>UNIVERSIDAD PRIVADA DE TACNA</w:t>
+        <w:drawing>
+          <wp:inline xmlns:a="http://schemas.openxmlformats.org/drawingml/2006/main" xmlns:pic="http://schemas.openxmlformats.org/drawingml/2006/picture">
+            <wp:extent cx="960120" cy="1225685"/>
+            <wp:docPr id="1" name="Picture 1"/>
+            <wp:cNvGraphicFramePr>
+              <a:graphicFrameLocks noChangeAspect="1"/>
+            </wp:cNvGraphicFramePr>
+            <a:graphic>
+              <a:graphicData uri="http://schemas.openxmlformats.org/drawingml/2006/picture">
+                <pic:pic>
+                  <pic:nvPicPr>
+                    <pic:cNvPr id="0" name="logo-upt.png"/>
+                    <pic:cNvPicPr/>
+                  </pic:nvPicPr>
+                  <pic:blipFill>
+                    <a:blip r:embed="rId9"/>
+                    <a:stretch>
+                      <a:fillRect/>
+                    </a:stretch>
+                  </pic:blipFill>
+                  <pic:spPr>
+                    <a:xfrm>
+                      <a:off x="0" y="0"/>
+                      <a:ext cx="960120" cy="1225685"/>
+                    </a:xfrm>
+                    <a:prstGeom prst="rect"/>
+                  </pic:spPr>
+                </pic:pic>
+              </a:graphicData>
+            </a:graphic>
+          </wp:inline>
+        </w:drawing>
       </w:r>
     </w:p>
     <w:p>
@@ -21,11 +47,14 @@
       </w:pPr>
       <w:r>
         <w:rPr>
-          <w:rFonts w:ascii="Arial" w:hAnsi="Arial"/>
           <w:b/>
-          <w:sz w:val="28"/>
+          <w:sz w:val="24"/>
         </w:rPr>
-        <w:t>FACULTAD DE INGENIERIA</w:t>
+        <w:t>UNIVERSIDAD PRIVADA DE TACNA</w:t>
+        <w:br/>
+        <w:t>FACULTAD DE INGENIERÍA</w:t>
+        <w:br/>
+        <w:t>Escuela Profesional de Ingeniería de Sistemas</w:t>
       </w:r>
     </w:p>
     <w:p>
@@ -34,11 +63,10 @@
       </w:pPr>
       <w:r>
         <w:rPr>
-          <w:rFonts w:ascii="Arial" w:hAnsi="Arial"/>
-          <w:b w:val="0"/>
-          <w:sz w:val="28"/>
+          <w:b/>
+          <w:sz w:val="32"/>
         </w:rPr>
-        <w:t>Escuela Profesional de Ingenieria de Sistemas</w:t>
+        <w:t>FD01</w:t>
       </w:r>
     </w:p>
     <w:p>
@@ -47,11 +75,10 @@
       </w:pPr>
       <w:r>
         <w:rPr>
-          <w:rFonts w:ascii="Arial" w:hAnsi="Arial"/>
           <w:b/>
-          <w:sz w:val="28"/>
+          <w:sz w:val="36"/>
         </w:rPr>
-        <w:t>Drop Nexus - Replicador de Datos entre Bases de Datos</w:t>
+        <w:t>Informe de Factibilidad</w:t>
       </w:r>
     </w:p>
     <w:p>
@@ -60,11 +87,10 @@
       </w:pPr>
       <w:r>
         <w:rPr>
-          <w:rFonts w:ascii="Arial" w:hAnsi="Arial"/>
-          <w:b/>
-          <w:sz w:val="28"/>
+          <w:b w:val="0"/>
+          <w:sz w:val="22"/>
         </w:rPr>
-        <w:t>FD01 - Informe de Factibilidad</w:t>
+        <w:t>Evaluación técnica, económica, operativa, legal, social y ambiental</w:t>
       </w:r>
     </w:p>
     <w:p>
@@ -72,12 +98,7 @@
         <w:jc w:val="center"/>
       </w:pPr>
       <w:r>
-        <w:rPr>
-          <w:rFonts w:ascii="Arial" w:hAnsi="Arial"/>
-          <w:b w:val="0"/>
-          <w:sz w:val="22"/>
-        </w:rPr>
-        <w:t>Curso: SI783 - Proyecto de Sistemas</w:t>
+        <w:t>Proyecto: Drop Nexus - Replicador de Datos entre Bases de Datos</w:t>
       </w:r>
     </w:p>
     <w:p>
@@ -85,12 +106,7 @@
         <w:jc w:val="center"/>
       </w:pPr>
       <w:r>
-        <w:rPr>
-          <w:rFonts w:ascii="Arial" w:hAnsi="Arial"/>
-          <w:b w:val="0"/>
-          <w:sz w:val="22"/>
-        </w:rPr>
-        <w:t>Docente: Docente del curso</w:t>
+        <w:t>Equipo: CARBAJAL - LLANOS - YUPA - ZAPANA</w:t>
       </w:r>
     </w:p>
     <w:p>
@@ -98,12 +114,7 @@
         <w:jc w:val="center"/>
       </w:pPr>
       <w:r>
-        <w:rPr>
-          <w:rFonts w:ascii="Arial" w:hAnsi="Arial"/>
-          <w:b w:val="0"/>
-          <w:sz w:val="22"/>
-        </w:rPr>
-        <w:t>Integrantes: Equipo del proyecto</w:t>
+        <w:t>Versión: 2.0</w:t>
       </w:r>
     </w:p>
     <w:p>
@@ -111,59 +122,11 @@
         <w:jc w:val="center"/>
       </w:pPr>
       <w:r>
-        <w:rPr>
-          <w:rFonts w:ascii="Arial" w:hAnsi="Arial"/>
-          <w:b w:val="0"/>
-          <w:sz w:val="22"/>
-        </w:rPr>
-        <w:t>Version: 2.0</w:t>
-      </w:r>
-    </w:p>
-    <w:p>
-      <w:pPr>
-        <w:jc w:val="center"/>
-      </w:pPr>
-      <w:r>
-        <w:rPr>
-          <w:rFonts w:ascii="Arial" w:hAnsi="Arial"/>
-          <w:b w:val="0"/>
-          <w:sz w:val="22"/>
-        </w:rPr>
-        <w:t>Fecha: 04/07/2026</w:t>
-      </w:r>
-    </w:p>
-    <w:p>
-      <w:pPr>
-        <w:jc w:val="center"/>
-      </w:pPr>
-      <w:r>
-        <w:rPr>
-          <w:rFonts w:ascii="Arial" w:hAnsi="Arial"/>
-          <w:b w:val="0"/>
-          <w:sz w:val="22"/>
-        </w:rPr>
-        <w:t>Ubicacion del aplicativo: web/ del repositorio local</w:t>
-      </w:r>
-    </w:p>
-    <w:p>
-      <w:pPr>
-        <w:jc w:val="center"/>
-      </w:pPr>
-      <w:r>
-        <w:rPr>
-          <w:rFonts w:ascii="Arial" w:hAnsi="Arial"/>
-          <w:b w:val="0"/>
-          <w:sz w:val="22"/>
-        </w:rPr>
-        <w:t>Tacna - Peru 2026</w:t>
+        <w:t>Julio 2026</w:t>
       </w:r>
     </w:p>
     <w:p>
       <w:r>
-        <w:rPr>
-          <w:rFonts w:ascii="Arial" w:hAnsi="Arial"/>
-          <w:sz w:val="20"/>
-        </w:rPr>
         <w:br w:type="page"/>
       </w:r>
     </w:p>
@@ -172,1904 +135,7 @@
         <w:pStyle w:val="Heading1"/>
       </w:pPr>
       <w:r>
-        <w:rPr>
-          <w:rFonts w:ascii="Arial" w:hAnsi="Arial"/>
-          <w:sz w:val="20"/>
-        </w:rPr>
         <w:t>Control de versiones</w:t>
-      </w:r>
-    </w:p>
-    <w:tbl>
-      <w:tblPr>
-        <w:tblStyle w:val="TableGrid"/>
-        <w:tblW w:type="auto" w:w="0"/>
-        <w:jc w:val="center"/>
-        <w:tblLook w:firstColumn="1" w:firstRow="1" w:lastColumn="0" w:lastRow="0" w:noHBand="0" w:noVBand="1" w:val="04A0"/>
-      </w:tblPr>
-      <w:tblGrid>
-        <w:gridCol w:w="1680"/>
-        <w:gridCol w:w="1680"/>
-        <w:gridCol w:w="1680"/>
-        <w:gridCol w:w="1680"/>
-        <w:gridCol w:w="1680"/>
-        <w:gridCol w:w="1680"/>
-      </w:tblGrid>
-      <w:tr>
-        <w:tc>
-          <w:tcPr>
-            <w:tcW w:type="dxa" w:w="1680"/>
-            <w:vAlign w:val="center"/>
-            <w:shd w:fill="1F4E79"/>
-          </w:tcPr>
-          <w:p>
-            <w:r/>
-            <w:r>
-              <w:rPr>
-                <w:b/>
-                <w:color w:val="FFFFFF"/>
-                <w:sz w:val="17"/>
-              </w:rPr>
-              <w:t>Version</w:t>
-            </w:r>
-          </w:p>
-        </w:tc>
-        <w:tc>
-          <w:tcPr>
-            <w:tcW w:type="dxa" w:w="1680"/>
-            <w:vAlign w:val="center"/>
-            <w:shd w:fill="1F4E79"/>
-          </w:tcPr>
-          <w:p>
-            <w:r/>
-            <w:r>
-              <w:rPr>
-                <w:b/>
-                <w:color w:val="FFFFFF"/>
-                <w:sz w:val="17"/>
-              </w:rPr>
-              <w:t>Hecha por</w:t>
-            </w:r>
-          </w:p>
-        </w:tc>
-        <w:tc>
-          <w:tcPr>
-            <w:tcW w:type="dxa" w:w="1680"/>
-            <w:vAlign w:val="center"/>
-            <w:shd w:fill="1F4E79"/>
-          </w:tcPr>
-          <w:p>
-            <w:r/>
-            <w:r>
-              <w:rPr>
-                <w:b/>
-                <w:color w:val="FFFFFF"/>
-                <w:sz w:val="17"/>
-              </w:rPr>
-              <w:t>Revisada por</w:t>
-            </w:r>
-          </w:p>
-        </w:tc>
-        <w:tc>
-          <w:tcPr>
-            <w:tcW w:type="dxa" w:w="1680"/>
-            <w:vAlign w:val="center"/>
-            <w:shd w:fill="1F4E79"/>
-          </w:tcPr>
-          <w:p>
-            <w:r/>
-            <w:r>
-              <w:rPr>
-                <w:b/>
-                <w:color w:val="FFFFFF"/>
-                <w:sz w:val="17"/>
-              </w:rPr>
-              <w:t>Aprobada por</w:t>
-            </w:r>
-          </w:p>
-        </w:tc>
-        <w:tc>
-          <w:tcPr>
-            <w:tcW w:type="dxa" w:w="1680"/>
-            <w:vAlign w:val="center"/>
-            <w:shd w:fill="1F4E79"/>
-          </w:tcPr>
-          <w:p>
-            <w:r/>
-            <w:r>
-              <w:rPr>
-                <w:b/>
-                <w:color w:val="FFFFFF"/>
-                <w:sz w:val="17"/>
-              </w:rPr>
-              <w:t>Fecha</w:t>
-            </w:r>
-          </w:p>
-        </w:tc>
-        <w:tc>
-          <w:tcPr>
-            <w:tcW w:type="dxa" w:w="1680"/>
-            <w:vAlign w:val="center"/>
-            <w:shd w:fill="1F4E79"/>
-          </w:tcPr>
-          <w:p>
-            <w:r/>
-            <w:r>
-              <w:rPr>
-                <w:b/>
-                <w:color w:val="FFFFFF"/>
-                <w:sz w:val="17"/>
-              </w:rPr>
-              <w:t>Motivo</w:t>
-            </w:r>
-          </w:p>
-        </w:tc>
-      </w:tr>
-      <w:tr>
-        <w:tc>
-          <w:tcPr>
-            <w:tcW w:type="dxa" w:w="1680"/>
-            <w:vAlign w:val="center"/>
-          </w:tcPr>
-          <w:p>
-            <w:r/>
-            <w:r>
-              <w:rPr>
-                <w:b w:val="0"/>
-                <w:sz w:val="17"/>
-              </w:rPr>
-              <w:t>1.0</w:t>
-            </w:r>
-          </w:p>
-        </w:tc>
-        <w:tc>
-          <w:tcPr>
-            <w:tcW w:type="dxa" w:w="1680"/>
-            <w:vAlign w:val="center"/>
-          </w:tcPr>
-          <w:p>
-            <w:r/>
-            <w:r>
-              <w:rPr>
-                <w:b w:val="0"/>
-                <w:sz w:val="17"/>
-              </w:rPr>
-              <w:t>Equipo del proyecto</w:t>
-            </w:r>
-          </w:p>
-        </w:tc>
-        <w:tc>
-          <w:tcPr>
-            <w:tcW w:type="dxa" w:w="1680"/>
-            <w:vAlign w:val="center"/>
-          </w:tcPr>
-          <w:p>
-            <w:r/>
-            <w:r>
-              <w:rPr>
-                <w:b w:val="0"/>
-                <w:sz w:val="17"/>
-              </w:rPr>
-              <w:t>Pendiente</w:t>
-            </w:r>
-          </w:p>
-        </w:tc>
-        <w:tc>
-          <w:tcPr>
-            <w:tcW w:type="dxa" w:w="1680"/>
-            <w:vAlign w:val="center"/>
-          </w:tcPr>
-          <w:p>
-            <w:r/>
-            <w:r>
-              <w:rPr>
-                <w:b w:val="0"/>
-                <w:sz w:val="17"/>
-              </w:rPr>
-              <w:t>Pendiente</w:t>
-            </w:r>
-          </w:p>
-        </w:tc>
-        <w:tc>
-          <w:tcPr>
-            <w:tcW w:type="dxa" w:w="1680"/>
-            <w:vAlign w:val="center"/>
-          </w:tcPr>
-          <w:p>
-            <w:r/>
-            <w:r>
-              <w:rPr>
-                <w:b w:val="0"/>
-                <w:sz w:val="17"/>
-              </w:rPr>
-              <w:t>04/07/2026</w:t>
-            </w:r>
-          </w:p>
-        </w:tc>
-        <w:tc>
-          <w:tcPr>
-            <w:tcW w:type="dxa" w:w="1680"/>
-            <w:vAlign w:val="center"/>
-          </w:tcPr>
-          <w:p>
-            <w:r/>
-            <w:r>
-              <w:rPr>
-                <w:b w:val="0"/>
-                <w:sz w:val="17"/>
-              </w:rPr>
-              <w:t>Adaptacion inicial al sistema implementado</w:t>
-            </w:r>
-          </w:p>
-        </w:tc>
-      </w:tr>
-      <w:tr>
-        <w:tc>
-          <w:tcPr>
-            <w:tcW w:type="dxa" w:w="1680"/>
-            <w:vAlign w:val="center"/>
-          </w:tcPr>
-          <w:p>
-            <w:r/>
-            <w:r>
-              <w:rPr>
-                <w:b w:val="0"/>
-                <w:sz w:val="17"/>
-              </w:rPr>
-              <w:t>2.0</w:t>
-            </w:r>
-          </w:p>
-        </w:tc>
-        <w:tc>
-          <w:tcPr>
-            <w:tcW w:type="dxa" w:w="1680"/>
-            <w:vAlign w:val="center"/>
-          </w:tcPr>
-          <w:p>
-            <w:r/>
-            <w:r>
-              <w:rPr>
-                <w:b w:val="0"/>
-                <w:sz w:val="17"/>
-              </w:rPr>
-              <w:t>Equipo del proyecto</w:t>
-            </w:r>
-          </w:p>
-        </w:tc>
-        <w:tc>
-          <w:tcPr>
-            <w:tcW w:type="dxa" w:w="1680"/>
-            <w:vAlign w:val="center"/>
-          </w:tcPr>
-          <w:p>
-            <w:r/>
-            <w:r>
-              <w:rPr>
-                <w:b w:val="0"/>
-                <w:sz w:val="17"/>
-              </w:rPr>
-              <w:t>Pendiente</w:t>
-            </w:r>
-          </w:p>
-        </w:tc>
-        <w:tc>
-          <w:tcPr>
-            <w:tcW w:type="dxa" w:w="1680"/>
-            <w:vAlign w:val="center"/>
-          </w:tcPr>
-          <w:p>
-            <w:r/>
-            <w:r>
-              <w:rPr>
-                <w:b w:val="0"/>
-                <w:sz w:val="17"/>
-              </w:rPr>
-              <w:t>Pendiente</w:t>
-            </w:r>
-          </w:p>
-        </w:tc>
-        <w:tc>
-          <w:tcPr>
-            <w:tcW w:type="dxa" w:w="1680"/>
-            <w:vAlign w:val="center"/>
-          </w:tcPr>
-          <w:p>
-            <w:r/>
-            <w:r>
-              <w:rPr>
-                <w:b w:val="0"/>
-                <w:sz w:val="17"/>
-              </w:rPr>
-              <w:t>04/07/2026</w:t>
-            </w:r>
-          </w:p>
-        </w:tc>
-        <w:tc>
-          <w:tcPr>
-            <w:tcW w:type="dxa" w:w="1680"/>
-            <w:vAlign w:val="center"/>
-          </w:tcPr>
-          <w:p>
-            <w:r/>
-            <w:r>
-              <w:rPr>
-                <w:b w:val="0"/>
-                <w:sz w:val="17"/>
-              </w:rPr>
-              <w:t>Ampliacion con funcionalidades, tablas y diagramas de la carpeta web</w:t>
-            </w:r>
-          </w:p>
-        </w:tc>
-      </w:tr>
-    </w:tbl>
-    <w:p/>
-    <w:p>
-      <w:pPr>
-        <w:pStyle w:val="Heading1"/>
-      </w:pPr>
-      <w:r>
-        <w:rPr>
-          <w:rFonts w:ascii="Arial" w:hAnsi="Arial"/>
-          <w:sz w:val="20"/>
-        </w:rPr>
-        <w:t>1. Descripcion del proyecto</w:t>
-      </w:r>
-    </w:p>
-    <w:p>
-      <w:r>
-        <w:rPr>
-          <w:rFonts w:ascii="Arial" w:hAnsi="Arial"/>
-          <w:sz w:val="20"/>
-        </w:rPr>
-        <w:t>Drop Nexus es una aplicacion web multiusuario para importar bases de datos o archivos, normalizar su estructura, replicar tablas entre origen y destino, aplicar mapeos de columnas, registrar progreso y descargar los resultados modificados en formatos reutilizables.</w:t>
-      </w:r>
-    </w:p>
-    <w:tbl>
-      <w:tblPr>
-        <w:tblStyle w:val="TableGrid"/>
-        <w:tblW w:type="auto" w:w="0"/>
-        <w:jc w:val="center"/>
-        <w:tblLook w:firstColumn="1" w:firstRow="1" w:lastColumn="0" w:lastRow="0" w:noHBand="0" w:noVBand="1" w:val="04A0"/>
-      </w:tblPr>
-      <w:tblGrid>
-        <w:gridCol w:w="5040"/>
-        <w:gridCol w:w="5040"/>
-      </w:tblGrid>
-      <w:tr>
-        <w:tc>
-          <w:tcPr>
-            <w:tcW w:type="dxa" w:w="5040"/>
-            <w:vAlign w:val="center"/>
-            <w:shd w:fill="1F4E79"/>
-          </w:tcPr>
-          <w:p>
-            <w:r/>
-            <w:r>
-              <w:rPr>
-                <w:b/>
-                <w:color w:val="FFFFFF"/>
-                <w:sz w:val="17"/>
-              </w:rPr>
-              <w:t>Elemento</w:t>
-            </w:r>
-          </w:p>
-        </w:tc>
-        <w:tc>
-          <w:tcPr>
-            <w:tcW w:type="dxa" w:w="5040"/>
-            <w:vAlign w:val="center"/>
-            <w:shd w:fill="1F4E79"/>
-          </w:tcPr>
-          <w:p>
-            <w:r/>
-            <w:r>
-              <w:rPr>
-                <w:b/>
-                <w:color w:val="FFFFFF"/>
-                <w:sz w:val="17"/>
-              </w:rPr>
-              <w:t>Descripcion</w:t>
-            </w:r>
-          </w:p>
-        </w:tc>
-      </w:tr>
-      <w:tr>
-        <w:tc>
-          <w:tcPr>
-            <w:tcW w:type="dxa" w:w="5040"/>
-            <w:vAlign w:val="center"/>
-          </w:tcPr>
-          <w:p>
-            <w:r/>
-            <w:r>
-              <w:rPr>
-                <w:b w:val="0"/>
-                <w:sz w:val="17"/>
-              </w:rPr>
-              <w:t>Nombre del proyecto</w:t>
-            </w:r>
-          </w:p>
-        </w:tc>
-        <w:tc>
-          <w:tcPr>
-            <w:tcW w:type="dxa" w:w="5040"/>
-            <w:vAlign w:val="center"/>
-          </w:tcPr>
-          <w:p>
-            <w:r/>
-            <w:r>
-              <w:rPr>
-                <w:b w:val="0"/>
-                <w:sz w:val="17"/>
-              </w:rPr>
-              <w:t>Drop Nexus - Replicador de Datos entre Bases de Datos</w:t>
-            </w:r>
-          </w:p>
-        </w:tc>
-      </w:tr>
-      <w:tr>
-        <w:tc>
-          <w:tcPr>
-            <w:tcW w:type="dxa" w:w="5040"/>
-            <w:vAlign w:val="center"/>
-          </w:tcPr>
-          <w:p>
-            <w:r/>
-            <w:r>
-              <w:rPr>
-                <w:b w:val="0"/>
-                <w:sz w:val="17"/>
-              </w:rPr>
-              <w:t>Alcance tecnico</w:t>
-            </w:r>
-          </w:p>
-        </w:tc>
-        <w:tc>
-          <w:tcPr>
-            <w:tcW w:type="dxa" w:w="5040"/>
-            <w:vAlign w:val="center"/>
-          </w:tcPr>
-          <w:p>
-            <w:r/>
-            <w:r>
-              <w:rPr>
-                <w:b w:val="0"/>
-                <w:sz w:val="17"/>
-              </w:rPr>
-              <w:t>Frontend React/Vite/Tailwind, backend Fastify/TypeScript, metadatos en PostgreSQL/Supabase y despliegue compatible con Render.</w:t>
-            </w:r>
-          </w:p>
-        </w:tc>
-      </w:tr>
-      <w:tr>
-        <w:tc>
-          <w:tcPr>
-            <w:tcW w:type="dxa" w:w="5040"/>
-            <w:vAlign w:val="center"/>
-          </w:tcPr>
-          <w:p>
-            <w:r/>
-            <w:r>
-              <w:rPr>
-                <w:b w:val="0"/>
-                <w:sz w:val="17"/>
-              </w:rPr>
-              <w:t>Motores y formatos</w:t>
-            </w:r>
-          </w:p>
-        </w:tc>
-        <w:tc>
-          <w:tcPr>
-            <w:tcW w:type="dxa" w:w="5040"/>
-            <w:vAlign w:val="center"/>
-          </w:tcPr>
-          <w:p>
-            <w:r/>
-            <w:r>
-              <w:rPr>
-                <w:b w:val="0"/>
-                <w:sz w:val="17"/>
-              </w:rPr>
-              <w:t>PostgreSQL, MySQL, MariaDB, SQL Server, Oracle por script, SQLite, MongoDB JSON/NDJSON, Excel/CSV y SQL Server .bak con restauracion configurada.</w:t>
-            </w:r>
-          </w:p>
-        </w:tc>
-      </w:tr>
-      <w:tr>
-        <w:tc>
-          <w:tcPr>
-            <w:tcW w:type="dxa" w:w="5040"/>
-            <w:vAlign w:val="center"/>
-          </w:tcPr>
-          <w:p>
-            <w:r/>
-            <w:r>
-              <w:rPr>
-                <w:b w:val="0"/>
-                <w:sz w:val="17"/>
-              </w:rPr>
-              <w:t>Resultado principal</w:t>
-            </w:r>
-          </w:p>
-        </w:tc>
-        <w:tc>
-          <w:tcPr>
-            <w:tcW w:type="dxa" w:w="5040"/>
-            <w:vAlign w:val="center"/>
-          </w:tcPr>
-          <w:p>
-            <w:r/>
-            <w:r>
-              <w:rPr>
-                <w:b w:val="0"/>
-                <w:sz w:val="17"/>
-              </w:rPr>
-              <w:t>Replica trazable con historial, reintentos, diagnostico de errores y descarga en JSON, XLSX o SQLite para catalogos importados.</w:t>
-            </w:r>
-          </w:p>
-        </w:tc>
-      </w:tr>
-    </w:tbl>
-    <w:p/>
-    <w:p>
-      <w:pPr>
-        <w:pStyle w:val="Heading1"/>
-      </w:pPr>
-      <w:r>
-        <w:rPr>
-          <w:rFonts w:ascii="Arial" w:hAnsi="Arial"/>
-          <w:sz w:val="20"/>
-        </w:rPr>
-        <w:t>2. Objetivos</w:t>
-      </w:r>
-    </w:p>
-    <w:tbl>
-      <w:tblPr>
-        <w:tblStyle w:val="TableGrid"/>
-        <w:tblW w:type="auto" w:w="0"/>
-        <w:jc w:val="center"/>
-        <w:tblLook w:firstColumn="1" w:firstRow="1" w:lastColumn="0" w:lastRow="0" w:noHBand="0" w:noVBand="1" w:val="04A0"/>
-      </w:tblPr>
-      <w:tblGrid>
-        <w:gridCol w:w="3360"/>
-        <w:gridCol w:w="3360"/>
-        <w:gridCol w:w="3360"/>
-      </w:tblGrid>
-      <w:tr>
-        <w:tc>
-          <w:tcPr>
-            <w:tcW w:type="dxa" w:w="3360"/>
-            <w:vAlign w:val="center"/>
-            <w:shd w:fill="1F4E79"/>
-          </w:tcPr>
-          <w:p>
-            <w:r/>
-            <w:r>
-              <w:rPr>
-                <w:b/>
-                <w:color w:val="FFFFFF"/>
-                <w:sz w:val="17"/>
-              </w:rPr>
-              <w:t>Tipo</w:t>
-            </w:r>
-          </w:p>
-        </w:tc>
-        <w:tc>
-          <w:tcPr>
-            <w:tcW w:type="dxa" w:w="3360"/>
-            <w:vAlign w:val="center"/>
-            <w:shd w:fill="1F4E79"/>
-          </w:tcPr>
-          <w:p>
-            <w:r/>
-            <w:r>
-              <w:rPr>
-                <w:b/>
-                <w:color w:val="FFFFFF"/>
-                <w:sz w:val="17"/>
-              </w:rPr>
-              <w:t>Objetivo</w:t>
-            </w:r>
-          </w:p>
-        </w:tc>
-        <w:tc>
-          <w:tcPr>
-            <w:tcW w:type="dxa" w:w="3360"/>
-            <w:vAlign w:val="center"/>
-            <w:shd w:fill="1F4E79"/>
-          </w:tcPr>
-          <w:p>
-            <w:r/>
-            <w:r>
-              <w:rPr>
-                <w:b/>
-                <w:color w:val="FFFFFF"/>
-                <w:sz w:val="17"/>
-              </w:rPr>
-              <w:t>Indicador</w:t>
-            </w:r>
-          </w:p>
-        </w:tc>
-      </w:tr>
-      <w:tr>
-        <w:tc>
-          <w:tcPr>
-            <w:tcW w:type="dxa" w:w="3360"/>
-            <w:vAlign w:val="center"/>
-          </w:tcPr>
-          <w:p>
-            <w:r/>
-            <w:r>
-              <w:rPr>
-                <w:b w:val="0"/>
-                <w:sz w:val="17"/>
-              </w:rPr>
-              <w:t>General</w:t>
-            </w:r>
-          </w:p>
-        </w:tc>
-        <w:tc>
-          <w:tcPr>
-            <w:tcW w:type="dxa" w:w="3360"/>
-            <w:vAlign w:val="center"/>
-          </w:tcPr>
-          <w:p>
-            <w:r/>
-            <w:r>
-              <w:rPr>
-                <w:b w:val="0"/>
-                <w:sz w:val="17"/>
-              </w:rPr>
-              <w:t>Evaluar la viabilidad de Drop Nexus como herramienta academica y tecnica para replicar datos entre motores heterogeneos.</w:t>
-            </w:r>
-          </w:p>
-        </w:tc>
-        <w:tc>
-          <w:tcPr>
-            <w:tcW w:type="dxa" w:w="3360"/>
-            <w:vAlign w:val="center"/>
-          </w:tcPr>
-          <w:p>
-            <w:r/>
-            <w:r>
-              <w:rPr>
-                <w:b w:val="0"/>
-                <w:sz w:val="17"/>
-              </w:rPr>
-              <w:t>Sistema web ejecutable en carpeta web/.</w:t>
-            </w:r>
-          </w:p>
-        </w:tc>
-      </w:tr>
-      <w:tr>
-        <w:tc>
-          <w:tcPr>
-            <w:tcW w:type="dxa" w:w="3360"/>
-            <w:vAlign w:val="center"/>
-          </w:tcPr>
-          <w:p>
-            <w:r/>
-            <w:r>
-              <w:rPr>
-                <w:b w:val="0"/>
-                <w:sz w:val="17"/>
-              </w:rPr>
-              <w:t>Especifico</w:t>
-            </w:r>
-          </w:p>
-        </w:tc>
-        <w:tc>
-          <w:tcPr>
-            <w:tcW w:type="dxa" w:w="3360"/>
-            <w:vAlign w:val="center"/>
-          </w:tcPr>
-          <w:p>
-            <w:r/>
-            <w:r>
-              <w:rPr>
-                <w:b w:val="0"/>
-                <w:sz w:val="17"/>
-              </w:rPr>
-              <w:t>Validar la factibilidad tecnica de adaptadores, catalogos, seguridad y despliegue.</w:t>
-            </w:r>
-          </w:p>
-        </w:tc>
-        <w:tc>
-          <w:tcPr>
-            <w:tcW w:type="dxa" w:w="3360"/>
-            <w:vAlign w:val="center"/>
-          </w:tcPr>
-          <w:p>
-            <w:r/>
-            <w:r>
-              <w:rPr>
-                <w:b w:val="0"/>
-                <w:sz w:val="17"/>
-              </w:rPr>
-              <w:t>Servicios y rutas implementados en backend/src.</w:t>
-            </w:r>
-          </w:p>
-        </w:tc>
-      </w:tr>
-      <w:tr>
-        <w:tc>
-          <w:tcPr>
-            <w:tcW w:type="dxa" w:w="3360"/>
-            <w:vAlign w:val="center"/>
-          </w:tcPr>
-          <w:p>
-            <w:r/>
-            <w:r>
-              <w:rPr>
-                <w:b w:val="0"/>
-                <w:sz w:val="17"/>
-              </w:rPr>
-              <w:t>Especifico</w:t>
-            </w:r>
-          </w:p>
-        </w:tc>
-        <w:tc>
-          <w:tcPr>
-            <w:tcW w:type="dxa" w:w="3360"/>
-            <w:vAlign w:val="center"/>
-          </w:tcPr>
-          <w:p>
-            <w:r/>
-            <w:r>
-              <w:rPr>
-                <w:b w:val="0"/>
-                <w:sz w:val="17"/>
-              </w:rPr>
-              <w:t>Validar la factibilidad operativa para usuarios no expertos en scripts.</w:t>
-            </w:r>
-          </w:p>
-        </w:tc>
-        <w:tc>
-          <w:tcPr>
-            <w:tcW w:type="dxa" w:w="3360"/>
-            <w:vAlign w:val="center"/>
-          </w:tcPr>
-          <w:p>
-            <w:r/>
-            <w:r>
-              <w:rPr>
-                <w:b w:val="0"/>
-                <w:sz w:val="17"/>
-              </w:rPr>
-              <w:t>Flujo guiado de conexiones, tablas, mapeo y validacion.</w:t>
-            </w:r>
-          </w:p>
-        </w:tc>
-      </w:tr>
-      <w:tr>
-        <w:tc>
-          <w:tcPr>
-            <w:tcW w:type="dxa" w:w="3360"/>
-            <w:vAlign w:val="center"/>
-          </w:tcPr>
-          <w:p>
-            <w:r/>
-            <w:r>
-              <w:rPr>
-                <w:b w:val="0"/>
-                <w:sz w:val="17"/>
-              </w:rPr>
-              <w:t>Especifico</w:t>
-            </w:r>
-          </w:p>
-        </w:tc>
-        <w:tc>
-          <w:tcPr>
-            <w:tcW w:type="dxa" w:w="3360"/>
-            <w:vAlign w:val="center"/>
-          </w:tcPr>
-          <w:p>
-            <w:r/>
-            <w:r>
-              <w:rPr>
-                <w:b w:val="0"/>
-                <w:sz w:val="17"/>
-              </w:rPr>
-              <w:t>Estimar riesgos economicos, legales y ambientales.</w:t>
-            </w:r>
-          </w:p>
-        </w:tc>
-        <w:tc>
-          <w:tcPr>
-            <w:tcW w:type="dxa" w:w="3360"/>
-            <w:vAlign w:val="center"/>
-          </w:tcPr>
-          <w:p>
-            <w:r/>
-            <w:r>
-              <w:rPr>
-                <w:b w:val="0"/>
-                <w:sz w:val="17"/>
-              </w:rPr>
-              <w:t>Tabla de riesgos y mitigaciones documentada.</w:t>
-            </w:r>
-          </w:p>
-        </w:tc>
-      </w:tr>
-    </w:tbl>
-    <w:p/>
-    <w:p>
-      <w:pPr>
-        <w:pStyle w:val="Heading1"/>
-      </w:pPr>
-      <w:r>
-        <w:rPr>
-          <w:rFonts w:ascii="Arial" w:hAnsi="Arial"/>
-          <w:sz w:val="20"/>
-        </w:rPr>
-        <w:t>3. Situacion actual y problema</w:t>
-      </w:r>
-    </w:p>
-    <w:p>
-      <w:r>
-        <w:rPr>
-          <w:rFonts w:ascii="Arial" w:hAnsi="Arial"/>
-          <w:sz w:val="20"/>
-        </w:rPr>
-        <w:t>La migracion entre motores suele depender de scripts manuales, herramientas distintas por cada tecnologia y validaciones poco visibles. En cursos y pruebas de integracion esto genera perdida de tiempo, poca trazabilidad, errores dificiles de explicar y resultados que no siempre pueden descargarse en un formato verificable.</w:t>
-      </w:r>
-    </w:p>
-    <w:p>
-      <w:r>
-        <w:rPr>
-          <w:rFonts w:ascii="Arial" w:hAnsi="Arial"/>
-          <w:b/>
-          <w:sz w:val="20"/>
-        </w:rPr>
-        <w:t>Diagrama de contexto</w:t>
-      </w:r>
-    </w:p>
-    <w:p>
-      <w:pPr>
-        <w:pStyle w:val="NoSpacing"/>
-      </w:pPr>
-      <w:r>
-        <w:rPr>
-          <w:rFonts w:ascii="Consolas" w:hAnsi="Consolas" w:eastAsia="Consolas"/>
-          <w:sz w:val="16"/>
-        </w:rPr>
-        <w:t>```mermaid</w:t>
-        <w:br/>
-        <w:t>graph TD</w:t>
-        <w:br/>
-        <w:t xml:space="preserve">  U[Usuario autenticado] --&gt; F[Frontend React + Vite]</w:t>
-        <w:br/>
-        <w:t xml:space="preserve">  F --&gt; API[API Fastify /api]</w:t>
-        <w:br/>
-        <w:t xml:space="preserve">  API --&gt; AUTH[Auth JWT y roles]</w:t>
-        <w:br/>
-        <w:t xml:space="preserve">  API --&gt; CFG[Configuraciones y archivos]</w:t>
-        <w:br/>
-        <w:t xml:space="preserve">  API --&gt; REP[Servicio de replicacion]</w:t>
-        <w:br/>
-        <w:t xml:space="preserve">  CFG --&gt; CAT[Catalogos normalizados]</w:t>
-        <w:br/>
-        <w:t xml:space="preserve">  REP --&gt; ADP[Adaptadores por motor]</w:t>
-        <w:br/>
-        <w:t xml:space="preserve">  ADP --&gt; SRC[Bases origen]</w:t>
-        <w:br/>
-        <w:t xml:space="preserve">  ADP --&gt; DST[Bases destino]</w:t>
-        <w:br/>
-        <w:t xml:space="preserve">  API --&gt; META[(Supabase/PostgreSQL metadatos)]</w:t>
-        <w:br/>
-        <w:t xml:space="preserve">  CAT --&gt; META</w:t>
-        <w:br/>
-        <w:t xml:space="preserve">  REP --&gt; META</w:t>
-        <w:br/>
-        <w:t>```</w:t>
-      </w:r>
-    </w:p>
-    <w:p/>
-    <w:p>
-      <w:pPr>
-        <w:pStyle w:val="Heading1"/>
-      </w:pPr>
-      <w:r>
-        <w:rPr>
-          <w:rFonts w:ascii="Arial" w:hAnsi="Arial"/>
-          <w:sz w:val="20"/>
-        </w:rPr>
-        <w:t>4. Factibilidad tecnica</w:t>
-      </w:r>
-    </w:p>
-    <w:tbl>
-      <w:tblPr>
-        <w:tblStyle w:val="TableGrid"/>
-        <w:tblW w:type="auto" w:w="0"/>
-        <w:jc w:val="center"/>
-        <w:tblLook w:firstColumn="1" w:firstRow="1" w:lastColumn="0" w:lastRow="0" w:noHBand="0" w:noVBand="1" w:val="04A0"/>
-      </w:tblPr>
-      <w:tblGrid>
-        <w:gridCol w:w="3360"/>
-        <w:gridCol w:w="3360"/>
-        <w:gridCol w:w="3360"/>
-      </w:tblGrid>
-      <w:tr>
-        <w:tc>
-          <w:tcPr>
-            <w:tcW w:type="dxa" w:w="3360"/>
-            <w:vAlign w:val="center"/>
-            <w:shd w:fill="1F4E79"/>
-          </w:tcPr>
-          <w:p>
-            <w:r/>
-            <w:r>
-              <w:rPr>
-                <w:b/>
-                <w:color w:val="FFFFFF"/>
-                <w:sz w:val="17"/>
-              </w:rPr>
-              <w:t>Criterio</w:t>
-            </w:r>
-          </w:p>
-        </w:tc>
-        <w:tc>
-          <w:tcPr>
-            <w:tcW w:type="dxa" w:w="3360"/>
-            <w:vAlign w:val="center"/>
-            <w:shd w:fill="1F4E79"/>
-          </w:tcPr>
-          <w:p>
-            <w:r/>
-            <w:r>
-              <w:rPr>
-                <w:b/>
-                <w:color w:val="FFFFFF"/>
-                <w:sz w:val="17"/>
-              </w:rPr>
-              <w:t>Evidencia en el sistema</w:t>
-            </w:r>
-          </w:p>
-        </w:tc>
-        <w:tc>
-          <w:tcPr>
-            <w:tcW w:type="dxa" w:w="3360"/>
-            <w:vAlign w:val="center"/>
-            <w:shd w:fill="1F4E79"/>
-          </w:tcPr>
-          <w:p>
-            <w:r/>
-            <w:r>
-              <w:rPr>
-                <w:b/>
-                <w:color w:val="FFFFFF"/>
-                <w:sz w:val="17"/>
-              </w:rPr>
-              <w:t>Resultado</w:t>
-            </w:r>
-          </w:p>
-        </w:tc>
-      </w:tr>
-      <w:tr>
-        <w:tc>
-          <w:tcPr>
-            <w:tcW w:type="dxa" w:w="3360"/>
-            <w:vAlign w:val="center"/>
-          </w:tcPr>
-          <w:p>
-            <w:r/>
-            <w:r>
-              <w:rPr>
-                <w:b w:val="0"/>
-                <w:sz w:val="17"/>
-              </w:rPr>
-              <w:t>Arquitectura web</w:t>
-            </w:r>
-          </w:p>
-        </w:tc>
-        <w:tc>
-          <w:tcPr>
-            <w:tcW w:type="dxa" w:w="3360"/>
-            <w:vAlign w:val="center"/>
-          </w:tcPr>
-          <w:p>
-            <w:r/>
-            <w:r>
-              <w:rPr>
-                <w:b w:val="0"/>
-                <w:sz w:val="17"/>
-              </w:rPr>
-              <w:t>React consume API Fastify bajo /api; backend sirve frontend/dist en produccion.</w:t>
-            </w:r>
-          </w:p>
-        </w:tc>
-        <w:tc>
-          <w:tcPr>
-            <w:tcW w:type="dxa" w:w="3360"/>
-            <w:vAlign w:val="center"/>
-          </w:tcPr>
-          <w:p>
-            <w:r/>
-            <w:r>
-              <w:rPr>
-                <w:b w:val="0"/>
-                <w:sz w:val="17"/>
-              </w:rPr>
-              <w:t>Factible</w:t>
-            </w:r>
-          </w:p>
-        </w:tc>
-      </w:tr>
-      <w:tr>
-        <w:tc>
-          <w:tcPr>
-            <w:tcW w:type="dxa" w:w="3360"/>
-            <w:vAlign w:val="center"/>
-          </w:tcPr>
-          <w:p>
-            <w:r/>
-            <w:r>
-              <w:rPr>
-                <w:b w:val="0"/>
-                <w:sz w:val="17"/>
-              </w:rPr>
-              <w:t>Persistencia</w:t>
-            </w:r>
-          </w:p>
-        </w:tc>
-        <w:tc>
-          <w:tcPr>
-            <w:tcW w:type="dxa" w:w="3360"/>
-            <w:vAlign w:val="center"/>
-          </w:tcPr>
-          <w:p>
-            <w:r/>
-            <w:r>
-              <w:rPr>
-                <w:b w:val="0"/>
-                <w:sz w:val="17"/>
-              </w:rPr>
-              <w:t>Tablas users, db_configurations, replications, health_checks y database_catalogs en PostgreSQL.</w:t>
-            </w:r>
-          </w:p>
-        </w:tc>
-        <w:tc>
-          <w:tcPr>
-            <w:tcW w:type="dxa" w:w="3360"/>
-            <w:vAlign w:val="center"/>
-          </w:tcPr>
-          <w:p>
-            <w:r/>
-            <w:r>
-              <w:rPr>
-                <w:b w:val="0"/>
-                <w:sz w:val="17"/>
-              </w:rPr>
-              <w:t>Factible</w:t>
-            </w:r>
-          </w:p>
-        </w:tc>
-      </w:tr>
-      <w:tr>
-        <w:tc>
-          <w:tcPr>
-            <w:tcW w:type="dxa" w:w="3360"/>
-            <w:vAlign w:val="center"/>
-          </w:tcPr>
-          <w:p>
-            <w:r/>
-            <w:r>
-              <w:rPr>
-                <w:b w:val="0"/>
-                <w:sz w:val="17"/>
-              </w:rPr>
-              <w:t>Procesamiento</w:t>
-            </w:r>
-          </w:p>
-        </w:tc>
-        <w:tc>
-          <w:tcPr>
-            <w:tcW w:type="dxa" w:w="3360"/>
-            <w:vAlign w:val="center"/>
-          </w:tcPr>
-          <w:p>
-            <w:r/>
-            <w:r>
-              <w:rPr>
-                <w:b w:val="0"/>
-                <w:sz w:val="17"/>
-              </w:rPr>
-              <w:t>replicationService ejecuta lotes, offset, reintentos, programacion y reanudacion.</w:t>
-            </w:r>
-          </w:p>
-        </w:tc>
-        <w:tc>
-          <w:tcPr>
-            <w:tcW w:type="dxa" w:w="3360"/>
-            <w:vAlign w:val="center"/>
-          </w:tcPr>
-          <w:p>
-            <w:r/>
-            <w:r>
-              <w:rPr>
-                <w:b w:val="0"/>
-                <w:sz w:val="17"/>
-              </w:rPr>
-              <w:t>Factible</w:t>
-            </w:r>
-          </w:p>
-        </w:tc>
-      </w:tr>
-      <w:tr>
-        <w:tc>
-          <w:tcPr>
-            <w:tcW w:type="dxa" w:w="3360"/>
-            <w:vAlign w:val="center"/>
-          </w:tcPr>
-          <w:p>
-            <w:r/>
-            <w:r>
-              <w:rPr>
-                <w:b w:val="0"/>
-                <w:sz w:val="17"/>
-              </w:rPr>
-              <w:t>Interoperabilidad</w:t>
-            </w:r>
-          </w:p>
-        </w:tc>
-        <w:tc>
-          <w:tcPr>
-            <w:tcW w:type="dxa" w:w="3360"/>
-            <w:vAlign w:val="center"/>
-          </w:tcPr>
-          <w:p>
-            <w:r/>
-            <w:r>
-              <w:rPr>
-                <w:b w:val="0"/>
-                <w:sz w:val="17"/>
-              </w:rPr>
-              <w:t>DatabaseAdapter unifica motores y fileCatalog normaliza archivos.</w:t>
-            </w:r>
-          </w:p>
-        </w:tc>
-        <w:tc>
-          <w:tcPr>
-            <w:tcW w:type="dxa" w:w="3360"/>
-            <w:vAlign w:val="center"/>
-          </w:tcPr>
-          <w:p>
-            <w:r/>
-            <w:r>
-              <w:rPr>
-                <w:b w:val="0"/>
-                <w:sz w:val="17"/>
-              </w:rPr>
-              <w:t>Factible con limites por motor</w:t>
-            </w:r>
-          </w:p>
-        </w:tc>
-      </w:tr>
-      <w:tr>
-        <w:tc>
-          <w:tcPr>
-            <w:tcW w:type="dxa" w:w="3360"/>
-            <w:vAlign w:val="center"/>
-          </w:tcPr>
-          <w:p>
-            <w:r/>
-            <w:r>
-              <w:rPr>
-                <w:b w:val="0"/>
-                <w:sz w:val="17"/>
-              </w:rPr>
-              <w:t>Seguridad</w:t>
-            </w:r>
-          </w:p>
-        </w:tc>
-        <w:tc>
-          <w:tcPr>
-            <w:tcW w:type="dxa" w:w="3360"/>
-            <w:vAlign w:val="center"/>
-          </w:tcPr>
-          <w:p>
-            <w:r/>
-            <w:r>
-              <w:rPr>
-                <w:b w:val="0"/>
-                <w:sz w:val="17"/>
-              </w:rPr>
-              <w:t>JWT, Helmet, CORS, rate limit, cifrado AES-256-GCM y aislamiento por user_id.</w:t>
-            </w:r>
-          </w:p>
-        </w:tc>
-        <w:tc>
-          <w:tcPr>
-            <w:tcW w:type="dxa" w:w="3360"/>
-            <w:vAlign w:val="center"/>
-          </w:tcPr>
-          <w:p>
-            <w:r/>
-            <w:r>
-              <w:rPr>
-                <w:b w:val="0"/>
-                <w:sz w:val="17"/>
-              </w:rPr>
-              <w:t>Factible</w:t>
-            </w:r>
-          </w:p>
-        </w:tc>
-      </w:tr>
-      <w:tr>
-        <w:tc>
-          <w:tcPr>
-            <w:tcW w:type="dxa" w:w="3360"/>
-            <w:vAlign w:val="center"/>
-          </w:tcPr>
-          <w:p>
-            <w:r/>
-            <w:r>
-              <w:rPr>
-                <w:b w:val="0"/>
-                <w:sz w:val="17"/>
-              </w:rPr>
-              <w:t>Despliegue</w:t>
-            </w:r>
-          </w:p>
-        </w:tc>
-        <w:tc>
-          <w:tcPr>
-            <w:tcW w:type="dxa" w:w="3360"/>
-            <w:vAlign w:val="center"/>
-          </w:tcPr>
-          <w:p>
-            <w:r/>
-            <w:r>
-              <w:rPr>
-                <w:b w:val="0"/>
-                <w:sz w:val="17"/>
-              </w:rPr>
-              <w:t>render.yaml y variables de entorno documentadas.</w:t>
-            </w:r>
-          </w:p>
-        </w:tc>
-        <w:tc>
-          <w:tcPr>
-            <w:tcW w:type="dxa" w:w="3360"/>
-            <w:vAlign w:val="center"/>
-          </w:tcPr>
-          <w:p>
-            <w:r/>
-            <w:r>
-              <w:rPr>
-                <w:b w:val="0"/>
-                <w:sz w:val="17"/>
-              </w:rPr>
-              <w:t>Factible</w:t>
-            </w:r>
-          </w:p>
-        </w:tc>
-      </w:tr>
-    </w:tbl>
-    <w:p/>
-    <w:p>
-      <w:pPr>
-        <w:pStyle w:val="Heading1"/>
-      </w:pPr>
-      <w:r>
-        <w:rPr>
-          <w:rFonts w:ascii="Arial" w:hAnsi="Arial"/>
-          <w:sz w:val="20"/>
-        </w:rPr>
-        <w:t>5. Factibilidad economica</w:t>
-      </w:r>
-    </w:p>
-    <w:tbl>
-      <w:tblPr>
-        <w:tblStyle w:val="TableGrid"/>
-        <w:tblW w:type="auto" w:w="0"/>
-        <w:jc w:val="center"/>
-        <w:tblLook w:firstColumn="1" w:firstRow="1" w:lastColumn="0" w:lastRow="0" w:noHBand="0" w:noVBand="1" w:val="04A0"/>
-      </w:tblPr>
-      <w:tblGrid>
-        <w:gridCol w:w="3360"/>
-        <w:gridCol w:w="3360"/>
-        <w:gridCol w:w="3360"/>
-      </w:tblGrid>
-      <w:tr>
-        <w:tc>
-          <w:tcPr>
-            <w:tcW w:type="dxa" w:w="3360"/>
-            <w:vAlign w:val="center"/>
-            <w:shd w:fill="1F4E79"/>
-          </w:tcPr>
-          <w:p>
-            <w:r/>
-            <w:r>
-              <w:rPr>
-                <w:b/>
-                <w:color w:val="FFFFFF"/>
-                <w:sz w:val="17"/>
-              </w:rPr>
-              <w:t>Recurso</w:t>
-            </w:r>
-          </w:p>
-        </w:tc>
-        <w:tc>
-          <w:tcPr>
-            <w:tcW w:type="dxa" w:w="3360"/>
-            <w:vAlign w:val="center"/>
-            <w:shd w:fill="1F4E79"/>
-          </w:tcPr>
-          <w:p>
-            <w:r/>
-            <w:r>
-              <w:rPr>
-                <w:b/>
-                <w:color w:val="FFFFFF"/>
-                <w:sz w:val="17"/>
-              </w:rPr>
-              <w:t>Costo estimado</w:t>
-            </w:r>
-          </w:p>
-        </w:tc>
-        <w:tc>
-          <w:tcPr>
-            <w:tcW w:type="dxa" w:w="3360"/>
-            <w:vAlign w:val="center"/>
-            <w:shd w:fill="1F4E79"/>
-          </w:tcPr>
-          <w:p>
-            <w:r/>
-            <w:r>
-              <w:rPr>
-                <w:b/>
-                <w:color w:val="FFFFFF"/>
-                <w:sz w:val="17"/>
-              </w:rPr>
-              <w:t>Justificacion</w:t>
-            </w:r>
-          </w:p>
-        </w:tc>
-      </w:tr>
-      <w:tr>
-        <w:tc>
-          <w:tcPr>
-            <w:tcW w:type="dxa" w:w="3360"/>
-            <w:vAlign w:val="center"/>
-          </w:tcPr>
-          <w:p>
-            <w:r/>
-            <w:r>
-              <w:rPr>
-                <w:b w:val="0"/>
-                <w:sz w:val="17"/>
-              </w:rPr>
-              <w:t>Codigo fuente y herramientas</w:t>
-            </w:r>
-          </w:p>
-        </w:tc>
-        <w:tc>
-          <w:tcPr>
-            <w:tcW w:type="dxa" w:w="3360"/>
-            <w:vAlign w:val="center"/>
-          </w:tcPr>
-          <w:p>
-            <w:r/>
-            <w:r>
-              <w:rPr>
-                <w:b w:val="0"/>
-                <w:sz w:val="17"/>
-              </w:rPr>
-              <w:t>Bajo</w:t>
-            </w:r>
-          </w:p>
-        </w:tc>
-        <w:tc>
-          <w:tcPr>
-            <w:tcW w:type="dxa" w:w="3360"/>
-            <w:vAlign w:val="center"/>
-          </w:tcPr>
-          <w:p>
-            <w:r/>
-            <w:r>
-              <w:rPr>
-                <w:b w:val="0"/>
-                <w:sz w:val="17"/>
-              </w:rPr>
-              <w:t>Uso de Node.js, React, TypeScript y librerias open source.</w:t>
-            </w:r>
-          </w:p>
-        </w:tc>
-      </w:tr>
-      <w:tr>
-        <w:tc>
-          <w:tcPr>
-            <w:tcW w:type="dxa" w:w="3360"/>
-            <w:vAlign w:val="center"/>
-          </w:tcPr>
-          <w:p>
-            <w:r/>
-            <w:r>
-              <w:rPr>
-                <w:b w:val="0"/>
-                <w:sz w:val="17"/>
-              </w:rPr>
-              <w:t>Base de metadatos</w:t>
-            </w:r>
-          </w:p>
-        </w:tc>
-        <w:tc>
-          <w:tcPr>
-            <w:tcW w:type="dxa" w:w="3360"/>
-            <w:vAlign w:val="center"/>
-          </w:tcPr>
-          <w:p>
-            <w:r/>
-            <w:r>
-              <w:rPr>
-                <w:b w:val="0"/>
-                <w:sz w:val="17"/>
-              </w:rPr>
-              <w:t>Bajo/variable</w:t>
-            </w:r>
-          </w:p>
-        </w:tc>
-        <w:tc>
-          <w:tcPr>
-            <w:tcW w:type="dxa" w:w="3360"/>
-            <w:vAlign w:val="center"/>
-          </w:tcPr>
-          <w:p>
-            <w:r/>
-            <w:r>
-              <w:rPr>
-                <w:b w:val="0"/>
-                <w:sz w:val="17"/>
-              </w:rPr>
-              <w:t>Supabase/PostgreSQL puede operar en plan gratuito o academico.</w:t>
-            </w:r>
-          </w:p>
-        </w:tc>
-      </w:tr>
-      <w:tr>
-        <w:tc>
-          <w:tcPr>
-            <w:tcW w:type="dxa" w:w="3360"/>
-            <w:vAlign w:val="center"/>
-          </w:tcPr>
-          <w:p>
-            <w:r/>
-            <w:r>
-              <w:rPr>
-                <w:b w:val="0"/>
-                <w:sz w:val="17"/>
-              </w:rPr>
-              <w:t>Despliegue</w:t>
-            </w:r>
-          </w:p>
-        </w:tc>
-        <w:tc>
-          <w:tcPr>
-            <w:tcW w:type="dxa" w:w="3360"/>
-            <w:vAlign w:val="center"/>
-          </w:tcPr>
-          <w:p>
-            <w:r/>
-            <w:r>
-              <w:rPr>
-                <w:b w:val="0"/>
-                <w:sz w:val="17"/>
-              </w:rPr>
-              <w:t>Bajo/variable</w:t>
-            </w:r>
-          </w:p>
-        </w:tc>
-        <w:tc>
-          <w:tcPr>
-            <w:tcW w:type="dxa" w:w="3360"/>
-            <w:vAlign w:val="center"/>
-          </w:tcPr>
-          <w:p>
-            <w:r/>
-            <w:r>
-              <w:rPr>
-                <w:b w:val="0"/>
-                <w:sz w:val="17"/>
-              </w:rPr>
-              <w:t>Render permite despliegue de prueba; produccion depende de capacidad requerida.</w:t>
-            </w:r>
-          </w:p>
-        </w:tc>
-      </w:tr>
-      <w:tr>
-        <w:tc>
-          <w:tcPr>
-            <w:tcW w:type="dxa" w:w="3360"/>
-            <w:vAlign w:val="center"/>
-          </w:tcPr>
-          <w:p>
-            <w:r/>
-            <w:r>
-              <w:rPr>
-                <w:b w:val="0"/>
-                <w:sz w:val="17"/>
-              </w:rPr>
-              <w:t>SQL Server para .bak</w:t>
-            </w:r>
-          </w:p>
-        </w:tc>
-        <w:tc>
-          <w:tcPr>
-            <w:tcW w:type="dxa" w:w="3360"/>
-            <w:vAlign w:val="center"/>
-          </w:tcPr>
-          <w:p>
-            <w:r/>
-            <w:r>
-              <w:rPr>
-                <w:b w:val="0"/>
-                <w:sz w:val="17"/>
-              </w:rPr>
-              <w:t>Medio</w:t>
-            </w:r>
-          </w:p>
-        </w:tc>
-        <w:tc>
-          <w:tcPr>
-            <w:tcW w:type="dxa" w:w="3360"/>
-            <w:vAlign w:val="center"/>
-          </w:tcPr>
-          <w:p>
-            <w:r/>
-            <w:r>
-              <w:rPr>
-                <w:b w:val="0"/>
-                <w:sz w:val="17"/>
-              </w:rPr>
-              <w:t>Solo necesario si se importan respaldos .bak; alternativa: script .sql.</w:t>
-            </w:r>
-          </w:p>
-        </w:tc>
-      </w:tr>
-      <w:tr>
-        <w:tc>
-          <w:tcPr>
-            <w:tcW w:type="dxa" w:w="3360"/>
-            <w:vAlign w:val="center"/>
-          </w:tcPr>
-          <w:p>
-            <w:r/>
-            <w:r>
-              <w:rPr>
-                <w:b w:val="0"/>
-                <w:sz w:val="17"/>
-              </w:rPr>
-              <w:t>Mantenimiento</w:t>
-            </w:r>
-          </w:p>
-        </w:tc>
-        <w:tc>
-          <w:tcPr>
-            <w:tcW w:type="dxa" w:w="3360"/>
-            <w:vAlign w:val="center"/>
-          </w:tcPr>
-          <w:p>
-            <w:r/>
-            <w:r>
-              <w:rPr>
-                <w:b w:val="0"/>
-                <w:sz w:val="17"/>
-              </w:rPr>
-              <w:t>Medio</w:t>
-            </w:r>
-          </w:p>
-        </w:tc>
-        <w:tc>
-          <w:tcPr>
-            <w:tcW w:type="dxa" w:w="3360"/>
-            <w:vAlign w:val="center"/>
-          </w:tcPr>
-          <w:p>
-            <w:r/>
-            <w:r>
-              <w:rPr>
-                <w:b w:val="0"/>
-                <w:sz w:val="17"/>
-              </w:rPr>
-              <w:t>Requiere actualizacion de dependencias y pruebas por motor.</w:t>
-            </w:r>
-          </w:p>
-        </w:tc>
-      </w:tr>
-    </w:tbl>
-    <w:p/>
-    <w:p>
-      <w:pPr>
-        <w:pStyle w:val="Heading1"/>
-      </w:pPr>
-      <w:r>
-        <w:rPr>
-          <w:rFonts w:ascii="Arial" w:hAnsi="Arial"/>
-          <w:sz w:val="20"/>
-        </w:rPr>
-        <w:t>6. Factibilidad operativa</w:t>
-      </w:r>
-    </w:p>
-    <w:tbl>
-      <w:tblPr>
-        <w:tblStyle w:val="TableGrid"/>
-        <w:tblW w:type="auto" w:w="0"/>
-        <w:jc w:val="center"/>
-        <w:tblLook w:firstColumn="1" w:firstRow="1" w:lastColumn="0" w:lastRow="0" w:noHBand="0" w:noVBand="1" w:val="04A0"/>
-      </w:tblPr>
-      <w:tblGrid>
-        <w:gridCol w:w="3360"/>
-        <w:gridCol w:w="3360"/>
-        <w:gridCol w:w="3360"/>
-      </w:tblGrid>
-      <w:tr>
-        <w:tc>
-          <w:tcPr>
-            <w:tcW w:type="dxa" w:w="3360"/>
-            <w:vAlign w:val="center"/>
-            <w:shd w:fill="1F4E79"/>
-          </w:tcPr>
-          <w:p>
-            <w:r/>
-            <w:r>
-              <w:rPr>
-                <w:b/>
-                <w:color w:val="FFFFFF"/>
-                <w:sz w:val="17"/>
-              </w:rPr>
-              <w:t>Usuario</w:t>
-            </w:r>
-          </w:p>
-        </w:tc>
-        <w:tc>
-          <w:tcPr>
-            <w:tcW w:type="dxa" w:w="3360"/>
-            <w:vAlign w:val="center"/>
-            <w:shd w:fill="1F4E79"/>
-          </w:tcPr>
-          <w:p>
-            <w:r/>
-            <w:r>
-              <w:rPr>
-                <w:b/>
-                <w:color w:val="FFFFFF"/>
-                <w:sz w:val="17"/>
-              </w:rPr>
-              <w:t>Operacion</w:t>
-            </w:r>
-          </w:p>
-        </w:tc>
-        <w:tc>
-          <w:tcPr>
-            <w:tcW w:type="dxa" w:w="3360"/>
-            <w:vAlign w:val="center"/>
-            <w:shd w:fill="1F4E79"/>
-          </w:tcPr>
-          <w:p>
-            <w:r/>
-            <w:r>
-              <w:rPr>
-                <w:b/>
-                <w:color w:val="FFFFFF"/>
-                <w:sz w:val="17"/>
-              </w:rPr>
-              <w:t>Apoyo del sistema</w:t>
-            </w:r>
-          </w:p>
-        </w:tc>
-      </w:tr>
-      <w:tr>
-        <w:tc>
-          <w:tcPr>
-            <w:tcW w:type="dxa" w:w="3360"/>
-            <w:vAlign w:val="center"/>
-          </w:tcPr>
-          <w:p>
-            <w:r/>
-            <w:r>
-              <w:rPr>
-                <w:b w:val="0"/>
-                <w:sz w:val="17"/>
-              </w:rPr>
-              <w:t>Usuario autenticado</w:t>
-            </w:r>
-          </w:p>
-        </w:tc>
-        <w:tc>
-          <w:tcPr>
-            <w:tcW w:type="dxa" w:w="3360"/>
-            <w:vAlign w:val="center"/>
-          </w:tcPr>
-          <w:p>
-            <w:r/>
-            <w:r>
-              <w:rPr>
-                <w:b w:val="0"/>
-                <w:sz w:val="17"/>
-              </w:rPr>
-              <w:t>Importar base desde PC</w:t>
-            </w:r>
-          </w:p>
-        </w:tc>
-        <w:tc>
-          <w:tcPr>
-            <w:tcW w:type="dxa" w:w="3360"/>
-            <w:vAlign w:val="center"/>
-          </w:tcPr>
-          <w:p>
-            <w:r/>
-            <w:r>
-              <w:rPr>
-                <w:b w:val="0"/>
-                <w:sz w:val="17"/>
-              </w:rPr>
-              <w:t>Deteccion de motor, validacion de extension y tamano.</w:t>
-            </w:r>
-          </w:p>
-        </w:tc>
-      </w:tr>
-      <w:tr>
-        <w:tc>
-          <w:tcPr>
-            <w:tcW w:type="dxa" w:w="3360"/>
-            <w:vAlign w:val="center"/>
-          </w:tcPr>
-          <w:p>
-            <w:r/>
-            <w:r>
-              <w:rPr>
-                <w:b w:val="0"/>
-                <w:sz w:val="17"/>
-              </w:rPr>
-              <w:t>Usuario autenticado</w:t>
-            </w:r>
-          </w:p>
-        </w:tc>
-        <w:tc>
-          <w:tcPr>
-            <w:tcW w:type="dxa" w:w="3360"/>
-            <w:vAlign w:val="center"/>
-          </w:tcPr>
-          <w:p>
-            <w:r/>
-            <w:r>
-              <w:rPr>
-                <w:b w:val="0"/>
-                <w:sz w:val="17"/>
-              </w:rPr>
-              <w:t>Replicar tablas</w:t>
-            </w:r>
-          </w:p>
-        </w:tc>
-        <w:tc>
-          <w:tcPr>
-            <w:tcW w:type="dxa" w:w="3360"/>
-            <w:vAlign w:val="center"/>
-          </w:tcPr>
-          <w:p>
-            <w:r/>
-            <w:r>
-              <w:rPr>
-                <w:b w:val="0"/>
-                <w:sz w:val="17"/>
-              </w:rPr>
-              <w:t>Wizard de cuatro pasos: conexiones, tablas, mapeo y validacion.</w:t>
-            </w:r>
-          </w:p>
-        </w:tc>
-      </w:tr>
-      <w:tr>
-        <w:tc>
-          <w:tcPr>
-            <w:tcW w:type="dxa" w:w="3360"/>
-            <w:vAlign w:val="center"/>
-          </w:tcPr>
-          <w:p>
-            <w:r/>
-            <w:r>
-              <w:rPr>
-                <w:b w:val="0"/>
-                <w:sz w:val="17"/>
-              </w:rPr>
-              <w:t>Administrador</w:t>
-            </w:r>
-          </w:p>
-        </w:tc>
-        <w:tc>
-          <w:tcPr>
-            <w:tcW w:type="dxa" w:w="3360"/>
-            <w:vAlign w:val="center"/>
-          </w:tcPr>
-          <w:p>
-            <w:r/>
-            <w:r>
-              <w:rPr>
-                <w:b w:val="0"/>
-                <w:sz w:val="17"/>
-              </w:rPr>
-              <w:t>Gestionar usuarios</w:t>
-            </w:r>
-          </w:p>
-        </w:tc>
-        <w:tc>
-          <w:tcPr>
-            <w:tcW w:type="dxa" w:w="3360"/>
-            <w:vAlign w:val="center"/>
-          </w:tcPr>
-          <w:p>
-            <w:r/>
-            <w:r>
-              <w:rPr>
-                <w:b w:val="0"/>
-                <w:sz w:val="17"/>
-              </w:rPr>
-              <w:t>Pantalla /admin/users y rutas protegidas por rol.</w:t>
-            </w:r>
-          </w:p>
-        </w:tc>
-      </w:tr>
-      <w:tr>
-        <w:tc>
-          <w:tcPr>
-            <w:tcW w:type="dxa" w:w="3360"/>
-            <w:vAlign w:val="center"/>
-          </w:tcPr>
-          <w:p>
-            <w:r/>
-            <w:r>
-              <w:rPr>
-                <w:b w:val="0"/>
-                <w:sz w:val="17"/>
-              </w:rPr>
-              <w:t>Evaluador</w:t>
-            </w:r>
-          </w:p>
-        </w:tc>
-        <w:tc>
-          <w:tcPr>
-            <w:tcW w:type="dxa" w:w="3360"/>
-            <w:vAlign w:val="center"/>
-          </w:tcPr>
-          <w:p>
-            <w:r/>
-            <w:r>
-              <w:rPr>
-                <w:b w:val="0"/>
-                <w:sz w:val="17"/>
-              </w:rPr>
-              <w:t>Revisar funcionamiento</w:t>
-            </w:r>
-          </w:p>
-        </w:tc>
-        <w:tc>
-          <w:tcPr>
-            <w:tcW w:type="dxa" w:w="3360"/>
-            <w:vAlign w:val="center"/>
-          </w:tcPr>
-          <w:p>
-            <w:r/>
-            <w:r>
-              <w:rPr>
-                <w:b w:val="0"/>
-                <w:sz w:val="17"/>
-              </w:rPr>
-              <w:t>README, documentos FD, extension VS Code y chatbox.</w:t>
-            </w:r>
-          </w:p>
-        </w:tc>
-      </w:tr>
-    </w:tbl>
-    <w:p/>
-    <w:p>
-      <w:pPr>
-        <w:pStyle w:val="Heading1"/>
-      </w:pPr>
-      <w:r>
-        <w:rPr>
-          <w:rFonts w:ascii="Arial" w:hAnsi="Arial"/>
-          <w:sz w:val="20"/>
-        </w:rPr>
-        <w:t>7. Riesgos y mitigaciones</w:t>
       </w:r>
     </w:p>
     <w:tbl>
@@ -2090,17 +156,15 @@
           <w:tcPr>
             <w:tcW w:type="dxa" w:w="2520"/>
             <w:vAlign w:val="center"/>
-            <w:shd w:fill="1F4E79"/>
           </w:tcPr>
           <w:p>
             <w:r/>
             <w:r>
               <w:rPr>
                 <w:b/>
-                <w:color w:val="FFFFFF"/>
-                <w:sz w:val="17"/>
+                <w:sz w:val="18"/>
               </w:rPr>
-              <w:t>Riesgo</w:t>
+              <w:t>Versión</w:t>
             </w:r>
           </w:p>
         </w:tc>
@@ -2108,17 +172,15 @@
           <w:tcPr>
             <w:tcW w:type="dxa" w:w="2520"/>
             <w:vAlign w:val="center"/>
-            <w:shd w:fill="1F4E79"/>
           </w:tcPr>
           <w:p>
             <w:r/>
             <w:r>
               <w:rPr>
                 <w:b/>
-                <w:color w:val="FFFFFF"/>
-                <w:sz w:val="17"/>
+                <w:sz w:val="18"/>
               </w:rPr>
-              <w:t>Impacto</w:t>
+              <w:t>Fecha</w:t>
             </w:r>
           </w:p>
         </w:tc>
@@ -2126,17 +188,15 @@
           <w:tcPr>
             <w:tcW w:type="dxa" w:w="2520"/>
             <w:vAlign w:val="center"/>
-            <w:shd w:fill="1F4E79"/>
           </w:tcPr>
           <w:p>
             <w:r/>
             <w:r>
               <w:rPr>
                 <w:b/>
-                <w:color w:val="FFFFFF"/>
-                <w:sz w:val="17"/>
+                <w:sz w:val="18"/>
               </w:rPr>
-              <w:t>Probabilidad</w:t>
+              <w:t>Responsable</w:t>
             </w:r>
           </w:p>
         </w:tc>
@@ -2144,17 +204,15 @@
           <w:tcPr>
             <w:tcW w:type="dxa" w:w="2520"/>
             <w:vAlign w:val="center"/>
-            <w:shd w:fill="1F4E79"/>
           </w:tcPr>
           <w:p>
             <w:r/>
             <w:r>
               <w:rPr>
                 <w:b/>
-                <w:color w:val="FFFFFF"/>
-                <w:sz w:val="17"/>
+                <w:sz w:val="18"/>
               </w:rPr>
-              <w:t>Mitigacion</w:t>
+              <w:t>Descripción</w:t>
             </w:r>
           </w:p>
         </w:tc>
@@ -2170,9 +228,9 @@
             <w:r>
               <w:rPr>
                 <w:b w:val="0"/>
-                <w:sz w:val="17"/>
+                <w:sz w:val="18"/>
               </w:rPr>
-              <w:t>Tipos incompatibles entre motores</w:t>
+              <w:t>1.0</w:t>
             </w:r>
           </w:p>
         </w:tc>
@@ -2186,9 +244,9 @@
             <w:r>
               <w:rPr>
                 <w:b w:val="0"/>
-                <w:sz w:val="17"/>
+                <w:sz w:val="18"/>
               </w:rPr>
-              <w:t>Errores de insercion o truncamiento</w:t>
+              <w:t>Julio 2026</w:t>
             </w:r>
           </w:p>
         </w:tc>
@@ -2202,9 +260,9 @@
             <w:r>
               <w:rPr>
                 <w:b w:val="0"/>
-                <w:sz w:val="17"/>
+                <w:sz w:val="18"/>
               </w:rPr>
-              <w:t>Media</w:t>
+              <w:t>CARBAJAL - LLANOS - YUPA - ZAPANA</w:t>
             </w:r>
           </w:p>
         </w:tc>
@@ -2218,9 +276,9 @@
             <w:r>
               <w:rPr>
                 <w:b w:val="0"/>
-                <w:sz w:val="17"/>
+                <w:sz w:val="18"/>
               </w:rPr>
-              <w:t>Mapeo de columnas, transformaciones y vista previa.</w:t>
+              <w:t>Documento base del proyecto.</w:t>
             </w:r>
           </w:p>
         </w:tc>
@@ -2236,9 +294,9 @@
             <w:r>
               <w:rPr>
                 <w:b w:val="0"/>
-                <w:sz w:val="17"/>
+                <w:sz w:val="18"/>
               </w:rPr>
-              <w:t>Archivo invalido o corrupto</w:t>
+              <w:t>2.0</w:t>
             </w:r>
           </w:p>
         </w:tc>
@@ -2252,9 +310,9 @@
             <w:r>
               <w:rPr>
                 <w:b w:val="0"/>
-                <w:sz w:val="17"/>
+                <w:sz w:val="18"/>
               </w:rPr>
-              <w:t>Fallo de importacion</w:t>
+              <w:t>Julio 2026</w:t>
             </w:r>
           </w:p>
         </w:tc>
@@ -2268,9 +326,9 @@
             <w:r>
               <w:rPr>
                 <w:b w:val="0"/>
-                <w:sz w:val="17"/>
+                <w:sz w:val="18"/>
               </w:rPr>
-              <w:t>Media</w:t>
+              <w:t>CARBAJAL - LLANOS - YUPA - ZAPANA</w:t>
             </w:r>
           </w:p>
         </w:tc>
@@ -2284,207 +342,9 @@
             <w:r>
               <w:rPr>
                 <w:b w:val="0"/>
-                <w:sz w:val="17"/>
+                <w:sz w:val="18"/>
               </w:rPr>
-              <w:t>Validacion de cabecera SQLite, extension, binario y contenido vacio.</w:t>
-            </w:r>
-          </w:p>
-        </w:tc>
-      </w:tr>
-      <w:tr>
-        <w:tc>
-          <w:tcPr>
-            <w:tcW w:type="dxa" w:w="2520"/>
-            <w:vAlign w:val="center"/>
-          </w:tcPr>
-          <w:p>
-            <w:r/>
-            <w:r>
-              <w:rPr>
-                <w:b w:val="0"/>
-                <w:sz w:val="17"/>
-              </w:rPr>
-              <w:t>.bak sin infraestructura SQL Server</w:t>
-            </w:r>
-          </w:p>
-        </w:tc>
-        <w:tc>
-          <w:tcPr>
-            <w:tcW w:type="dxa" w:w="2520"/>
-            <w:vAlign w:val="center"/>
-          </w:tcPr>
-          <w:p>
-            <w:r/>
-            <w:r>
-              <w:rPr>
-                <w:b w:val="0"/>
-                <w:sz w:val="17"/>
-              </w:rPr>
-              <w:t>No se restaura el respaldo</w:t>
-            </w:r>
-          </w:p>
-        </w:tc>
-        <w:tc>
-          <w:tcPr>
-            <w:tcW w:type="dxa" w:w="2520"/>
-            <w:vAlign w:val="center"/>
-          </w:tcPr>
-          <w:p>
-            <w:r/>
-            <w:r>
-              <w:rPr>
-                <w:b w:val="0"/>
-                <w:sz w:val="17"/>
-              </w:rPr>
-              <w:t>Alta</w:t>
-            </w:r>
-          </w:p>
-        </w:tc>
-        <w:tc>
-          <w:tcPr>
-            <w:tcW w:type="dxa" w:w="2520"/>
-            <w:vAlign w:val="center"/>
-          </w:tcPr>
-          <w:p>
-            <w:r/>
-            <w:r>
-              <w:rPr>
-                <w:b w:val="0"/>
-                <w:sz w:val="17"/>
-              </w:rPr>
-              <w:t>Variables SQLSERVER_RESTORE_* obligatorias y alternativa .sql.</w:t>
-            </w:r>
-          </w:p>
-        </w:tc>
-      </w:tr>
-      <w:tr>
-        <w:tc>
-          <w:tcPr>
-            <w:tcW w:type="dxa" w:w="2520"/>
-            <w:vAlign w:val="center"/>
-          </w:tcPr>
-          <w:p>
-            <w:r/>
-            <w:r>
-              <w:rPr>
-                <w:b w:val="0"/>
-                <w:sz w:val="17"/>
-              </w:rPr>
-              <w:t>Credenciales expuestas</w:t>
-            </w:r>
-          </w:p>
-        </w:tc>
-        <w:tc>
-          <w:tcPr>
-            <w:tcW w:type="dxa" w:w="2520"/>
-            <w:vAlign w:val="center"/>
-          </w:tcPr>
-          <w:p>
-            <w:r/>
-            <w:r>
-              <w:rPr>
-                <w:b w:val="0"/>
-                <w:sz w:val="17"/>
-              </w:rPr>
-              <w:t>Riesgo de seguridad</w:t>
-            </w:r>
-          </w:p>
-        </w:tc>
-        <w:tc>
-          <w:tcPr>
-            <w:tcW w:type="dxa" w:w="2520"/>
-            <w:vAlign w:val="center"/>
-          </w:tcPr>
-          <w:p>
-            <w:r/>
-            <w:r>
-              <w:rPr>
-                <w:b w:val="0"/>
-                <w:sz w:val="17"/>
-              </w:rPr>
-              <w:t>Baja</w:t>
-            </w:r>
-          </w:p>
-        </w:tc>
-        <w:tc>
-          <w:tcPr>
-            <w:tcW w:type="dxa" w:w="2520"/>
-            <w:vAlign w:val="center"/>
-          </w:tcPr>
-          <w:p>
-            <w:r/>
-            <w:r>
-              <w:rPr>
-                <w:b w:val="0"/>
-                <w:sz w:val="17"/>
-              </w:rPr>
-              <w:t>Cifrado, no retorno de contrasenas y .env ignorado.</w:t>
-            </w:r>
-          </w:p>
-        </w:tc>
-      </w:tr>
-      <w:tr>
-        <w:tc>
-          <w:tcPr>
-            <w:tcW w:type="dxa" w:w="2520"/>
-            <w:vAlign w:val="center"/>
-          </w:tcPr>
-          <w:p>
-            <w:r/>
-            <w:r>
-              <w:rPr>
-                <w:b w:val="0"/>
-                <w:sz w:val="17"/>
-              </w:rPr>
-              <w:t>Disco temporal en Render</w:t>
-            </w:r>
-          </w:p>
-        </w:tc>
-        <w:tc>
-          <w:tcPr>
-            <w:tcW w:type="dxa" w:w="2520"/>
-            <w:vAlign w:val="center"/>
-          </w:tcPr>
-          <w:p>
-            <w:r/>
-            <w:r>
-              <w:rPr>
-                <w:b w:val="0"/>
-                <w:sz w:val="17"/>
-              </w:rPr>
-              <w:t>Perdida de archivos</w:t>
-            </w:r>
-          </w:p>
-        </w:tc>
-        <w:tc>
-          <w:tcPr>
-            <w:tcW w:type="dxa" w:w="2520"/>
-            <w:vAlign w:val="center"/>
-          </w:tcPr>
-          <w:p>
-            <w:r/>
-            <w:r>
-              <w:rPr>
-                <w:b w:val="0"/>
-                <w:sz w:val="17"/>
-              </w:rPr>
-              <w:t>Media</w:t>
-            </w:r>
-          </w:p>
-        </w:tc>
-        <w:tc>
-          <w:tcPr>
-            <w:tcW w:type="dxa" w:w="2520"/>
-            <w:vAlign w:val="center"/>
-          </w:tcPr>
-          <w:p>
-            <w:r/>
-            <w:r>
-              <w:rPr>
-                <w:b w:val="0"/>
-                <w:sz w:val="17"/>
-              </w:rPr>
-              <w:t>Catalogos comprimidos en PostgreSQL/Supabase en produccion.</w:t>
+              <w:t>Ampliación y alineamiento con la implementación real de la carpeta web.</w:t>
             </w:r>
           </w:p>
         </w:tc>
@@ -2496,20 +356,52 @@
         <w:pStyle w:val="Heading1"/>
       </w:pPr>
       <w:r>
-        <w:rPr>
-          <w:rFonts w:ascii="Arial" w:hAnsi="Arial"/>
-          <w:sz w:val="20"/>
-        </w:rPr>
-        <w:t>8. Conclusion</w:t>
+        <w:t>Índice general</w:t>
+      </w:r>
+    </w:p>
+    <w:p>
+      <w:pPr>
+        <w:pStyle w:val="ListNumber"/>
+      </w:pPr>
+      <w:r>
+        <w:t>Introducción</w:t>
+      </w:r>
+    </w:p>
+    <w:p>
+      <w:pPr>
+        <w:pStyle w:val="ListNumber"/>
+      </w:pPr>
+      <w:r>
+        <w:t>Contexto y alcance</w:t>
+      </w:r>
+    </w:p>
+    <w:p>
+      <w:pPr>
+        <w:pStyle w:val="ListNumber"/>
+      </w:pPr>
+      <w:r>
+        <w:t>Desarrollo del documento</w:t>
+      </w:r>
+    </w:p>
+    <w:p>
+      <w:pPr>
+        <w:pStyle w:val="ListNumber"/>
+      </w:pPr>
+      <w:r>
+        <w:t>Diagramas y evidencias</w:t>
+      </w:r>
+    </w:p>
+    <w:p>
+      <w:pPr>
+        <w:pStyle w:val="ListNumber"/>
+      </w:pPr>
+      <w:r>
+        <w:t>Conclusiones y recomendaciones</w:t>
       </w:r>
     </w:p>
     <w:p>
       <w:r>
-        <w:rPr>
-          <w:rFonts w:ascii="Arial" w:hAnsi="Arial"/>
-          <w:sz w:val="20"/>
-        </w:rPr>
-        <w:t>El proyecto es factible tecnica, economica y operativamente para un entorno academico y de demostracion. La mayor restriccion corresponde a respaldos SQL Server .bak, que necesitan infraestructura externa; sin embargo, el sistema ofrece alternativa mediante scripts SQL y formatos de archivo ampliamente usados.</w:t>
+        <w:br w:type="page"/>
       </w:r>
     </w:p>
     <w:p>
@@ -2517,15 +409,246 @@
         <w:pStyle w:val="Heading1"/>
       </w:pPr>
       <w:r>
-        <w:t>Anexo de diagramas visuales</w:t>
+        <w:t>1. Introducción</w:t>
       </w:r>
     </w:p>
     <w:p>
       <w:r>
+        <w:t>Este documento evalúa la viabilidad de Drop Nexus, aplicación web para importar bases de datos o archivos compatibles, normalizar su estructura en catálogos, replicar tablas entre origen y destino, registrar progreso y descargar resultados modificados. El análisis toma como fuente la implementación real en la carpeta web.</w:t>
+      </w:r>
+    </w:p>
+    <w:p>
+      <w:pPr>
+        <w:pStyle w:val="Heading1"/>
+      </w:pPr>
+      <w:r>
+        <w:t>2. Descripción del proyecto</w:t>
+      </w:r>
+    </w:p>
+    <w:tbl>
+      <w:tblPr>
+        <w:tblStyle w:val="TableGrid"/>
+        <w:tblW w:type="auto" w:w="0"/>
+        <w:jc w:val="center"/>
+        <w:tblLook w:firstColumn="1" w:firstRow="1" w:lastColumn="0" w:lastRow="0" w:noHBand="0" w:noVBand="1" w:val="04A0"/>
+      </w:tblPr>
+      <w:tblGrid>
+        <w:gridCol w:w="5040"/>
+        <w:gridCol w:w="5040"/>
+      </w:tblGrid>
+      <w:tr>
+        <w:tc>
+          <w:tcPr>
+            <w:tcW w:type="dxa" w:w="5040"/>
+            <w:vAlign w:val="center"/>
+          </w:tcPr>
+          <w:p>
+            <w:r/>
+            <w:r>
+              <w:rPr>
+                <w:b/>
+                <w:sz w:val="18"/>
+              </w:rPr>
+              <w:t>Elemento</w:t>
+            </w:r>
+          </w:p>
+        </w:tc>
+        <w:tc>
+          <w:tcPr>
+            <w:tcW w:type="dxa" w:w="5040"/>
+            <w:vAlign w:val="center"/>
+          </w:tcPr>
+          <w:p>
+            <w:r/>
+            <w:r>
+              <w:rPr>
+                <w:b/>
+                <w:sz w:val="18"/>
+              </w:rPr>
+              <w:t>Descripción</w:t>
+            </w:r>
+          </w:p>
+        </w:tc>
+      </w:tr>
+      <w:tr>
+        <w:tc>
+          <w:tcPr>
+            <w:tcW w:type="dxa" w:w="5040"/>
+            <w:vAlign w:val="center"/>
+          </w:tcPr>
+          <w:p>
+            <w:r/>
+            <w:r>
+              <w:rPr>
+                <w:b w:val="0"/>
+                <w:sz w:val="18"/>
+              </w:rPr>
+              <w:t>Nombre</w:t>
+            </w:r>
+          </w:p>
+        </w:tc>
+        <w:tc>
+          <w:tcPr>
+            <w:tcW w:type="dxa" w:w="5040"/>
+            <w:vAlign w:val="center"/>
+          </w:tcPr>
+          <w:p>
+            <w:r/>
+            <w:r>
+              <w:rPr>
+                <w:b w:val="0"/>
+                <w:sz w:val="18"/>
+              </w:rPr>
+              <w:t>Drop Nexus - Replicador de Datos entre Bases de Datos</w:t>
+            </w:r>
+          </w:p>
+        </w:tc>
+      </w:tr>
+      <w:tr>
+        <w:tc>
+          <w:tcPr>
+            <w:tcW w:type="dxa" w:w="5040"/>
+            <w:vAlign w:val="center"/>
+          </w:tcPr>
+          <w:p>
+            <w:r/>
+            <w:r>
+              <w:rPr>
+                <w:b w:val="0"/>
+                <w:sz w:val="18"/>
+              </w:rPr>
+              <w:t>Objetivo</w:t>
+            </w:r>
+          </w:p>
+        </w:tc>
+        <w:tc>
+          <w:tcPr>
+            <w:tcW w:type="dxa" w:w="5040"/>
+            <w:vAlign w:val="center"/>
+          </w:tcPr>
+          <w:p>
+            <w:r/>
+            <w:r>
+              <w:rPr>
+                <w:b w:val="0"/>
+                <w:sz w:val="18"/>
+              </w:rPr>
+              <w:t>Implementar una consola web multiusuario para replicación de datos heterogénea.</w:t>
+            </w:r>
+          </w:p>
+        </w:tc>
+      </w:tr>
+      <w:tr>
+        <w:tc>
+          <w:tcPr>
+            <w:tcW w:type="dxa" w:w="5040"/>
+            <w:vAlign w:val="center"/>
+          </w:tcPr>
+          <w:p>
+            <w:r/>
+            <w:r>
+              <w:rPr>
+                <w:b w:val="0"/>
+                <w:sz w:val="18"/>
+              </w:rPr>
+              <w:t>Stack</w:t>
+            </w:r>
+          </w:p>
+        </w:tc>
+        <w:tc>
+          <w:tcPr>
+            <w:tcW w:type="dxa" w:w="5040"/>
+            <w:vAlign w:val="center"/>
+          </w:tcPr>
+          <w:p>
+            <w:r/>
+            <w:r>
+              <w:rPr>
+                <w:b w:val="0"/>
+                <w:sz w:val="18"/>
+              </w:rPr>
+              <w:t>React 19, Vite, Tailwind CSS, Fastify 5, TypeScript, PostgreSQL/Supabase y Render</w:t>
+            </w:r>
+          </w:p>
+        </w:tc>
+      </w:tr>
+      <w:tr>
+        <w:tc>
+          <w:tcPr>
+            <w:tcW w:type="dxa" w:w="5040"/>
+            <w:vAlign w:val="center"/>
+          </w:tcPr>
+          <w:p>
+            <w:r/>
+            <w:r>
+              <w:rPr>
+                <w:b w:val="0"/>
+                <w:sz w:val="18"/>
+              </w:rPr>
+              <w:t>Runtime</w:t>
+            </w:r>
+          </w:p>
+        </w:tc>
+        <w:tc>
+          <w:tcPr>
+            <w:tcW w:type="dxa" w:w="5040"/>
+            <w:vAlign w:val="center"/>
+          </w:tcPr>
+          <w:p>
+            <w:r/>
+            <w:r>
+              <w:rPr>
+                <w:b w:val="0"/>
+                <w:sz w:val="18"/>
+              </w:rPr>
+              <w:t>Node.js 22.14.0 y npm 10 o superior</w:t>
+            </w:r>
+          </w:p>
+        </w:tc>
+      </w:tr>
+      <w:tr>
+        <w:tc>
+          <w:tcPr>
+            <w:tcW w:type="dxa" w:w="5040"/>
+            <w:vAlign w:val="center"/>
+          </w:tcPr>
+          <w:p>
+            <w:r/>
+            <w:r>
+              <w:rPr>
+                <w:b w:val="0"/>
+                <w:sz w:val="18"/>
+              </w:rPr>
+              <w:t>Persistencia</w:t>
+            </w:r>
+          </w:p>
+        </w:tc>
+        <w:tc>
+          <w:tcPr>
+            <w:tcW w:type="dxa" w:w="5040"/>
+            <w:vAlign w:val="center"/>
+          </w:tcPr>
+          <w:p>
+            <w:r/>
+            <w:r>
+              <w:rPr>
+                <w:b w:val="0"/>
+                <w:sz w:val="18"/>
+              </w:rPr>
+              <w:t>PostgreSQL/Supabase para usuarios, configuraciones, trabajos y catálogos comprimidos</w:t>
+            </w:r>
+          </w:p>
+        </w:tc>
+      </w:tr>
+    </w:tbl>
+    <w:p/>
+    <w:p/>
+    <w:p>
+      <w:r>
         <w:drawing>
           <wp:inline xmlns:a="http://schemas.openxmlformats.org/drawingml/2006/main" xmlns:pic="http://schemas.openxmlformats.org/drawingml/2006/picture">
-            <wp:extent cx="6126480" cy="3471672"/>
-            <wp:docPr id="1" name="Picture 1"/>
+            <wp:extent cx="6126480" cy="3719649"/>
+            <wp:docPr id="2" name="Picture 2"/>
             <wp:cNvGraphicFramePr>
               <a:graphicFrameLocks noChangeAspect="1"/>
             </wp:cNvGraphicFramePr>
@@ -2533,11 +656,11 @@
               <a:graphicData uri="http://schemas.openxmlformats.org/drawingml/2006/picture">
                 <pic:pic>
                   <pic:nvPicPr>
-                    <pic:cNvPr id="0" name="image.png"/>
+                    <pic:cNvPr id="0" name="architecture.png"/>
                     <pic:cNvPicPr/>
                   </pic:nvPicPr>
                   <pic:blipFill>
-                    <a:blip r:embed="rId9"/>
+                    <a:blip r:embed="rId10"/>
                     <a:stretch>
                       <a:fillRect/>
                     </a:stretch>
@@ -2545,7 +668,7 @@
                   <pic:spPr>
                     <a:xfrm>
                       <a:off x="0" y="0"/>
-                      <a:ext cx="6126480" cy="3471672"/>
+                      <a:ext cx="6126480" cy="3719649"/>
                     </a:xfrm>
                     <a:prstGeom prst="rect"/>
                   </pic:spPr>
@@ -2554,6 +677,1675 @@
             </a:graphic>
           </wp:inline>
         </w:drawing>
+      </w:r>
+    </w:p>
+    <w:p>
+      <w:pPr>
+        <w:jc w:val="center"/>
+      </w:pPr>
+      <w:r>
+        <w:rPr>
+          <w:i/>
+          <w:sz w:val="18"/>
+        </w:rPr>
+        <w:t>Figura 1. Arquitectura usada para evaluar la factibilidad técnica.</w:t>
+      </w:r>
+    </w:p>
+    <w:p>
+      <w:pPr>
+        <w:pStyle w:val="Heading1"/>
+      </w:pPr>
+      <w:r>
+        <w:t>3. Factibilidad técnica</w:t>
+      </w:r>
+    </w:p>
+    <w:p>
+      <w:r>
+        <w:t>La solución es viable porque se apoya en tecnologías disponibles y coherentes con el despliegue definido: React 19, Vite, Tailwind, Fastify 5, TypeScript, PostgreSQL/Supabase y Render con Node.js 22.14.0.</w:t>
+      </w:r>
+    </w:p>
+    <w:tbl>
+      <w:tblPr>
+        <w:tblStyle w:val="TableGrid"/>
+        <w:tblW w:type="auto" w:w="0"/>
+        <w:jc w:val="center"/>
+        <w:tblLook w:firstColumn="1" w:firstRow="1" w:lastColumn="0" w:lastRow="0" w:noHBand="0" w:noVBand="1" w:val="04A0"/>
+      </w:tblPr>
+      <w:tblGrid>
+        <w:gridCol w:w="3360"/>
+        <w:gridCol w:w="3360"/>
+        <w:gridCol w:w="3360"/>
+      </w:tblGrid>
+      <w:tr>
+        <w:tc>
+          <w:tcPr>
+            <w:tcW w:type="dxa" w:w="3360"/>
+            <w:vAlign w:val="center"/>
+          </w:tcPr>
+          <w:p>
+            <w:r/>
+            <w:r>
+              <w:rPr>
+                <w:b/>
+                <w:sz w:val="18"/>
+              </w:rPr>
+              <w:t>Componente</w:t>
+            </w:r>
+          </w:p>
+        </w:tc>
+        <w:tc>
+          <w:tcPr>
+            <w:tcW w:type="dxa" w:w="3360"/>
+            <w:vAlign w:val="center"/>
+          </w:tcPr>
+          <w:p>
+            <w:r/>
+            <w:r>
+              <w:rPr>
+                <w:b/>
+                <w:sz w:val="18"/>
+              </w:rPr>
+              <w:t>Evidencia</w:t>
+            </w:r>
+          </w:p>
+        </w:tc>
+        <w:tc>
+          <w:tcPr>
+            <w:tcW w:type="dxa" w:w="3360"/>
+            <w:vAlign w:val="center"/>
+          </w:tcPr>
+          <w:p>
+            <w:r/>
+            <w:r>
+              <w:rPr>
+                <w:b/>
+                <w:sz w:val="18"/>
+              </w:rPr>
+              <w:t>Viabilidad</w:t>
+            </w:r>
+          </w:p>
+        </w:tc>
+      </w:tr>
+      <w:tr>
+        <w:tc>
+          <w:tcPr>
+            <w:tcW w:type="dxa" w:w="3360"/>
+            <w:vAlign w:val="center"/>
+          </w:tcPr>
+          <w:p>
+            <w:r/>
+            <w:r>
+              <w:rPr>
+                <w:b w:val="0"/>
+                <w:sz w:val="18"/>
+              </w:rPr>
+              <w:t>Frontend</w:t>
+            </w:r>
+          </w:p>
+        </w:tc>
+        <w:tc>
+          <w:tcPr>
+            <w:tcW w:type="dxa" w:w="3360"/>
+            <w:vAlign w:val="center"/>
+          </w:tcPr>
+          <w:p>
+            <w:r/>
+            <w:r>
+              <w:rPr>
+                <w:b w:val="0"/>
+                <w:sz w:val="18"/>
+              </w:rPr>
+              <w:t>React/Vite/Tailwind</w:t>
+            </w:r>
+          </w:p>
+        </w:tc>
+        <w:tc>
+          <w:tcPr>
+            <w:tcW w:type="dxa" w:w="3360"/>
+            <w:vAlign w:val="center"/>
+          </w:tcPr>
+          <w:p>
+            <w:r/>
+            <w:r>
+              <w:rPr>
+                <w:b w:val="0"/>
+                <w:sz w:val="18"/>
+              </w:rPr>
+              <w:t>Alta: interfaz modular y responsiva.</w:t>
+            </w:r>
+          </w:p>
+        </w:tc>
+      </w:tr>
+      <w:tr>
+        <w:tc>
+          <w:tcPr>
+            <w:tcW w:type="dxa" w:w="3360"/>
+            <w:vAlign w:val="center"/>
+          </w:tcPr>
+          <w:p>
+            <w:r/>
+            <w:r>
+              <w:rPr>
+                <w:b w:val="0"/>
+                <w:sz w:val="18"/>
+              </w:rPr>
+              <w:t>Backend</w:t>
+            </w:r>
+          </w:p>
+        </w:tc>
+        <w:tc>
+          <w:tcPr>
+            <w:tcW w:type="dxa" w:w="3360"/>
+            <w:vAlign w:val="center"/>
+          </w:tcPr>
+          <w:p>
+            <w:r/>
+            <w:r>
+              <w:rPr>
+                <w:b w:val="0"/>
+                <w:sz w:val="18"/>
+              </w:rPr>
+              <w:t>Fastify/TypeScript</w:t>
+            </w:r>
+          </w:p>
+        </w:tc>
+        <w:tc>
+          <w:tcPr>
+            <w:tcW w:type="dxa" w:w="3360"/>
+            <w:vAlign w:val="center"/>
+          </w:tcPr>
+          <w:p>
+            <w:r/>
+            <w:r>
+              <w:rPr>
+                <w:b w:val="0"/>
+                <w:sz w:val="18"/>
+              </w:rPr>
+              <w:t>Alta: rutas y servicios separados.</w:t>
+            </w:r>
+          </w:p>
+        </w:tc>
+      </w:tr>
+      <w:tr>
+        <w:tc>
+          <w:tcPr>
+            <w:tcW w:type="dxa" w:w="3360"/>
+            <w:vAlign w:val="center"/>
+          </w:tcPr>
+          <w:p>
+            <w:r/>
+            <w:r>
+              <w:rPr>
+                <w:b w:val="0"/>
+                <w:sz w:val="18"/>
+              </w:rPr>
+              <w:t>Catálogos</w:t>
+            </w:r>
+          </w:p>
+        </w:tc>
+        <w:tc>
+          <w:tcPr>
+            <w:tcW w:type="dxa" w:w="3360"/>
+            <w:vAlign w:val="center"/>
+          </w:tcPr>
+          <w:p>
+            <w:r/>
+            <w:r>
+              <w:rPr>
+                <w:b w:val="0"/>
+                <w:sz w:val="18"/>
+              </w:rPr>
+              <w:t>database_catalogs y FileDatabaseAdapter</w:t>
+            </w:r>
+          </w:p>
+        </w:tc>
+        <w:tc>
+          <w:tcPr>
+            <w:tcW w:type="dxa" w:w="3360"/>
+            <w:vAlign w:val="center"/>
+          </w:tcPr>
+          <w:p>
+            <w:r/>
+            <w:r>
+              <w:rPr>
+                <w:b w:val="0"/>
+                <w:sz w:val="18"/>
+              </w:rPr>
+              <w:t>Alta: evita depender de disco persistente.</w:t>
+            </w:r>
+          </w:p>
+        </w:tc>
+      </w:tr>
+      <w:tr>
+        <w:tc>
+          <w:tcPr>
+            <w:tcW w:type="dxa" w:w="3360"/>
+            <w:vAlign w:val="center"/>
+          </w:tcPr>
+          <w:p>
+            <w:r/>
+            <w:r>
+              <w:rPr>
+                <w:b w:val="0"/>
+                <w:sz w:val="18"/>
+              </w:rPr>
+              <w:t>Motores</w:t>
+            </w:r>
+          </w:p>
+        </w:tc>
+        <w:tc>
+          <w:tcPr>
+            <w:tcW w:type="dxa" w:w="3360"/>
+            <w:vAlign w:val="center"/>
+          </w:tcPr>
+          <w:p>
+            <w:r/>
+            <w:r>
+              <w:rPr>
+                <w:b w:val="0"/>
+                <w:sz w:val="18"/>
+              </w:rPr>
+              <w:t>PostgreSQL, MySQL, MariaDB, SQL Server, Oracle por script, SQLite, MongoDB, Excel/CSV</w:t>
+            </w:r>
+          </w:p>
+        </w:tc>
+        <w:tc>
+          <w:tcPr>
+            <w:tcW w:type="dxa" w:w="3360"/>
+            <w:vAlign w:val="center"/>
+          </w:tcPr>
+          <w:p>
+            <w:r/>
+            <w:r>
+              <w:rPr>
+                <w:b w:val="0"/>
+                <w:sz w:val="18"/>
+              </w:rPr>
+              <w:t>Media/Alta: .bak requiere infraestructura externa.</w:t>
+            </w:r>
+          </w:p>
+        </w:tc>
+      </w:tr>
+      <w:tr>
+        <w:tc>
+          <w:tcPr>
+            <w:tcW w:type="dxa" w:w="3360"/>
+            <w:vAlign w:val="center"/>
+          </w:tcPr>
+          <w:p>
+            <w:r/>
+            <w:r>
+              <w:rPr>
+                <w:b w:val="0"/>
+                <w:sz w:val="18"/>
+              </w:rPr>
+              <w:t>Despliegue</w:t>
+            </w:r>
+          </w:p>
+        </w:tc>
+        <w:tc>
+          <w:tcPr>
+            <w:tcW w:type="dxa" w:w="3360"/>
+            <w:vAlign w:val="center"/>
+          </w:tcPr>
+          <w:p>
+            <w:r/>
+            <w:r>
+              <w:rPr>
+                <w:b w:val="0"/>
+                <w:sz w:val="18"/>
+              </w:rPr>
+              <w:t>render.yaml y engines Node 22.14.0</w:t>
+            </w:r>
+          </w:p>
+        </w:tc>
+        <w:tc>
+          <w:tcPr>
+            <w:tcW w:type="dxa" w:w="3360"/>
+            <w:vAlign w:val="center"/>
+          </w:tcPr>
+          <w:p>
+            <w:r/>
+            <w:r>
+              <w:rPr>
+                <w:b w:val="0"/>
+                <w:sz w:val="18"/>
+              </w:rPr>
+              <w:t>Alta: listo para Render.</w:t>
+            </w:r>
+          </w:p>
+        </w:tc>
+      </w:tr>
+    </w:tbl>
+    <w:p/>
+    <w:p>
+      <w:pPr>
+        <w:pStyle w:val="Heading1"/>
+      </w:pPr>
+      <w:r>
+        <w:t>4. Factibilidad económica</w:t>
+      </w:r>
+    </w:p>
+    <w:tbl>
+      <w:tblPr>
+        <w:tblStyle w:val="TableGrid"/>
+        <w:tblW w:type="auto" w:w="0"/>
+        <w:jc w:val="center"/>
+        <w:tblLook w:firstColumn="1" w:firstRow="1" w:lastColumn="0" w:lastRow="0" w:noHBand="0" w:noVBand="1" w:val="04A0"/>
+      </w:tblPr>
+      <w:tblGrid>
+        <w:gridCol w:w="3360"/>
+        <w:gridCol w:w="3360"/>
+        <w:gridCol w:w="3360"/>
+      </w:tblGrid>
+      <w:tr>
+        <w:tc>
+          <w:tcPr>
+            <w:tcW w:type="dxa" w:w="3360"/>
+            <w:vAlign w:val="center"/>
+          </w:tcPr>
+          <w:p>
+            <w:r/>
+            <w:r>
+              <w:rPr>
+                <w:b/>
+                <w:sz w:val="18"/>
+              </w:rPr>
+              <w:t>Concepto</w:t>
+            </w:r>
+          </w:p>
+        </w:tc>
+        <w:tc>
+          <w:tcPr>
+            <w:tcW w:type="dxa" w:w="3360"/>
+            <w:vAlign w:val="center"/>
+          </w:tcPr>
+          <w:p>
+            <w:r/>
+            <w:r>
+              <w:rPr>
+                <w:b/>
+                <w:sz w:val="18"/>
+              </w:rPr>
+              <w:t>Costo esperado</w:t>
+            </w:r>
+          </w:p>
+        </w:tc>
+        <w:tc>
+          <w:tcPr>
+            <w:tcW w:type="dxa" w:w="3360"/>
+            <w:vAlign w:val="center"/>
+          </w:tcPr>
+          <w:p>
+            <w:r/>
+            <w:r>
+              <w:rPr>
+                <w:b/>
+                <w:sz w:val="18"/>
+              </w:rPr>
+              <w:t>Comentario</w:t>
+            </w:r>
+          </w:p>
+        </w:tc>
+      </w:tr>
+      <w:tr>
+        <w:tc>
+          <w:tcPr>
+            <w:tcW w:type="dxa" w:w="3360"/>
+            <w:vAlign w:val="center"/>
+          </w:tcPr>
+          <w:p>
+            <w:r/>
+            <w:r>
+              <w:rPr>
+                <w:b w:val="0"/>
+                <w:sz w:val="18"/>
+              </w:rPr>
+              <w:t>Desarrollo</w:t>
+            </w:r>
+          </w:p>
+        </w:tc>
+        <w:tc>
+          <w:tcPr>
+            <w:tcW w:type="dxa" w:w="3360"/>
+            <w:vAlign w:val="center"/>
+          </w:tcPr>
+          <w:p>
+            <w:r/>
+            <w:r>
+              <w:rPr>
+                <w:b w:val="0"/>
+                <w:sz w:val="18"/>
+              </w:rPr>
+              <w:t>Cubierto por el equipo</w:t>
+            </w:r>
+          </w:p>
+        </w:tc>
+        <w:tc>
+          <w:tcPr>
+            <w:tcW w:type="dxa" w:w="3360"/>
+            <w:vAlign w:val="center"/>
+          </w:tcPr>
+          <w:p>
+            <w:r/>
+            <w:r>
+              <w:rPr>
+                <w:b w:val="0"/>
+                <w:sz w:val="18"/>
+              </w:rPr>
+              <w:t>Código fuente en el repositorio.</w:t>
+            </w:r>
+          </w:p>
+        </w:tc>
+      </w:tr>
+      <w:tr>
+        <w:tc>
+          <w:tcPr>
+            <w:tcW w:type="dxa" w:w="3360"/>
+            <w:vAlign w:val="center"/>
+          </w:tcPr>
+          <w:p>
+            <w:r/>
+            <w:r>
+              <w:rPr>
+                <w:b w:val="0"/>
+                <w:sz w:val="18"/>
+              </w:rPr>
+              <w:t>Render</w:t>
+            </w:r>
+          </w:p>
+        </w:tc>
+        <w:tc>
+          <w:tcPr>
+            <w:tcW w:type="dxa" w:w="3360"/>
+            <w:vAlign w:val="center"/>
+          </w:tcPr>
+          <w:p>
+            <w:r/>
+            <w:r>
+              <w:rPr>
+                <w:b w:val="0"/>
+                <w:sz w:val="18"/>
+              </w:rPr>
+              <w:t>Plan free o escalable</w:t>
+            </w:r>
+          </w:p>
+        </w:tc>
+        <w:tc>
+          <w:tcPr>
+            <w:tcW w:type="dxa" w:w="3360"/>
+            <w:vAlign w:val="center"/>
+          </w:tcPr>
+          <w:p>
+            <w:r/>
+            <w:r>
+              <w:rPr>
+                <w:b w:val="0"/>
+                <w:sz w:val="18"/>
+              </w:rPr>
+              <w:t>Suficiente para demostración.</w:t>
+            </w:r>
+          </w:p>
+        </w:tc>
+      </w:tr>
+      <w:tr>
+        <w:tc>
+          <w:tcPr>
+            <w:tcW w:type="dxa" w:w="3360"/>
+            <w:vAlign w:val="center"/>
+          </w:tcPr>
+          <w:p>
+            <w:r/>
+            <w:r>
+              <w:rPr>
+                <w:b w:val="0"/>
+                <w:sz w:val="18"/>
+              </w:rPr>
+              <w:t>Supabase/PostgreSQL</w:t>
+            </w:r>
+          </w:p>
+        </w:tc>
+        <w:tc>
+          <w:tcPr>
+            <w:tcW w:type="dxa" w:w="3360"/>
+            <w:vAlign w:val="center"/>
+          </w:tcPr>
+          <w:p>
+            <w:r/>
+            <w:r>
+              <w:rPr>
+                <w:b w:val="0"/>
+                <w:sz w:val="18"/>
+              </w:rPr>
+              <w:t>Plan gratuito o académico</w:t>
+            </w:r>
+          </w:p>
+        </w:tc>
+        <w:tc>
+          <w:tcPr>
+            <w:tcW w:type="dxa" w:w="3360"/>
+            <w:vAlign w:val="center"/>
+          </w:tcPr>
+          <w:p>
+            <w:r/>
+            <w:r>
+              <w:rPr>
+                <w:b w:val="0"/>
+                <w:sz w:val="18"/>
+              </w:rPr>
+              <w:t>Guarda metadatos y catálogos.</w:t>
+            </w:r>
+          </w:p>
+        </w:tc>
+      </w:tr>
+      <w:tr>
+        <w:tc>
+          <w:tcPr>
+            <w:tcW w:type="dxa" w:w="3360"/>
+            <w:vAlign w:val="center"/>
+          </w:tcPr>
+          <w:p>
+            <w:r/>
+            <w:r>
+              <w:rPr>
+                <w:b w:val="0"/>
+                <w:sz w:val="18"/>
+              </w:rPr>
+              <w:t>OpenAI</w:t>
+            </w:r>
+          </w:p>
+        </w:tc>
+        <w:tc>
+          <w:tcPr>
+            <w:tcW w:type="dxa" w:w="3360"/>
+            <w:vAlign w:val="center"/>
+          </w:tcPr>
+          <w:p>
+            <w:r/>
+            <w:r>
+              <w:rPr>
+                <w:b w:val="0"/>
+                <w:sz w:val="18"/>
+              </w:rPr>
+              <w:t>Opcional</w:t>
+            </w:r>
+          </w:p>
+        </w:tc>
+        <w:tc>
+          <w:tcPr>
+            <w:tcW w:type="dxa" w:w="3360"/>
+            <w:vAlign w:val="center"/>
+          </w:tcPr>
+          <w:p>
+            <w:r/>
+            <w:r>
+              <w:rPr>
+                <w:b w:val="0"/>
+                <w:sz w:val="18"/>
+              </w:rPr>
+              <w:t>Solo con OPENAI_API_KEY.</w:t>
+            </w:r>
+          </w:p>
+        </w:tc>
+      </w:tr>
+      <w:tr>
+        <w:tc>
+          <w:tcPr>
+            <w:tcW w:type="dxa" w:w="3360"/>
+            <w:vAlign w:val="center"/>
+          </w:tcPr>
+          <w:p>
+            <w:r/>
+            <w:r>
+              <w:rPr>
+                <w:b w:val="0"/>
+                <w:sz w:val="18"/>
+              </w:rPr>
+              <w:t>SQL Server para .bak</w:t>
+            </w:r>
+          </w:p>
+        </w:tc>
+        <w:tc>
+          <w:tcPr>
+            <w:tcW w:type="dxa" w:w="3360"/>
+            <w:vAlign w:val="center"/>
+          </w:tcPr>
+          <w:p>
+            <w:r/>
+            <w:r>
+              <w:rPr>
+                <w:b w:val="0"/>
+                <w:sz w:val="18"/>
+              </w:rPr>
+              <w:t>Opcional/externo</w:t>
+            </w:r>
+          </w:p>
+        </w:tc>
+        <w:tc>
+          <w:tcPr>
+            <w:tcW w:type="dxa" w:w="3360"/>
+            <w:vAlign w:val="center"/>
+          </w:tcPr>
+          <w:p>
+            <w:r/>
+            <w:r>
+              <w:rPr>
+                <w:b w:val="0"/>
+                <w:sz w:val="18"/>
+              </w:rPr>
+              <w:t>No forma parte del servicio Node.</w:t>
+            </w:r>
+          </w:p>
+        </w:tc>
+      </w:tr>
+    </w:tbl>
+    <w:p/>
+    <w:p>
+      <w:pPr>
+        <w:pStyle w:val="Heading1"/>
+      </w:pPr>
+      <w:r>
+        <w:t>5. Factibilidad operativa</w:t>
+      </w:r>
+    </w:p>
+    <w:p>
+      <w:r>
+        <w:t>La operación se concentra en dos secciones: Bases de datos y Replicador. El usuario importa archivos desde su computadora, valida lectura, selecciona origen y destino, mapea tablas, ejecuta trabajos y descarga reportes o bases modificadas.</w:t>
+      </w:r>
+    </w:p>
+    <w:p/>
+    <w:p>
+      <w:r>
+        <w:drawing>
+          <wp:inline xmlns:a="http://schemas.openxmlformats.org/drawingml/2006/main" xmlns:pic="http://schemas.openxmlformats.org/drawingml/2006/picture">
+            <wp:extent cx="6126480" cy="3719649"/>
+            <wp:docPr id="3" name="Picture 3"/>
+            <wp:cNvGraphicFramePr>
+              <a:graphicFrameLocks noChangeAspect="1"/>
+            </wp:cNvGraphicFramePr>
+            <a:graphic>
+              <a:graphicData uri="http://schemas.openxmlformats.org/drawingml/2006/picture">
+                <pic:pic>
+                  <pic:nvPicPr>
+                    <pic:cNvPr id="0" name="workflow.png"/>
+                    <pic:cNvPicPr/>
+                  </pic:nvPicPr>
+                  <pic:blipFill>
+                    <a:blip r:embed="rId11"/>
+                    <a:stretch>
+                      <a:fillRect/>
+                    </a:stretch>
+                  </pic:blipFill>
+                  <pic:spPr>
+                    <a:xfrm>
+                      <a:off x="0" y="0"/>
+                      <a:ext cx="6126480" cy="3719649"/>
+                    </a:xfrm>
+                    <a:prstGeom prst="rect"/>
+                  </pic:spPr>
+                </pic:pic>
+              </a:graphicData>
+            </a:graphic>
+          </wp:inline>
+        </w:drawing>
+      </w:r>
+    </w:p>
+    <w:p>
+      <w:pPr>
+        <w:jc w:val="center"/>
+      </w:pPr>
+      <w:r>
+        <w:rPr>
+          <w:i/>
+          <w:sz w:val="18"/>
+        </w:rPr>
+        <w:t>Figura 2. Flujo operativo principal.</w:t>
+      </w:r>
+    </w:p>
+    <w:p>
+      <w:pPr>
+        <w:pStyle w:val="Heading1"/>
+      </w:pPr>
+      <w:r>
+        <w:t>6. Riesgos y mitigaciones</w:t>
+      </w:r>
+    </w:p>
+    <w:tbl>
+      <w:tblPr>
+        <w:tblStyle w:val="TableGrid"/>
+        <w:tblW w:type="auto" w:w="0"/>
+        <w:jc w:val="center"/>
+        <w:tblLook w:firstColumn="1" w:firstRow="1" w:lastColumn="0" w:lastRow="0" w:noHBand="0" w:noVBand="1" w:val="04A0"/>
+      </w:tblPr>
+      <w:tblGrid>
+        <w:gridCol w:w="3360"/>
+        <w:gridCol w:w="3360"/>
+        <w:gridCol w:w="3360"/>
+      </w:tblGrid>
+      <w:tr>
+        <w:tc>
+          <w:tcPr>
+            <w:tcW w:type="dxa" w:w="3360"/>
+            <w:vAlign w:val="center"/>
+          </w:tcPr>
+          <w:p>
+            <w:r/>
+            <w:r>
+              <w:rPr>
+                <w:b/>
+                <w:sz w:val="18"/>
+              </w:rPr>
+              <w:t>Riesgo</w:t>
+            </w:r>
+          </w:p>
+        </w:tc>
+        <w:tc>
+          <w:tcPr>
+            <w:tcW w:type="dxa" w:w="3360"/>
+            <w:vAlign w:val="center"/>
+          </w:tcPr>
+          <w:p>
+            <w:r/>
+            <w:r>
+              <w:rPr>
+                <w:b/>
+                <w:sz w:val="18"/>
+              </w:rPr>
+              <w:t>Impacto</w:t>
+            </w:r>
+          </w:p>
+        </w:tc>
+        <w:tc>
+          <w:tcPr>
+            <w:tcW w:type="dxa" w:w="3360"/>
+            <w:vAlign w:val="center"/>
+          </w:tcPr>
+          <w:p>
+            <w:r/>
+            <w:r>
+              <w:rPr>
+                <w:b/>
+                <w:sz w:val="18"/>
+              </w:rPr>
+              <w:t>Mitigación</w:t>
+            </w:r>
+          </w:p>
+        </w:tc>
+      </w:tr>
+      <w:tr>
+        <w:tc>
+          <w:tcPr>
+            <w:tcW w:type="dxa" w:w="3360"/>
+            <w:vAlign w:val="center"/>
+          </w:tcPr>
+          <w:p>
+            <w:r/>
+            <w:r>
+              <w:rPr>
+                <w:b w:val="0"/>
+                <w:sz w:val="18"/>
+              </w:rPr>
+              <w:t>Archivo incompatible</w:t>
+            </w:r>
+          </w:p>
+        </w:tc>
+        <w:tc>
+          <w:tcPr>
+            <w:tcW w:type="dxa" w:w="3360"/>
+            <w:vAlign w:val="center"/>
+          </w:tcPr>
+          <w:p>
+            <w:r/>
+            <w:r>
+              <w:rPr>
+                <w:b w:val="0"/>
+                <w:sz w:val="18"/>
+              </w:rPr>
+              <w:t>Falla de importación</w:t>
+            </w:r>
+          </w:p>
+        </w:tc>
+        <w:tc>
+          <w:tcPr>
+            <w:tcW w:type="dxa" w:w="3360"/>
+            <w:vAlign w:val="center"/>
+          </w:tcPr>
+          <w:p>
+            <w:r/>
+            <w:r>
+              <w:rPr>
+                <w:b w:val="0"/>
+                <w:sz w:val="18"/>
+              </w:rPr>
+              <w:t>Validación por extensión, cabecera y contenido.</w:t>
+            </w:r>
+          </w:p>
+        </w:tc>
+      </w:tr>
+      <w:tr>
+        <w:tc>
+          <w:tcPr>
+            <w:tcW w:type="dxa" w:w="3360"/>
+            <w:vAlign w:val="center"/>
+          </w:tcPr>
+          <w:p>
+            <w:r/>
+            <w:r>
+              <w:rPr>
+                <w:b w:val="0"/>
+                <w:sz w:val="18"/>
+              </w:rPr>
+              <w:t>.bak sin SQL Server</w:t>
+            </w:r>
+          </w:p>
+        </w:tc>
+        <w:tc>
+          <w:tcPr>
+            <w:tcW w:type="dxa" w:w="3360"/>
+            <w:vAlign w:val="center"/>
+          </w:tcPr>
+          <w:p>
+            <w:r/>
+            <w:r>
+              <w:rPr>
+                <w:b w:val="0"/>
+                <w:sz w:val="18"/>
+              </w:rPr>
+              <w:t>Función no disponible</w:t>
+            </w:r>
+          </w:p>
+        </w:tc>
+        <w:tc>
+          <w:tcPr>
+            <w:tcW w:type="dxa" w:w="3360"/>
+            <w:vAlign w:val="center"/>
+          </w:tcPr>
+          <w:p>
+            <w:r/>
+            <w:r>
+              <w:rPr>
+                <w:b w:val="0"/>
+                <w:sz w:val="18"/>
+              </w:rPr>
+              <w:t>Advertencia y alternativa por .sql.</w:t>
+            </w:r>
+          </w:p>
+        </w:tc>
+      </w:tr>
+      <w:tr>
+        <w:tc>
+          <w:tcPr>
+            <w:tcW w:type="dxa" w:w="3360"/>
+            <w:vAlign w:val="center"/>
+          </w:tcPr>
+          <w:p>
+            <w:r/>
+            <w:r>
+              <w:rPr>
+                <w:b w:val="0"/>
+                <w:sz w:val="18"/>
+              </w:rPr>
+              <w:t>Disco temporal en Render</w:t>
+            </w:r>
+          </w:p>
+        </w:tc>
+        <w:tc>
+          <w:tcPr>
+            <w:tcW w:type="dxa" w:w="3360"/>
+            <w:vAlign w:val="center"/>
+          </w:tcPr>
+          <w:p>
+            <w:r/>
+            <w:r>
+              <w:rPr>
+                <w:b w:val="0"/>
+                <w:sz w:val="18"/>
+              </w:rPr>
+              <w:t>Pérdida de archivos</w:t>
+            </w:r>
+          </w:p>
+        </w:tc>
+        <w:tc>
+          <w:tcPr>
+            <w:tcW w:type="dxa" w:w="3360"/>
+            <w:vAlign w:val="center"/>
+          </w:tcPr>
+          <w:p>
+            <w:r/>
+            <w:r>
+              <w:rPr>
+                <w:b w:val="0"/>
+                <w:sz w:val="18"/>
+              </w:rPr>
+              <w:t>Catálogos comprimidos en PostgreSQL/Supabase.</w:t>
+            </w:r>
+          </w:p>
+        </w:tc>
+      </w:tr>
+      <w:tr>
+        <w:tc>
+          <w:tcPr>
+            <w:tcW w:type="dxa" w:w="3360"/>
+            <w:vAlign w:val="center"/>
+          </w:tcPr>
+          <w:p>
+            <w:r/>
+            <w:r>
+              <w:rPr>
+                <w:b w:val="0"/>
+                <w:sz w:val="18"/>
+              </w:rPr>
+              <w:t>Credenciales expuestas</w:t>
+            </w:r>
+          </w:p>
+        </w:tc>
+        <w:tc>
+          <w:tcPr>
+            <w:tcW w:type="dxa" w:w="3360"/>
+            <w:vAlign w:val="center"/>
+          </w:tcPr>
+          <w:p>
+            <w:r/>
+            <w:r>
+              <w:rPr>
+                <w:b w:val="0"/>
+                <w:sz w:val="18"/>
+              </w:rPr>
+              <w:t>Riesgo de seguridad</w:t>
+            </w:r>
+          </w:p>
+        </w:tc>
+        <w:tc>
+          <w:tcPr>
+            <w:tcW w:type="dxa" w:w="3360"/>
+            <w:vAlign w:val="center"/>
+          </w:tcPr>
+          <w:p>
+            <w:r/>
+            <w:r>
+              <w:rPr>
+                <w:b w:val="0"/>
+                <w:sz w:val="18"/>
+              </w:rPr>
+              <w:t>AES-256-GCM y variables de entorno.</w:t>
+            </w:r>
+          </w:p>
+        </w:tc>
+      </w:tr>
+      <w:tr>
+        <w:tc>
+          <w:tcPr>
+            <w:tcW w:type="dxa" w:w="3360"/>
+            <w:vAlign w:val="center"/>
+          </w:tcPr>
+          <w:p>
+            <w:r/>
+            <w:r>
+              <w:rPr>
+                <w:b w:val="0"/>
+                <w:sz w:val="18"/>
+              </w:rPr>
+              <w:t>CDC exact-once</w:t>
+            </w:r>
+          </w:p>
+        </w:tc>
+        <w:tc>
+          <w:tcPr>
+            <w:tcW w:type="dxa" w:w="3360"/>
+            <w:vAlign w:val="center"/>
+          </w:tcPr>
+          <w:p>
+            <w:r/>
+            <w:r>
+              <w:rPr>
+                <w:b w:val="0"/>
+                <w:sz w:val="18"/>
+              </w:rPr>
+              <w:t>Expectativa no cubierta</w:t>
+            </w:r>
+          </w:p>
+        </w:tc>
+        <w:tc>
+          <w:tcPr>
+            <w:tcW w:type="dxa" w:w="3360"/>
+            <w:vAlign w:val="center"/>
+          </w:tcPr>
+          <w:p>
+            <w:r/>
+            <w:r>
+              <w:rPr>
+                <w:b w:val="0"/>
+                <w:sz w:val="18"/>
+              </w:rPr>
+              <w:t>Declararlo como evolución futura.</w:t>
+            </w:r>
+          </w:p>
+        </w:tc>
+      </w:tr>
+    </w:tbl>
+    <w:p/>
+    <w:p>
+      <w:pPr>
+        <w:pStyle w:val="Heading1"/>
+      </w:pPr>
+      <w:r>
+        <w:t>7. Conclusiones</w:t>
+      </w:r>
+    </w:p>
+    <w:p>
+      <w:pPr>
+        <w:pStyle w:val="ListNumber"/>
+      </w:pPr>
+      <w:r>
+        <w:t>El proyecto es factible para entorno académico y demostrativo.</w:t>
+      </w:r>
+    </w:p>
+    <w:p>
+      <w:pPr>
+        <w:pStyle w:val="ListNumber"/>
+      </w:pPr>
+      <w:r>
+        <w:t>La arquitectura de catálogos importados es coherente con Render.</w:t>
+      </w:r>
+    </w:p>
+    <w:p>
+      <w:pPr>
+        <w:pStyle w:val="ListNumber"/>
+      </w:pPr>
+      <w:r>
+        <w:t>La documentación debe mantener Node.js 22.14.0 como requisito real.</w:t>
+      </w:r>
+    </w:p>
+    <w:p>
+      <w:pPr>
+        <w:pStyle w:val="ListNumber"/>
+      </w:pPr>
+      <w:r>
+        <w:t>La importación .bak y CDC real son capacidades condicionadas o futuras.</w:t>
+      </w:r>
+    </w:p>
+    <w:p>
+      <w:r>
+        <w:br w:type="page"/>
+      </w:r>
+    </w:p>
+    <w:p>
+      <w:pPr>
+        <w:pStyle w:val="Heading1"/>
+      </w:pPr>
+      <w:r>
+        <w:t>8. Análisis detallado de factibilidad</w:t>
+      </w:r>
+    </w:p>
+    <w:p>
+      <w:r>
+        <w:t>La factibilidad de Drop Nexus se sustenta en que el producto no intenta reemplazar administradores avanzados de bases de datos, sino ofrecer una capa académica y operativa para importar, comparar, replicar y evidenciar resultados. Esta delimitación reduce la complejidad inicial y permite entregar valor real con tecnologías disponibles.</w:t>
+      </w:r>
+    </w:p>
+    <w:p>
+      <w:r>
+        <w:t>El flujo basado en catálogos importados es una decisión viable porque evita que cada usuario deba exponer hosts, puertos o credenciales de servidores externos. En el contexto académico, esta elección mejora seguridad, repetibilidad de pruebas y facilidad de despliegue.</w:t>
+      </w:r>
+    </w:p>
+    <w:tbl>
+      <w:tblPr>
+        <w:tblStyle w:val="TableGrid"/>
+        <w:tblW w:type="auto" w:w="0"/>
+        <w:jc w:val="center"/>
+        <w:tblLook w:firstColumn="1" w:firstRow="1" w:lastColumn="0" w:lastRow="0" w:noHBand="0" w:noVBand="1" w:val="04A0"/>
+      </w:tblPr>
+      <w:tblGrid>
+        <w:gridCol w:w="3360"/>
+        <w:gridCol w:w="3360"/>
+        <w:gridCol w:w="3360"/>
+      </w:tblGrid>
+      <w:tr>
+        <w:tc>
+          <w:tcPr>
+            <w:tcW w:type="dxa" w:w="3360"/>
+          </w:tcPr>
+          <w:p>
+            <w:r>
+              <w:rPr>
+                <w:b/>
+                <w:sz w:val="18"/>
+              </w:rPr>
+              <w:t>Dimensión</w:t>
+            </w:r>
+          </w:p>
+        </w:tc>
+        <w:tc>
+          <w:tcPr>
+            <w:tcW w:type="dxa" w:w="3360"/>
+          </w:tcPr>
+          <w:p>
+            <w:r>
+              <w:rPr>
+                <w:b/>
+                <w:sz w:val="18"/>
+              </w:rPr>
+              <w:t>Detalle evaluado</w:t>
+            </w:r>
+          </w:p>
+        </w:tc>
+        <w:tc>
+          <w:tcPr>
+            <w:tcW w:type="dxa" w:w="3360"/>
+          </w:tcPr>
+          <w:p>
+            <w:r>
+              <w:rPr>
+                <w:b/>
+                <w:sz w:val="18"/>
+              </w:rPr>
+              <w:t>Resultado</w:t>
+            </w:r>
+          </w:p>
+        </w:tc>
+      </w:tr>
+      <w:tr>
+        <w:tc>
+          <w:tcPr>
+            <w:tcW w:type="dxa" w:w="3360"/>
+          </w:tcPr>
+          <w:p>
+            <w:r>
+              <w:rPr>
+                <w:sz w:val="18"/>
+              </w:rPr>
+              <w:t>Técnica</w:t>
+            </w:r>
+          </w:p>
+        </w:tc>
+        <w:tc>
+          <w:tcPr>
+            <w:tcW w:type="dxa" w:w="3360"/>
+          </w:tcPr>
+          <w:p>
+            <w:r>
+              <w:rPr>
+                <w:sz w:val="18"/>
+              </w:rPr>
+              <w:t>Compatibilidad entre React, Fastify, PostgreSQL/Supabase y Render.</w:t>
+            </w:r>
+          </w:p>
+        </w:tc>
+        <w:tc>
+          <w:tcPr>
+            <w:tcW w:type="dxa" w:w="3360"/>
+          </w:tcPr>
+          <w:p>
+            <w:r>
+              <w:rPr>
+                <w:sz w:val="18"/>
+              </w:rPr>
+              <w:t>Viable con Node.js 22.14.0.</w:t>
+            </w:r>
+          </w:p>
+        </w:tc>
+      </w:tr>
+      <w:tr>
+        <w:tc>
+          <w:tcPr>
+            <w:tcW w:type="dxa" w:w="3360"/>
+          </w:tcPr>
+          <w:p>
+            <w:r>
+              <w:rPr>
+                <w:sz w:val="18"/>
+              </w:rPr>
+              <w:t>Operativa</w:t>
+            </w:r>
+          </w:p>
+        </w:tc>
+        <w:tc>
+          <w:tcPr>
+            <w:tcW w:type="dxa" w:w="3360"/>
+          </w:tcPr>
+          <w:p>
+            <w:r>
+              <w:rPr>
+                <w:sz w:val="18"/>
+              </w:rPr>
+              <w:t>Usuarios pueden cargar archivos, validar, replicar y descargar sin scripts.</w:t>
+            </w:r>
+          </w:p>
+        </w:tc>
+        <w:tc>
+          <w:tcPr>
+            <w:tcW w:type="dxa" w:w="3360"/>
+          </w:tcPr>
+          <w:p>
+            <w:r>
+              <w:rPr>
+                <w:sz w:val="18"/>
+              </w:rPr>
+              <w:t>Viable para laboratorio y demostración.</w:t>
+            </w:r>
+          </w:p>
+        </w:tc>
+      </w:tr>
+      <w:tr>
+        <w:tc>
+          <w:tcPr>
+            <w:tcW w:type="dxa" w:w="3360"/>
+          </w:tcPr>
+          <w:p>
+            <w:r>
+              <w:rPr>
+                <w:sz w:val="18"/>
+              </w:rPr>
+              <w:t>Económica</w:t>
+            </w:r>
+          </w:p>
+        </w:tc>
+        <w:tc>
+          <w:tcPr>
+            <w:tcW w:type="dxa" w:w="3360"/>
+          </w:tcPr>
+          <w:p>
+            <w:r>
+              <w:rPr>
+                <w:sz w:val="18"/>
+              </w:rPr>
+              <w:t>Uso de librerías open source y planes gratuitos o académicos.</w:t>
+            </w:r>
+          </w:p>
+        </w:tc>
+        <w:tc>
+          <w:tcPr>
+            <w:tcW w:type="dxa" w:w="3360"/>
+          </w:tcPr>
+          <w:p>
+            <w:r>
+              <w:rPr>
+                <w:sz w:val="18"/>
+              </w:rPr>
+              <w:t>Viable con bajo costo inicial.</w:t>
+            </w:r>
+          </w:p>
+        </w:tc>
+      </w:tr>
+      <w:tr>
+        <w:tc>
+          <w:tcPr>
+            <w:tcW w:type="dxa" w:w="3360"/>
+          </w:tcPr>
+          <w:p>
+            <w:r>
+              <w:rPr>
+                <w:sz w:val="18"/>
+              </w:rPr>
+              <w:t>Legal</w:t>
+            </w:r>
+          </w:p>
+        </w:tc>
+        <w:tc>
+          <w:tcPr>
+            <w:tcW w:type="dxa" w:w="3360"/>
+          </w:tcPr>
+          <w:p>
+            <w:r>
+              <w:rPr>
+                <w:sz w:val="18"/>
+              </w:rPr>
+              <w:t>Tratamiento de credenciales cifradas y aislamiento por usuario.</w:t>
+            </w:r>
+          </w:p>
+        </w:tc>
+        <w:tc>
+          <w:tcPr>
+            <w:tcW w:type="dxa" w:w="3360"/>
+          </w:tcPr>
+          <w:p>
+            <w:r>
+              <w:rPr>
+                <w:sz w:val="18"/>
+              </w:rPr>
+              <w:t>Viable si se protegen secretos y datos de prueba.</w:t>
+            </w:r>
+          </w:p>
+        </w:tc>
+      </w:tr>
+      <w:tr>
+        <w:tc>
+          <w:tcPr>
+            <w:tcW w:type="dxa" w:w="3360"/>
+          </w:tcPr>
+          <w:p>
+            <w:r>
+              <w:rPr>
+                <w:sz w:val="18"/>
+              </w:rPr>
+              <w:t>Social</w:t>
+            </w:r>
+          </w:p>
+        </w:tc>
+        <w:tc>
+          <w:tcPr>
+            <w:tcW w:type="dxa" w:w="3360"/>
+          </w:tcPr>
+          <w:p>
+            <w:r>
+              <w:rPr>
+                <w:sz w:val="18"/>
+              </w:rPr>
+              <w:t>Mejora aprendizaje de interoperabilidad de datos.</w:t>
+            </w:r>
+          </w:p>
+        </w:tc>
+        <w:tc>
+          <w:tcPr>
+            <w:tcW w:type="dxa" w:w="3360"/>
+          </w:tcPr>
+          <w:p>
+            <w:r>
+              <w:rPr>
+                <w:sz w:val="18"/>
+              </w:rPr>
+              <w:t>Impacto positivo en formación técnica.</w:t>
+            </w:r>
+          </w:p>
+        </w:tc>
+      </w:tr>
+      <w:tr>
+        <w:tc>
+          <w:tcPr>
+            <w:tcW w:type="dxa" w:w="3360"/>
+          </w:tcPr>
+          <w:p>
+            <w:r>
+              <w:rPr>
+                <w:sz w:val="18"/>
+              </w:rPr>
+              <w:t>Ambiental</w:t>
+            </w:r>
+          </w:p>
+        </w:tc>
+        <w:tc>
+          <w:tcPr>
+            <w:tcW w:type="dxa" w:w="3360"/>
+          </w:tcPr>
+          <w:p>
+            <w:r>
+              <w:rPr>
+                <w:sz w:val="18"/>
+              </w:rPr>
+              <w:t>Reduce documentación manual y copias físicas.</w:t>
+            </w:r>
+          </w:p>
+        </w:tc>
+        <w:tc>
+          <w:tcPr>
+            <w:tcW w:type="dxa" w:w="3360"/>
+          </w:tcPr>
+          <w:p>
+            <w:r>
+              <w:rPr>
+                <w:sz w:val="18"/>
+              </w:rPr>
+              <w:t>Impacto positivo moderado.</w:t>
+            </w:r>
+          </w:p>
+        </w:tc>
+      </w:tr>
+    </w:tbl>
+    <w:p/>
+    <w:p>
+      <w:pPr>
+        <w:pStyle w:val="Heading1"/>
+      </w:pPr>
+      <w:r>
+        <w:t>9. Supuestos de operación</w:t>
+      </w:r>
+    </w:p>
+    <w:p>
+      <w:pPr>
+        <w:pStyle w:val="ListBullet"/>
+      </w:pPr>
+      <w:r>
+        <w:t>Los usuarios trabajan con archivos de prueba o bases autorizadas para fines académicos.</w:t>
+      </w:r>
+    </w:p>
+    <w:p>
+      <w:pPr>
+        <w:pStyle w:val="ListBullet"/>
+      </w:pPr>
+      <w:r>
+        <w:t>La base de metadatos PostgreSQL/Supabase está disponible y correctamente configurada en DATABASE_URL.</w:t>
+      </w:r>
+    </w:p>
+    <w:p>
+      <w:pPr>
+        <w:pStyle w:val="ListBullet"/>
+      </w:pPr>
+      <w:r>
+        <w:t>JWT_SECRET y ENCRYPTION_KEY se almacenan como variables de entorno, no dentro de documentos ni código público.</w:t>
+      </w:r>
+    </w:p>
+    <w:p>
+      <w:pPr>
+        <w:pStyle w:val="ListBullet"/>
+      </w:pPr>
+      <w:r>
+        <w:t>La importación de archivos grandes depende del límite MAX_DATABASE_FILE_SIZE_MB y de la memoria disponible.</w:t>
+      </w:r>
+    </w:p>
+    <w:p>
+      <w:pPr>
+        <w:pStyle w:val="ListBullet"/>
+      </w:pPr>
+      <w:r>
+        <w:t>La restauración de .bak solo se habilita si existe un SQL Server externo preparado para restaurar temporalmente el respaldo.</w:t>
+      </w:r>
+    </w:p>
+    <w:p>
+      <w:pPr>
+        <w:pStyle w:val="Heading1"/>
+      </w:pPr>
+      <w:r>
+        <w:t>10. Análisis costo-beneficio cualitativo</w:t>
+      </w:r>
+    </w:p>
+    <w:p>
+      <w:r>
+        <w:t>El beneficio principal no se mide únicamente en ahorro económico, sino en reducción de esfuerzo técnico. Sin Drop Nexus, una demostración de replicación entre formatos suele requerir preparar scripts, instalar herramientas por motor, validar manualmente estructuras y documentar resultados de forma separada. Con Drop Nexus, el flujo se concentra en una interfaz web con reportes descargables.</w:t>
+      </w:r>
+    </w:p>
+    <w:tbl>
+      <w:tblPr>
+        <w:tblStyle w:val="TableGrid"/>
+        <w:tblW w:type="auto" w:w="0"/>
+        <w:jc w:val="center"/>
+        <w:tblLook w:firstColumn="1" w:firstRow="1" w:lastColumn="0" w:lastRow="0" w:noHBand="0" w:noVBand="1" w:val="04A0"/>
+      </w:tblPr>
+      <w:tblGrid>
+        <w:gridCol w:w="5040"/>
+        <w:gridCol w:w="5040"/>
+      </w:tblGrid>
+      <w:tr>
+        <w:tc>
+          <w:tcPr>
+            <w:tcW w:type="dxa" w:w="5040"/>
+          </w:tcPr>
+          <w:p>
+            <w:r>
+              <w:rPr>
+                <w:b/>
+                <w:sz w:val="18"/>
+              </w:rPr>
+              <w:t>Beneficio</w:t>
+            </w:r>
+          </w:p>
+        </w:tc>
+        <w:tc>
+          <w:tcPr>
+            <w:tcW w:type="dxa" w:w="5040"/>
+          </w:tcPr>
+          <w:p>
+            <w:r>
+              <w:rPr>
+                <w:b/>
+                <w:sz w:val="18"/>
+              </w:rPr>
+              <w:t>Impacto esperado</w:t>
+            </w:r>
+          </w:p>
+        </w:tc>
+      </w:tr>
+      <w:tr>
+        <w:tc>
+          <w:tcPr>
+            <w:tcW w:type="dxa" w:w="5040"/>
+          </w:tcPr>
+          <w:p>
+            <w:r>
+              <w:rPr>
+                <w:sz w:val="18"/>
+              </w:rPr>
+              <w:t>Menos preparación manual</w:t>
+            </w:r>
+          </w:p>
+        </w:tc>
+        <w:tc>
+          <w:tcPr>
+            <w:tcW w:type="dxa" w:w="5040"/>
+          </w:tcPr>
+          <w:p>
+            <w:r>
+              <w:rPr>
+                <w:sz w:val="18"/>
+              </w:rPr>
+              <w:t>Los usuarios cargan archivos y el sistema detecta formatos.</w:t>
+            </w:r>
+          </w:p>
+        </w:tc>
+      </w:tr>
+      <w:tr>
+        <w:tc>
+          <w:tcPr>
+            <w:tcW w:type="dxa" w:w="5040"/>
+          </w:tcPr>
+          <w:p>
+            <w:r>
+              <w:rPr>
+                <w:sz w:val="18"/>
+              </w:rPr>
+              <w:t>Mayor trazabilidad</w:t>
+            </w:r>
+          </w:p>
+        </w:tc>
+        <w:tc>
+          <w:tcPr>
+            <w:tcW w:type="dxa" w:w="5040"/>
+          </w:tcPr>
+          <w:p>
+            <w:r>
+              <w:rPr>
+                <w:sz w:val="18"/>
+              </w:rPr>
+              <w:t>Cada job conserva estado, progreso, error y recomendación.</w:t>
+            </w:r>
+          </w:p>
+        </w:tc>
+      </w:tr>
+      <w:tr>
+        <w:tc>
+          <w:tcPr>
+            <w:tcW w:type="dxa" w:w="5040"/>
+          </w:tcPr>
+          <w:p>
+            <w:r>
+              <w:rPr>
+                <w:sz w:val="18"/>
+              </w:rPr>
+              <w:t>Mejor demostración académica</w:t>
+            </w:r>
+          </w:p>
+        </w:tc>
+        <w:tc>
+          <w:tcPr>
+            <w:tcW w:type="dxa" w:w="5040"/>
+          </w:tcPr>
+          <w:p>
+            <w:r>
+              <w:rPr>
+                <w:sz w:val="18"/>
+              </w:rPr>
+              <w:t>Los FD, README, release, skill y extensión sirven como evidencia.</w:t>
+            </w:r>
+          </w:p>
+        </w:tc>
+      </w:tr>
+      <w:tr>
+        <w:tc>
+          <w:tcPr>
+            <w:tcW w:type="dxa" w:w="5040"/>
+          </w:tcPr>
+          <w:p>
+            <w:r>
+              <w:rPr>
+                <w:sz w:val="18"/>
+              </w:rPr>
+              <w:t>Menor dependencia de infraestructura</w:t>
+            </w:r>
+          </w:p>
+        </w:tc>
+        <w:tc>
+          <w:tcPr>
+            <w:tcW w:type="dxa" w:w="5040"/>
+          </w:tcPr>
+          <w:p>
+            <w:r>
+              <w:rPr>
+                <w:sz w:val="18"/>
+              </w:rPr>
+              <w:t>Render y Supabase permiten despliegue sin servidores propios.</w:t>
+            </w:r>
+          </w:p>
+        </w:tc>
+      </w:tr>
+      <w:tr>
+        <w:tc>
+          <w:tcPr>
+            <w:tcW w:type="dxa" w:w="5040"/>
+          </w:tcPr>
+          <w:p>
+            <w:r>
+              <w:rPr>
+                <w:sz w:val="18"/>
+              </w:rPr>
+              <w:t>Escalabilidad futura</w:t>
+            </w:r>
+          </w:p>
+        </w:tc>
+        <w:tc>
+          <w:tcPr>
+            <w:tcW w:type="dxa" w:w="5040"/>
+          </w:tcPr>
+          <w:p>
+            <w:r>
+              <w:rPr>
+                <w:sz w:val="18"/>
+              </w:rPr>
+              <w:t>Los adaptadores permiten extender motores y estrategias de sincronización.</w:t>
+            </w:r>
+          </w:p>
+        </w:tc>
+      </w:tr>
+    </w:tbl>
+    <w:p/>
+    <w:p>
+      <w:pPr>
+        <w:pStyle w:val="Heading1"/>
+      </w:pPr>
+      <w:r>
+        <w:t>11. Recomendación de factibilidad</w:t>
+      </w:r>
+    </w:p>
+    <w:p>
+      <w:r>
+        <w:t>Se recomienda continuar el proyecto como solución académica funcional y base para iteraciones posteriores. Para producción real se recomienda añadir pruebas automatizadas por motor, monitoreo externo, auditoría de seguridad y una estrategia de colas para trabajos largos.</w:t>
       </w:r>
     </w:p>
     <w:sectPr>
@@ -2929,6 +2721,10 @@
     <w:name w:val="Normal"/>
     <w:qFormat/>
     <w:rsid w:val="00FC693F"/>
+    <w:rPr>
+      <w:rFonts w:ascii="Arial" w:hAnsi="Arial" w:eastAsia="Arial"/>
+      <w:sz w:val="20"/>
+    </w:rPr>
   </w:style>
   <w:style w:type="paragraph" w:styleId="Header">
     <w:name w:val="header"/>
@@ -2989,10 +2785,10 @@
       <w:outlineLvl w:val="0"/>
     </w:pPr>
     <w:rPr>
-      <w:rFonts w:asciiTheme="majorHAnsi" w:eastAsiaTheme="majorEastAsia" w:hAnsiTheme="majorHAnsi" w:cstheme="majorBidi"/>
+      <w:rFonts w:asciiTheme="majorHAnsi" w:eastAsiaTheme="majorEastAsia" w:hAnsiTheme="majorHAnsi" w:cstheme="majorBidi" w:ascii="Arial" w:hAnsi="Arial" w:eastAsia="Arial"/>
       <w:b/>
       <w:bCs/>
-      <w:color w:val="365F91" w:themeColor="accent1" w:themeShade="BF"/>
+      <w:color w:val="1D4ED8"/>
       <w:sz w:val="28"/>
       <w:szCs w:val="28"/>
     </w:rPr>
@@ -3013,10 +2809,10 @@
       <w:outlineLvl w:val="1"/>
     </w:pPr>
     <w:rPr>
-      <w:rFonts w:asciiTheme="majorHAnsi" w:eastAsiaTheme="majorEastAsia" w:hAnsiTheme="majorHAnsi" w:cstheme="majorBidi"/>
+      <w:rFonts w:asciiTheme="majorHAnsi" w:eastAsiaTheme="majorEastAsia" w:hAnsiTheme="majorHAnsi" w:cstheme="majorBidi" w:ascii="Arial" w:hAnsi="Arial" w:eastAsia="Arial"/>
       <w:b/>
       <w:bCs/>
-      <w:color w:val="4F81BD" w:themeColor="accent1"/>
+      <w:color w:val="047857"/>
       <w:sz w:val="26"/>
       <w:szCs w:val="26"/>
     </w:rPr>
@@ -3037,7 +2833,7 @@
       <w:outlineLvl w:val="2"/>
     </w:pPr>
     <w:rPr>
-      <w:rFonts w:asciiTheme="majorHAnsi" w:eastAsiaTheme="majorEastAsia" w:hAnsiTheme="majorHAnsi" w:cstheme="majorBidi"/>
+      <w:rFonts w:asciiTheme="majorHAnsi" w:eastAsiaTheme="majorEastAsia" w:hAnsiTheme="majorHAnsi" w:cstheme="majorBidi" w:ascii="Arial" w:hAnsi="Arial" w:eastAsia="Arial"/>
       <w:b/>
       <w:bCs/>
       <w:color w:val="4F81BD" w:themeColor="accent1"/>
@@ -3278,7 +3074,7 @@
       <w:contextualSpacing/>
     </w:pPr>
     <w:rPr>
-      <w:rFonts w:asciiTheme="majorHAnsi" w:eastAsiaTheme="majorEastAsia" w:hAnsiTheme="majorHAnsi" w:cstheme="majorBidi"/>
+      <w:rFonts w:asciiTheme="majorHAnsi" w:eastAsiaTheme="majorEastAsia" w:hAnsiTheme="majorHAnsi" w:cstheme="majorBidi" w:ascii="Arial" w:hAnsi="Arial" w:eastAsia="Arial"/>
       <w:color w:val="17365D" w:themeColor="text2" w:themeShade="BF"/>
       <w:spacing w:val="5"/>
       <w:kern w:val="28"/>

</xml_diff>

<commit_message>
Polish FD participants and diagrams
</commit_message>
<xml_diff>
--- a/FD01-EPIS-Informe de Factibilidad.docx
+++ b/FD01-EPIS-Informe de Factibilidad.docx
@@ -106,7 +106,7 @@
         <w:jc w:val="center"/>
       </w:pPr>
       <w:r>
-        <w:t>Equipo: CARBAJAL - LLANOS - YUPA - ZAPANA</w:t>
+        <w:t>Equipo: Vincenzo Rafael Llanos Niño y VICTOR JOSEPH PLATERO MARON</w:t>
       </w:r>
     </w:p>
     <w:p>
@@ -262,7 +262,7 @@
                 <w:b w:val="0"/>
                 <w:sz w:val="18"/>
               </w:rPr>
-              <w:t>CARBAJAL - LLANOS - YUPA - ZAPANA</w:t>
+              <w:t>Vincenzo Rafael Llanos Niño y VICTOR JOSEPH PLATERO MARON</w:t>
             </w:r>
           </w:p>
         </w:tc>
@@ -328,7 +328,7 @@
                 <w:b w:val="0"/>
                 <w:sz w:val="18"/>
               </w:rPr>
-              <w:t>CARBAJAL - LLANOS - YUPA - ZAPANA</w:t>
+              <w:t>Vincenzo Rafael Llanos Niño y VICTOR JOSEPH PLATERO MARON</w:t>
             </w:r>
           </w:p>
         </w:tc>

</xml_diff>

<commit_message>
Enrich FD documents with research
</commit_message>
<xml_diff>
--- a/FD01-EPIS-Informe de Factibilidad.docx
+++ b/FD01-EPIS-Informe de Factibilidad.docx
@@ -2348,6 +2348,811 @@
         <w:t>Se recomienda continuar el proyecto como solución académica funcional y base para iteraciones posteriores. Para producción real se recomienda añadir pruebas automatizadas por motor, monitoreo externo, auditoría de seguridad y una estrategia de colas para trabajos largos.</w:t>
       </w:r>
     </w:p>
+    <w:p>
+      <w:r>
+        <w:br w:type="page"/>
+      </w:r>
+    </w:p>
+    <w:p>
+      <w:pPr>
+        <w:pStyle w:val="Heading1"/>
+      </w:pPr>
+      <w:r>
+        <w:t>12. Investigación tecnológica complementaria</w:t>
+      </w:r>
+    </w:p>
+    <w:p>
+      <w:r>
+        <w:t>La selección tecnológica se contrastó con documentación oficial. React y Vite sustentan la construcción de una interfaz modular y compilable; Fastify respalda una API Node basada en rutas y plugins; Render permite definir servicios mediante render.yaml; Supabase proporciona PostgreSQL administrado para persistencia; y OWASP ofrece criterios de seguridad para APIs REST.</w:t>
+      </w:r>
+    </w:p>
+    <w:p>
+      <w:r>
+        <w:drawing>
+          <wp:inline xmlns:a="http://schemas.openxmlformats.org/drawingml/2006/main" xmlns:pic="http://schemas.openxmlformats.org/drawingml/2006/picture">
+            <wp:extent cx="6126480" cy="3743960"/>
+            <wp:docPr id="4" name="Picture 4"/>
+            <wp:cNvGraphicFramePr>
+              <a:graphicFrameLocks noChangeAspect="1"/>
+            </wp:cNvGraphicFramePr>
+            <a:graphic>
+              <a:graphicData uri="http://schemas.openxmlformats.org/drawingml/2006/picture">
+                <pic:pic>
+                  <pic:nvPicPr>
+                    <pic:cNvPr id="0" name="stack_research.png"/>
+                    <pic:cNvPicPr/>
+                  </pic:nvPicPr>
+                  <pic:blipFill>
+                    <a:blip r:embed="rId12"/>
+                    <a:stretch>
+                      <a:fillRect/>
+                    </a:stretch>
+                  </pic:blipFill>
+                  <pic:spPr>
+                    <a:xfrm>
+                      <a:off x="0" y="0"/>
+                      <a:ext cx="6126480" cy="3743960"/>
+                    </a:xfrm>
+                    <a:prstGeom prst="rect"/>
+                  </pic:spPr>
+                </pic:pic>
+              </a:graphicData>
+            </a:graphic>
+          </wp:inline>
+        </w:drawing>
+      </w:r>
+    </w:p>
+    <w:p>
+      <w:pPr>
+        <w:jc w:val="center"/>
+      </w:pPr>
+      <w:r>
+        <w:rPr>
+          <w:i/>
+          <w:sz w:val="18"/>
+        </w:rPr>
+        <w:t>Figura 3. Stack investigado y su relación con la implementación.</w:t>
+      </w:r>
+    </w:p>
+    <w:tbl>
+      <w:tblPr>
+        <w:tblStyle w:val="TableGrid"/>
+        <w:tblW w:type="auto" w:w="0"/>
+        <w:jc w:val="center"/>
+        <w:tblLook w:firstColumn="1" w:firstRow="1" w:lastColumn="0" w:lastRow="0" w:noHBand="0" w:noVBand="1" w:val="04A0"/>
+      </w:tblPr>
+      <w:tblGrid>
+        <w:gridCol w:w="3360"/>
+        <w:gridCol w:w="3360"/>
+        <w:gridCol w:w="3360"/>
+      </w:tblGrid>
+      <w:tr>
+        <w:tc>
+          <w:tcPr>
+            <w:tcW w:type="dxa" w:w="3360"/>
+          </w:tcPr>
+          <w:p>
+            <w:r>
+              <w:rPr>
+                <w:b/>
+                <w:sz w:val="18"/>
+              </w:rPr>
+              <w:t>Fuente técnica</w:t>
+            </w:r>
+          </w:p>
+        </w:tc>
+        <w:tc>
+          <w:tcPr>
+            <w:tcW w:type="dxa" w:w="3360"/>
+          </w:tcPr>
+          <w:p>
+            <w:r>
+              <w:rPr>
+                <w:b/>
+                <w:sz w:val="18"/>
+              </w:rPr>
+              <w:t>Aporte al proyecto</w:t>
+            </w:r>
+          </w:p>
+        </w:tc>
+        <w:tc>
+          <w:tcPr>
+            <w:tcW w:type="dxa" w:w="3360"/>
+          </w:tcPr>
+          <w:p>
+            <w:r>
+              <w:rPr>
+                <w:b/>
+                <w:sz w:val="18"/>
+              </w:rPr>
+              <w:t>Aplicación concreta</w:t>
+            </w:r>
+          </w:p>
+        </w:tc>
+      </w:tr>
+      <w:tr>
+        <w:tc>
+          <w:tcPr>
+            <w:tcW w:type="dxa" w:w="3360"/>
+          </w:tcPr>
+          <w:p>
+            <w:r>
+              <w:rPr>
+                <w:sz w:val="18"/>
+              </w:rPr>
+              <w:t>React/Vite</w:t>
+            </w:r>
+          </w:p>
+        </w:tc>
+        <w:tc>
+          <w:tcPr>
+            <w:tcW w:type="dxa" w:w="3360"/>
+          </w:tcPr>
+          <w:p>
+            <w:r>
+              <w:rPr>
+                <w:sz w:val="18"/>
+              </w:rPr>
+              <w:t>Interfaz basada en componentes y build frontend.</w:t>
+            </w:r>
+          </w:p>
+        </w:tc>
+        <w:tc>
+          <w:tcPr>
+            <w:tcW w:type="dxa" w:w="3360"/>
+          </w:tcPr>
+          <w:p>
+            <w:r>
+              <w:rPr>
+                <w:sz w:val="18"/>
+              </w:rPr>
+              <w:t>Dashboard, formularios, replicador y chatbox.</w:t>
+            </w:r>
+          </w:p>
+        </w:tc>
+      </w:tr>
+      <w:tr>
+        <w:tc>
+          <w:tcPr>
+            <w:tcW w:type="dxa" w:w="3360"/>
+          </w:tcPr>
+          <w:p>
+            <w:r>
+              <w:rPr>
+                <w:sz w:val="18"/>
+              </w:rPr>
+              <w:t>Fastify</w:t>
+            </w:r>
+          </w:p>
+        </w:tc>
+        <w:tc>
+          <w:tcPr>
+            <w:tcW w:type="dxa" w:w="3360"/>
+          </w:tcPr>
+          <w:p>
+            <w:r>
+              <w:rPr>
+                <w:sz w:val="18"/>
+              </w:rPr>
+              <w:t>Servidor API modular con plugins.</w:t>
+            </w:r>
+          </w:p>
+        </w:tc>
+        <w:tc>
+          <w:tcPr>
+            <w:tcW w:type="dxa" w:w="3360"/>
+          </w:tcPr>
+          <w:p>
+            <w:r>
+              <w:rPr>
+                <w:sz w:val="18"/>
+              </w:rPr>
+              <w:t>Rutas /api, CORS, Helmet, JWT, multipart y rate limit.</w:t>
+            </w:r>
+          </w:p>
+        </w:tc>
+      </w:tr>
+      <w:tr>
+        <w:tc>
+          <w:tcPr>
+            <w:tcW w:type="dxa" w:w="3360"/>
+          </w:tcPr>
+          <w:p>
+            <w:r>
+              <w:rPr>
+                <w:sz w:val="18"/>
+              </w:rPr>
+              <w:t>Render</w:t>
+            </w:r>
+          </w:p>
+        </w:tc>
+        <w:tc>
+          <w:tcPr>
+            <w:tcW w:type="dxa" w:w="3360"/>
+          </w:tcPr>
+          <w:p>
+            <w:r>
+              <w:rPr>
+                <w:sz w:val="18"/>
+              </w:rPr>
+              <w:t>Infraestructura como código mediante Blueprint.</w:t>
+            </w:r>
+          </w:p>
+        </w:tc>
+        <w:tc>
+          <w:tcPr>
+            <w:tcW w:type="dxa" w:w="3360"/>
+          </w:tcPr>
+          <w:p>
+            <w:r>
+              <w:rPr>
+                <w:sz w:val="18"/>
+              </w:rPr>
+              <w:t>render.yaml con buildCommand, startCommand, healthCheckPath y autoDeployTrigger.</w:t>
+            </w:r>
+          </w:p>
+        </w:tc>
+      </w:tr>
+      <w:tr>
+        <w:tc>
+          <w:tcPr>
+            <w:tcW w:type="dxa" w:w="3360"/>
+          </w:tcPr>
+          <w:p>
+            <w:r>
+              <w:rPr>
+                <w:sz w:val="18"/>
+              </w:rPr>
+              <w:t>Supabase/PostgreSQL</w:t>
+            </w:r>
+          </w:p>
+        </w:tc>
+        <w:tc>
+          <w:tcPr>
+            <w:tcW w:type="dxa" w:w="3360"/>
+          </w:tcPr>
+          <w:p>
+            <w:r>
+              <w:rPr>
+                <w:sz w:val="18"/>
+              </w:rPr>
+              <w:t>Base relacional administrada.</w:t>
+            </w:r>
+          </w:p>
+        </w:tc>
+        <w:tc>
+          <w:tcPr>
+            <w:tcW w:type="dxa" w:w="3360"/>
+          </w:tcPr>
+          <w:p>
+            <w:r>
+              <w:rPr>
+                <w:sz w:val="18"/>
+              </w:rPr>
+              <w:t>Usuarios, configuraciones, trabajos, health checks y catálogos comprimidos.</w:t>
+            </w:r>
+          </w:p>
+        </w:tc>
+      </w:tr>
+      <w:tr>
+        <w:tc>
+          <w:tcPr>
+            <w:tcW w:type="dxa" w:w="3360"/>
+          </w:tcPr>
+          <w:p>
+            <w:r>
+              <w:rPr>
+                <w:sz w:val="18"/>
+              </w:rPr>
+              <w:t>OWASP</w:t>
+            </w:r>
+          </w:p>
+        </w:tc>
+        <w:tc>
+          <w:tcPr>
+            <w:tcW w:type="dxa" w:w="3360"/>
+          </w:tcPr>
+          <w:p>
+            <w:r>
+              <w:rPr>
+                <w:sz w:val="18"/>
+              </w:rPr>
+              <w:t>Buenas prácticas de seguridad REST.</w:t>
+            </w:r>
+          </w:p>
+        </w:tc>
+        <w:tc>
+          <w:tcPr>
+            <w:tcW w:type="dxa" w:w="3360"/>
+          </w:tcPr>
+          <w:p>
+            <w:r>
+              <w:rPr>
+                <w:sz w:val="18"/>
+              </w:rPr>
+              <w:t>JWT, control por endpoint, validación de entrada, manejo de errores y CORS.</w:t>
+            </w:r>
+          </w:p>
+        </w:tc>
+      </w:tr>
+    </w:tbl>
+    <w:p/>
+    <w:p>
+      <w:pPr>
+        <w:pStyle w:val="Heading1"/>
+      </w:pPr>
+      <w:r>
+        <w:t>13. Ciclo de vida y sostenibilidad de datos</w:t>
+      </w:r>
+    </w:p>
+    <w:p>
+      <w:r>
+        <w:t>La decisión de convertir archivos a catálogos normalizados permite que la solución sea reproducible y portable. El archivo original se procesa, se transforma a una representación homogénea, se persiste y se reutiliza como origen o destino. Esto evita depender de disco permanente en Render y mejora el control por usuario.</w:t>
+      </w:r>
+    </w:p>
+    <w:p>
+      <w:r>
+        <w:drawing>
+          <wp:inline xmlns:a="http://schemas.openxmlformats.org/drawingml/2006/main" xmlns:pic="http://schemas.openxmlformats.org/drawingml/2006/picture">
+            <wp:extent cx="6126480" cy="3743960"/>
+            <wp:docPr id="5" name="Picture 5"/>
+            <wp:cNvGraphicFramePr>
+              <a:graphicFrameLocks noChangeAspect="1"/>
+            </wp:cNvGraphicFramePr>
+            <a:graphic>
+              <a:graphicData uri="http://schemas.openxmlformats.org/drawingml/2006/picture">
+                <pic:pic>
+                  <pic:nvPicPr>
+                    <pic:cNvPr id="0" name="data_lifecycle.png"/>
+                    <pic:cNvPicPr/>
+                  </pic:nvPicPr>
+                  <pic:blipFill>
+                    <a:blip r:embed="rId13"/>
+                    <a:stretch>
+                      <a:fillRect/>
+                    </a:stretch>
+                  </pic:blipFill>
+                  <pic:spPr>
+                    <a:xfrm>
+                      <a:off x="0" y="0"/>
+                      <a:ext cx="6126480" cy="3743960"/>
+                    </a:xfrm>
+                    <a:prstGeom prst="rect"/>
+                  </pic:spPr>
+                </pic:pic>
+              </a:graphicData>
+            </a:graphic>
+          </wp:inline>
+        </w:drawing>
+      </w:r>
+    </w:p>
+    <w:p>
+      <w:pPr>
+        <w:jc w:val="center"/>
+      </w:pPr>
+      <w:r>
+        <w:rPr>
+          <w:i/>
+          <w:sz w:val="18"/>
+        </w:rPr>
+        <w:t>Figura 4. Ciclo de vida de datos importados.</w:t>
+      </w:r>
+    </w:p>
+    <w:p>
+      <w:pPr>
+        <w:pStyle w:val="Heading1"/>
+      </w:pPr>
+      <w:r>
+        <w:t>14. Matriz ampliada de riesgos</w:t>
+      </w:r>
+    </w:p>
+    <w:tbl>
+      <w:tblPr>
+        <w:tblStyle w:val="TableGrid"/>
+        <w:tblW w:type="auto" w:w="0"/>
+        <w:jc w:val="center"/>
+        <w:tblLook w:firstColumn="1" w:firstRow="1" w:lastColumn="0" w:lastRow="0" w:noHBand="0" w:noVBand="1" w:val="04A0"/>
+      </w:tblPr>
+      <w:tblGrid>
+        <w:gridCol w:w="2520"/>
+        <w:gridCol w:w="2520"/>
+        <w:gridCol w:w="2520"/>
+        <w:gridCol w:w="2520"/>
+      </w:tblGrid>
+      <w:tr>
+        <w:tc>
+          <w:tcPr>
+            <w:tcW w:type="dxa" w:w="2520"/>
+          </w:tcPr>
+          <w:p>
+            <w:r>
+              <w:rPr>
+                <w:b/>
+                <w:sz w:val="18"/>
+              </w:rPr>
+              <w:t>Riesgo</w:t>
+            </w:r>
+          </w:p>
+        </w:tc>
+        <w:tc>
+          <w:tcPr>
+            <w:tcW w:type="dxa" w:w="2520"/>
+          </w:tcPr>
+          <w:p>
+            <w:r>
+              <w:rPr>
+                <w:b/>
+                <w:sz w:val="18"/>
+              </w:rPr>
+              <w:t>Probabilidad</w:t>
+            </w:r>
+          </w:p>
+        </w:tc>
+        <w:tc>
+          <w:tcPr>
+            <w:tcW w:type="dxa" w:w="2520"/>
+          </w:tcPr>
+          <w:p>
+            <w:r>
+              <w:rPr>
+                <w:b/>
+                <w:sz w:val="18"/>
+              </w:rPr>
+              <w:t>Impacto</w:t>
+            </w:r>
+          </w:p>
+        </w:tc>
+        <w:tc>
+          <w:tcPr>
+            <w:tcW w:type="dxa" w:w="2520"/>
+          </w:tcPr>
+          <w:p>
+            <w:r>
+              <w:rPr>
+                <w:b/>
+                <w:sz w:val="18"/>
+              </w:rPr>
+              <w:t>Respuesta</w:t>
+            </w:r>
+          </w:p>
+        </w:tc>
+      </w:tr>
+      <w:tr>
+        <w:tc>
+          <w:tcPr>
+            <w:tcW w:type="dxa" w:w="2520"/>
+          </w:tcPr>
+          <w:p>
+            <w:r>
+              <w:rPr>
+                <w:sz w:val="18"/>
+              </w:rPr>
+              <w:t>Crecimiento de archivos sobre 500 MB</w:t>
+            </w:r>
+          </w:p>
+        </w:tc>
+        <w:tc>
+          <w:tcPr>
+            <w:tcW w:type="dxa" w:w="2520"/>
+          </w:tcPr>
+          <w:p>
+            <w:r>
+              <w:rPr>
+                <w:sz w:val="18"/>
+              </w:rPr>
+              <w:t>Media</w:t>
+            </w:r>
+          </w:p>
+        </w:tc>
+        <w:tc>
+          <w:tcPr>
+            <w:tcW w:type="dxa" w:w="2520"/>
+          </w:tcPr>
+          <w:p>
+            <w:r>
+              <w:rPr>
+                <w:sz w:val="18"/>
+              </w:rPr>
+              <w:t>Alto</w:t>
+            </w:r>
+          </w:p>
+        </w:tc>
+        <w:tc>
+          <w:tcPr>
+            <w:tcW w:type="dxa" w:w="2520"/>
+          </w:tcPr>
+          <w:p>
+            <w:r>
+              <w:rPr>
+                <w:sz w:val="18"/>
+              </w:rPr>
+              <w:t>Configurar MAX_DATABASE_FILE_SIZE_MB, validar antes de subir y dividir datasets.</w:t>
+            </w:r>
+          </w:p>
+        </w:tc>
+      </w:tr>
+      <w:tr>
+        <w:tc>
+          <w:tcPr>
+            <w:tcW w:type="dxa" w:w="2520"/>
+          </w:tcPr>
+          <w:p>
+            <w:r>
+              <w:rPr>
+                <w:sz w:val="18"/>
+              </w:rPr>
+              <w:t>Saturación de PostgreSQL por catálogos grandes</w:t>
+            </w:r>
+          </w:p>
+        </w:tc>
+        <w:tc>
+          <w:tcPr>
+            <w:tcW w:type="dxa" w:w="2520"/>
+          </w:tcPr>
+          <w:p>
+            <w:r>
+              <w:rPr>
+                <w:sz w:val="18"/>
+              </w:rPr>
+              <w:t>Media</w:t>
+            </w:r>
+          </w:p>
+        </w:tc>
+        <w:tc>
+          <w:tcPr>
+            <w:tcW w:type="dxa" w:w="2520"/>
+          </w:tcPr>
+          <w:p>
+            <w:r>
+              <w:rPr>
+                <w:sz w:val="18"/>
+              </w:rPr>
+              <w:t>Alto</w:t>
+            </w:r>
+          </w:p>
+        </w:tc>
+        <w:tc>
+          <w:tcPr>
+            <w:tcW w:type="dxa" w:w="2520"/>
+          </w:tcPr>
+          <w:p>
+            <w:r>
+              <w:rPr>
+                <w:sz w:val="18"/>
+              </w:rPr>
+              <w:t>Compresión, expiración de 24 horas y monitoreo de tamaño.</w:t>
+            </w:r>
+          </w:p>
+        </w:tc>
+      </w:tr>
+      <w:tr>
+        <w:tc>
+          <w:tcPr>
+            <w:tcW w:type="dxa" w:w="2520"/>
+          </w:tcPr>
+          <w:p>
+            <w:r>
+              <w:rPr>
+                <w:sz w:val="18"/>
+              </w:rPr>
+              <w:t>Errores por tipos heterogéneos</w:t>
+            </w:r>
+          </w:p>
+        </w:tc>
+        <w:tc>
+          <w:tcPr>
+            <w:tcW w:type="dxa" w:w="2520"/>
+          </w:tcPr>
+          <w:p>
+            <w:r>
+              <w:rPr>
+                <w:sz w:val="18"/>
+              </w:rPr>
+              <w:t>Alta</w:t>
+            </w:r>
+          </w:p>
+        </w:tc>
+        <w:tc>
+          <w:tcPr>
+            <w:tcW w:type="dxa" w:w="2520"/>
+          </w:tcPr>
+          <w:p>
+            <w:r>
+              <w:rPr>
+                <w:sz w:val="18"/>
+              </w:rPr>
+              <w:t>Media</w:t>
+            </w:r>
+          </w:p>
+        </w:tc>
+        <w:tc>
+          <w:tcPr>
+            <w:tcW w:type="dxa" w:w="2520"/>
+          </w:tcPr>
+          <w:p>
+            <w:r>
+              <w:rPr>
+                <w:sz w:val="18"/>
+              </w:rPr>
+              <w:t>Previsualización, transformaciones y reporte técnico.</w:t>
+            </w:r>
+          </w:p>
+        </w:tc>
+      </w:tr>
+      <w:tr>
+        <w:tc>
+          <w:tcPr>
+            <w:tcW w:type="dxa" w:w="2520"/>
+          </w:tcPr>
+          <w:p>
+            <w:r>
+              <w:rPr>
+                <w:sz w:val="18"/>
+              </w:rPr>
+              <w:t>Exposición de secretos</w:t>
+            </w:r>
+          </w:p>
+        </w:tc>
+        <w:tc>
+          <w:tcPr>
+            <w:tcW w:type="dxa" w:w="2520"/>
+          </w:tcPr>
+          <w:p>
+            <w:r>
+              <w:rPr>
+                <w:sz w:val="18"/>
+              </w:rPr>
+              <w:t>Baja</w:t>
+            </w:r>
+          </w:p>
+        </w:tc>
+        <w:tc>
+          <w:tcPr>
+            <w:tcW w:type="dxa" w:w="2520"/>
+          </w:tcPr>
+          <w:p>
+            <w:r>
+              <w:rPr>
+                <w:sz w:val="18"/>
+              </w:rPr>
+              <w:t>Alto</w:t>
+            </w:r>
+          </w:p>
+        </w:tc>
+        <w:tc>
+          <w:tcPr>
+            <w:tcW w:type="dxa" w:w="2520"/>
+          </w:tcPr>
+          <w:p>
+            <w:r>
+              <w:rPr>
+                <w:sz w:val="18"/>
+              </w:rPr>
+              <w:t>Variables de entorno, cifrado AES-256-GCM y no retorno al frontend.</w:t>
+            </w:r>
+          </w:p>
+        </w:tc>
+      </w:tr>
+      <w:tr>
+        <w:tc>
+          <w:tcPr>
+            <w:tcW w:type="dxa" w:w="2520"/>
+          </w:tcPr>
+          <w:p>
+            <w:r>
+              <w:rPr>
+                <w:sz w:val="18"/>
+              </w:rPr>
+              <w:t>Dependencia opcional de OpenAI</w:t>
+            </w:r>
+          </w:p>
+        </w:tc>
+        <w:tc>
+          <w:tcPr>
+            <w:tcW w:type="dxa" w:w="2520"/>
+          </w:tcPr>
+          <w:p>
+            <w:r>
+              <w:rPr>
+                <w:sz w:val="18"/>
+              </w:rPr>
+              <w:t>Media</w:t>
+            </w:r>
+          </w:p>
+        </w:tc>
+        <w:tc>
+          <w:tcPr>
+            <w:tcW w:type="dxa" w:w="2520"/>
+          </w:tcPr>
+          <w:p>
+            <w:r>
+              <w:rPr>
+                <w:sz w:val="18"/>
+              </w:rPr>
+              <w:t>Bajo</w:t>
+            </w:r>
+          </w:p>
+        </w:tc>
+        <w:tc>
+          <w:tcPr>
+            <w:tcW w:type="dxa" w:w="2520"/>
+          </w:tcPr>
+          <w:p>
+            <w:r>
+              <w:rPr>
+                <w:sz w:val="18"/>
+              </w:rPr>
+              <w:t>Fallback local del plugin del asistente.</w:t>
+            </w:r>
+          </w:p>
+        </w:tc>
+      </w:tr>
+    </w:tbl>
+    <w:p/>
+    <w:p>
+      <w:pPr>
+        <w:pStyle w:val="Heading1"/>
+      </w:pPr>
+      <w:r>
+        <w:t>Referencias y fuentes consultadas</w:t>
+      </w:r>
+    </w:p>
+    <w:p>
+      <w:pPr>
+        <w:pStyle w:val="ListBullet"/>
+      </w:pPr>
+      <w:r>
+        <w:t>React Docs. https://react.dev/learn. Uso en el documento: Componentes e interfaces declarativas..</w:t>
+      </w:r>
+    </w:p>
+    <w:p>
+      <w:pPr>
+        <w:pStyle w:val="ListBullet"/>
+      </w:pPr>
+      <w:r>
+        <w:t>Vite Guide. https://vite.dev/guide/. Uso en el documento: Servidor de desarrollo y build frontend..</w:t>
+      </w:r>
+    </w:p>
+    <w:p>
+      <w:pPr>
+        <w:pStyle w:val="ListBullet"/>
+      </w:pPr>
+      <w:r>
+        <w:t>Fastify Docs. https://fastify.dev/docs/latest/. Uso en el documento: API Node modular basada en plugins..</w:t>
+      </w:r>
+    </w:p>
+    <w:p>
+      <w:pPr>
+        <w:pStyle w:val="ListBullet"/>
+      </w:pPr>
+      <w:r>
+        <w:t>Render Blueprint YAML Reference. https://render.com/docs/blueprint-spec. Uso en el documento: Blueprint render.yaml, buildCommand, startCommand, healthCheckPath y autoDeployTrigger..</w:t>
+      </w:r>
+    </w:p>
+    <w:p>
+      <w:pPr>
+        <w:pStyle w:val="ListBullet"/>
+      </w:pPr>
+      <w:r>
+        <w:t>Supabase Database Docs. https://supabase.com/docs/guides/database/overview. Uso en el documento: PostgreSQL administrado para persistencia..</w:t>
+      </w:r>
+    </w:p>
+    <w:p>
+      <w:pPr>
+        <w:pStyle w:val="ListBullet"/>
+      </w:pPr>
+      <w:r>
+        <w:t>OWASP REST Security Cheat Sheet. https://cheatsheetseries.owasp.org/cheatsheets/REST_Security_Cheat_Sheet.html. Uso en el documento: HTTPS, access control, JWT, input validation, CORS y manejo de errores..</w:t>
+      </w:r>
+    </w:p>
+    <w:p>
+      <w:pPr>
+        <w:pStyle w:val="ListBullet"/>
+      </w:pPr>
+      <w:r>
+        <w:t>OWASP Top 10. https://owasp.org/www-project-top-ten/. Uso en el documento: Riesgos web de referencia para seguridad de aplicaciones..</w:t>
+      </w:r>
+    </w:p>
     <w:sectPr>
       <w:pgSz w:w="12240" w:h="15840"/>
       <w:pgMar w:top="1008" w:right="1080" w:bottom="1008" w:left="1080" w:header="720" w:footer="720" w:gutter="0"/>

</xml_diff>